<commit_message>
Apply APA 7 style rules to seminar paper; add interview kit
- Reference list per APA 7 (no publication place, et al. from first
  citation, Hebrew then English, hanging indent, italics), course
  presentation added as a source, block quotes indented 1.25 cm.
- Third person in method chapter, dashes and filler phrases removed.
- New interview_kit.docx: sampling plan for 8 interviews (4 per
  researcher), interview guide with probes, transcription and analysis
  instructions, and blank transcript templates for interviews 2-8.

Co-Authored-By: Claude Fable 5.1 <noreply@anthropic.com>
Claude-Session: https://claude.ai/code/session_01RW4AnnwQB2iHsmeVb9sY1W
</commit_message>
<xml_diff>
--- a/deliverables/seminar-at-risk-girls/seminar_paper.docx
+++ b/deliverables/seminar-at-risk-girls/seminar_paper.docx
@@ -440,7 +440,7 @@
           <w:szCs w:val="24"/>
           <w:rtl/>
         </w:rPr>
-        <w:t xml:space="preserve">הדיון מקשר את הממצאים למודל האקולוגי של ברונפנברנר, לתאוריית ההתקשרות ביחסי מורה–תלמיד, לאתיקת הדאגה של נודינגס ולתאוריית התיוג, ולמחקרים על זיהוי מוקדם ועל תפיסת תפקיד המורה בתחום הרווחה הרגשית. המסקנה המרכזית היא שיכולת הזיהוי תלויה ברציפות הקשר ובהיכרות מצטברת, ושתפיסת תפקיד רחבה של המחנכת אינה מלווה בתשתית ארגונית מקבילה. העבודה מסתיימת בהמלצות יישומיות, בהן שעה קבועה במערכת לשיחות אישיות, קבוצת עמיתים מונחית למחנכות, נוהל המגדיר מה קורה לאחר הדיווח, ומנגנון תיעוד מוגן.</w:t>
+        <w:t xml:space="preserve">הדיון מקשר את הממצאים למודל האקולוגי של ברונפנברנר, לתאוריית ההתקשרות ביחסי מורה-תלמיד, לאתיקת הדאגה של נודינגס ולתאוריית התיוג, ולמחקרים על זיהוי מוקדם ועל תפיסת תפקיד המורה בתחום הרווחה הרגשית. המסקנה המרכזית היא שיכולת הזיהוי תלויה ברציפות הקשר ובהיכרות מצטברת, ושתפיסת תפקיד רחבה של המחנכת אינה מלווה בתשתית ארגונית מקבילה. העבודה מסתיימת בהמלצות יישומיות, בהן שעה קבועה במערכת לשיחות אישיות, קבוצת עמיתים מונחית למחנכות, נוהל המגדיר מה קורה לאחר הדיווח, ומנגנון תיעוד מוגן.</w:t>
       </w:r>
     </w:p>
     <w:p>
@@ -506,7 +506,7 @@
           <w:shd w:fill="FFFF00" w:color="auto" w:val="clear"/>
           <w:rtl/>
         </w:rPr>
-        <w:t xml:space="preserve">[להתאמה אישית: כאן מומלץ להוסיף שתיים–שלוש שורות על החיבור האישי שלכן לנושא, למשל היכרות עם נערות מן הסביבה הקרובה שעזבו את בית הספר, או התנסות בעבודה חינוכית עם נערות. יש למחוק את ההערה הזו לאחר ההשלמה.]</w:t>
+        <w:t xml:space="preserve">[להתאמה אישית: כאן מומלץ להוסיף שתיים או שלוש שורות על החיבור האישי שלכן לנושא, למשל היכרות עם נערות מן הסביבה הקרובה שעזבו את בית הספר, או התנסות בעבודה חינוכית עם נערות. יש למחוק את ההערה הזו לאחר ההשלמה.]</w:t>
       </w:r>
     </w:p>
     <w:p>
@@ -596,7 +596,7 @@
       </w:r>
       <w:r>
         <w:rPr>
-          <w:rFonts w:ascii="David" w:cs="David" w:eastAsia="David" w:hAnsi="David"/>
+          <w:rFonts w:ascii="Times New Roman" w:cs="Times New Roman" w:eastAsia="Times New Roman" w:hAnsi="Times New Roman"/>
           <w:b w:val="false"/>
           <w:bCs w:val="false"/>
           <w:i w:val="false"/>
@@ -618,37 +618,37 @@
           <w:szCs w:val="24"/>
           <w:rtl/>
         </w:rPr>
-        <w:t xml:space="preserve">ì, </w:t>
-      </w:r>
-      <w:r>
-        <w:rPr>
-          <w:rFonts w:ascii="David" w:cs="David" w:eastAsia="David" w:hAnsi="David"/>
-          <w:b w:val="false"/>
-          <w:bCs w:val="false"/>
-          <w:i w:val="false"/>
-          <w:iCs w:val="false"/>
-          <w:sz w:val="24"/>
-          <w:szCs w:val="24"/>
-          <w:rtl w:val="false"/>
-        </w:rPr>
-        <w:t xml:space="preserve">Leavey, &amp; Best, 2008</w:t>
-      </w:r>
-      <w:r>
-        <w:rPr>
-          <w:rFonts w:ascii="David" w:cs="David" w:eastAsia="David" w:hAnsi="David"/>
-          <w:b w:val="false"/>
-          <w:bCs w:val="false"/>
-          <w:i w:val="false"/>
-          <w:iCs w:val="false"/>
-          <w:sz w:val="24"/>
-          <w:szCs w:val="24"/>
-          <w:rtl/>
-        </w:rPr>
-        <w:t xml:space="preserve">). ואולם, אותה ספרות מלמדת גם שמורים מזהים ביתר קלות מצוקה המתבטאת בהתנהגות מפריעה, ומתקשים יותר לזהות מצוקה מופנמת, המתבטאת בשקט, בהסתגרות ובנסיגה (</w:t>
-      </w:r>
-      <w:r>
-        <w:rPr>
-          <w:rFonts w:ascii="David" w:cs="David" w:eastAsia="David" w:hAnsi="David"/>
+        <w:t xml:space="preserve">ì </w:t>
+      </w:r>
+      <w:r>
+        <w:rPr>
+          <w:rFonts w:ascii="Times New Roman" w:cs="Times New Roman" w:eastAsia="Times New Roman" w:hAnsi="Times New Roman"/>
+          <w:b w:val="false"/>
+          <w:bCs w:val="false"/>
+          <w:i w:val="false"/>
+          <w:iCs w:val="false"/>
+          <w:sz w:val="24"/>
+          <w:szCs w:val="24"/>
+          <w:rtl w:val="false"/>
+        </w:rPr>
+        <w:t xml:space="preserve">et al., 2008</w:t>
+      </w:r>
+      <w:r>
+        <w:rPr>
+          <w:rFonts w:ascii="David" w:cs="David" w:eastAsia="David" w:hAnsi="David"/>
+          <w:b w:val="false"/>
+          <w:bCs w:val="false"/>
+          <w:i w:val="false"/>
+          <w:iCs w:val="false"/>
+          <w:sz w:val="24"/>
+          <w:szCs w:val="24"/>
+          <w:rtl/>
+        </w:rPr>
+        <w:t xml:space="preserve">). אבל אותה ספרות מלמדת גם שמורים מזהים ביתר קלות מצוקה המתבטאת בהתנהגות מפריעה, ומתקשים יותר לזהות מצוקה מופנמת, המתבטאת בשקט, בהסתגרות ובנסיגה (</w:t>
+      </w:r>
+      <w:r>
+        <w:rPr>
+          <w:rFonts w:ascii="Times New Roman" w:cs="Times New Roman" w:eastAsia="Times New Roman" w:hAnsi="Times New Roman"/>
           <w:b w:val="false"/>
           <w:bCs w:val="false"/>
           <w:i w:val="false"/>
@@ -695,7 +695,7 @@
       </w:r>
       <w:r>
         <w:rPr>
-          <w:rFonts w:ascii="David" w:cs="David" w:eastAsia="David" w:hAnsi="David"/>
+          <w:rFonts w:ascii="Times New Roman" w:cs="Times New Roman" w:eastAsia="Times New Roman" w:hAnsi="Times New Roman"/>
           <w:b w:val="false"/>
           <w:bCs w:val="false"/>
           <w:i w:val="false"/>
@@ -759,28 +759,28 @@
           <w:szCs w:val="24"/>
           <w:rtl/>
         </w:rPr>
-        <w:t xml:space="preserve">העבודה נערכה בגישה האיכותנית-פרשנית, המבקשת להבין את המשמעות שמעניקים המשתתפים למציאות שלהם ולא למדוד אותה מבחוץ (שקדי, 2003; צבר בן-יהושע, 2016). כלי המחקר הוא ריאיון חצי מובנה, שנוסח על פי העקרונות שנלמדו בקורס, וניתוח הנתונים נעשה בשיטת חלוקה ליחידות משמעות ואיגודן לתימות. הבחירה בגישה זו נובעת מאופי השאלה: תהליך הזיהוי ותפיסת התפקיד הם תופעות סובייקטיביות, המתרחשות בתודעתה של המורה ובמפגש הבין-אישי, ואי אפשר להגיע אליהן באמצעות שאלון סגור.</w:t>
-      </w:r>
-    </w:p>
-    <w:p>
-      <w:pPr>
-        <w:keepNext w:val="false"/>
-        <w:bidi/>
-        <w:spacing w:after="120" w:before="0" w:line="360"/>
-        <w:jc w:val="both"/>
-      </w:pPr>
-      <w:r>
-        <w:rPr>
-          <w:rFonts w:ascii="David" w:cs="David" w:eastAsia="David" w:hAnsi="David"/>
-          <w:b w:val="false"/>
-          <w:bCs w:val="false"/>
-          <w:i w:val="false"/>
-          <w:iCs w:val="false"/>
-          <w:sz w:val="24"/>
-          <w:szCs w:val="24"/>
-          <w:rtl/>
-        </w:rPr>
-        <w:t xml:space="preserve">מבנה העבודה הוא כדלקמן. הפרק הראשון מציג את ההגדרות של המושגים המרכזיים, נוער בסיכון ונשירה גלויה וסמויה, את מאפייני נערות בסיכון ואת גורמי הסיכון, ואת שכיחות התופעה בישראל תוך השוואה בין החברה הערבית לחברה היהודית ובין ישראל למדינות אחרות. הפרק השני מציג ארבע גישות תיאורטיות שבאמצעותן ניתן לבחון את השאלה: המודל האקולוגי, תאוריית ההתקשרות ביחסי מורה–תלמיד, אתיקת הדאגה ותאוריית התיוג. הפרק השלישי סוקר מחקרים עדכניים בארבעה תחומים: זיהוי מוקדם של תלמידים בסיכון, תפיסת תפקיד המורה בתחום הרווחה הרגשית, הקשר מורה–תלמיד כגורם מגן, ונערות בסיכון בחברה הערבית. הפרק הרביעי מפרט את שיטת המחקר, אוכלוסיית המחקר, כלי המחקר, הליך המחקר ואופן ניתוח הנתונים. הפרק החמישי מציג את הממצאים בחלוקה לתימות, והפרק השישי דן בממצאים לאור הספרות, מציג מסקנות והמלצות, מגבלות והצעות למחקר המשך, ורפלקציה על תהליך העבודה. בסוף העבודה מובאות רשימת המקורות והנספחים, ובהם שאלות הריאיון, טופס ההסכמה מדעת ותמלול הריאיון.</w:t>
+        <w:t xml:space="preserve">העבודה נערכה בגישה האיכותנית-פרשנית, המבקשת להבין את המשמעות שמעניקים המשתתפים למציאות שלהם ולא למדוד אותה מבחוץ (שקדי, 2003; צבר בן-יהושע, 2016). כלי המחקר הוא ריאיון חצי מובנה, שנוסח על פי העקרונות שנלמדו בקורס (סלע-שיוביץ, 2026), וניתוח הנתונים נעשה בשיטת חלוקה ליחידות משמעות ואיגודן לתימות. הבחירה בגישה זו נובעת מאופי השאלה: תהליך הזיהוי ותפיסת התפקיד הם תופעות סובייקטיביות, המתרחשות בתודעתה של המורה ובמפגש הבין-אישי, ואי אפשר להגיע אליהן באמצעות שאלון סגור.</w:t>
+      </w:r>
+    </w:p>
+    <w:p>
+      <w:pPr>
+        <w:keepNext w:val="false"/>
+        <w:bidi/>
+        <w:spacing w:after="120" w:before="0" w:line="360"/>
+        <w:jc w:val="both"/>
+      </w:pPr>
+      <w:r>
+        <w:rPr>
+          <w:rFonts w:ascii="David" w:cs="David" w:eastAsia="David" w:hAnsi="David"/>
+          <w:b w:val="false"/>
+          <w:bCs w:val="false"/>
+          <w:i w:val="false"/>
+          <w:iCs w:val="false"/>
+          <w:sz w:val="24"/>
+          <w:szCs w:val="24"/>
+          <w:rtl/>
+        </w:rPr>
+        <w:t xml:space="preserve">מבנה העבודה הוא כדלקמן. הפרק הראשון מציג את ההגדרות של המושגים המרכזיים, נוער בסיכון ונשירה גלויה וסמויה, את מאפייני נערות בסיכון ואת גורמי הסיכון, ואת שכיחות התופעה בישראל תוך השוואה בין החברה הערבית לחברה היהודית ובין ישראל למדינות אחרות. הפרק השני מציג ארבע גישות תיאורטיות שבאמצעותן ניתן לבחון את השאלה: המודל האקולוגי, תאוריית ההתקשרות ביחסי מורה-תלמיד, אתיקת הדאגה ותאוריית התיוג. הפרק השלישי סוקר מחקרים עדכניים בארבעה תחומים: זיהוי מוקדם של תלמידים בסיכון, תפיסת תפקיד המורה בתחום הרווחה הרגשית, הקשר מורה-תלמיד כגורם מגן, ונערות בסיכון בחברה הערבית. הפרק הרביעי מפרט את שיטת המחקר, אוכלוסיית המחקר, כלי המחקר, הליך המחקר ואופן ניתוח הנתונים. הפרק החמישי מציג את הממצאים בחלוקה לתימות, והפרק השישי דן בממצאים לאור הספרות, מציג מסקנות והמלצות, מגבלות והצעות למחקר המשך, ורפלקציה על תהליך העבודה. בסוף העבודה מובאות רשימת המקורות והנספחים, ובהם שאלות הריאיון, טופס ההסכמה מדעת ותמלול הריאיון.</w:t>
       </w:r>
     </w:p>
     <w:p>
@@ -973,28 +973,28 @@
           <w:szCs w:val="24"/>
           <w:rtl/>
         </w:rPr>
-        <w:t xml:space="preserve">נשירה מבית הספר היא אחד הביטויים הבולטים של סיכון בגיל ההתבגרות, אך גם מושג זה טעון הבחנה. כבר בשנות התשעים הבחין חוזר מנכ"ל של משרד החינוך בין "נשירה גלויה", שמשמעה אי-ביקור בבית הספר שבסופו של דבר עלול להביא לעזיבת המערכת, לבין "נשירה סמויה", המאפיינת תלמידים הנמצאים פיזית בכיתה אך אינם מתפקדים לימודית, מתנתקים מן המסגרת וחשים ניכור כלפיה (בן רבי, ברוך-קוברסקי, נבות וקונסטנטינוב, 2014). המחקר הראשון שניסה לאמוד את היקף הנשירה הסמויה בישראל נערך עבור הכנסת בשנת 2001, והגדיר "נושרים סמויים" כתלמידים הרשומים בבית הספר באופן פורמלי אך אינם מפיקים את התועלת המצופה מתהליך הלמידה (כהן-נבות, אלנבוגן-פרנקוביץ' וריינפלד, 2001).</w:t>
-      </w:r>
-    </w:p>
-    <w:p>
-      <w:pPr>
-        <w:keepNext w:val="false"/>
-        <w:bidi/>
-        <w:spacing w:after="120" w:before="0" w:line="360"/>
-        <w:jc w:val="both"/>
-      </w:pPr>
-      <w:r>
-        <w:rPr>
-          <w:rFonts w:ascii="David" w:cs="David" w:eastAsia="David" w:hAnsi="David"/>
-          <w:b w:val="false"/>
-          <w:bCs w:val="false"/>
-          <w:i w:val="false"/>
-          <w:iCs w:val="false"/>
-          <w:sz w:val="24"/>
-          <w:szCs w:val="24"/>
-          <w:rtl/>
-        </w:rPr>
-        <w:t xml:space="preserve">הגדרה עדכנית יותר, המשמשת כיום את משרד החינוך, מתארת נשירה סמויה כמצב שבו התלמיד רשום במוסד החינוך אך מתאפיין בהיעדרויות מרובות, בשוטטות בשטח בית הספר ומחוצה לו בשעות הלימודים, בנוכחות פיזית בכיתה ללא תפקוד לימודי, בקושי למלא אחר חוקי המוסד, בקשיי הסתגלות והתנהגות ובמעורבות נמוכה בלימודים ובפעילויות (ברוך-קוברסקי ואחרים, 2022). בן רבי ואחרים (2014) מציעים לבחון את הניתוק מבית הספר בשלושה ממדים: הממד ההתנהגותי (היעדרויות, איחורים, מעורבות נמוכה), הממד הרגשי (תחושת ניכור וחוסר שייכות) והממד התפיסתי (תפיסת הלמידה כלא תורמת ולא משמעותית). הבחנה זו חשובה לעבודה הנוכחית, משום שהיא מלמדת כי הנשירה אינה אירוע אלא תהליך: התלמידה מתנתקת רגשית ותפיסתית זמן רב לפני שהיא מפסיקה להגיע, ובשלב זה בדיוק יכולת הזיהוי של המורה היא קריטית.</w:t>
+        <w:t xml:space="preserve">נשירה מבית הספר היא אחד הביטויים הבולטים של סיכון בגיל ההתבגרות, אך גם מושג זה טעון הבחנה. כבר בשנות התשעים הבחין חוזר מנכ"ל של משרד החינוך בין "נשירה גלויה", שמשמעה אי-ביקור בבית הספר שבסופו של דבר עלול להביא לעזיבת המערכת, לבין "נשירה סמויה", המאפיינת תלמידים הנמצאים פיזית בכיתה אך אינם מתפקדים לימודית, מתנתקים מן המסגרת וחשים ניכור כלפיה (בן רבי ואחרים, 2014). המחקר הראשון שניסה לאמוד את היקף הנשירה הסמויה בישראל נערך עבור הכנסת בשנת 2001, והגדיר "נושרים סמויים" כתלמידים הרשומים בבית הספר באופן פורמלי אך אינם מפיקים את התועלת המצופה מתהליך הלמידה (כהן-נבות ואחרים, 2001).</w:t>
+      </w:r>
+    </w:p>
+    <w:p>
+      <w:pPr>
+        <w:keepNext w:val="false"/>
+        <w:bidi/>
+        <w:spacing w:after="120" w:before="0" w:line="360"/>
+        <w:jc w:val="both"/>
+      </w:pPr>
+      <w:r>
+        <w:rPr>
+          <w:rFonts w:ascii="David" w:cs="David" w:eastAsia="David" w:hAnsi="David"/>
+          <w:b w:val="false"/>
+          <w:bCs w:val="false"/>
+          <w:i w:val="false"/>
+          <w:iCs w:val="false"/>
+          <w:sz w:val="24"/>
+          <w:szCs w:val="24"/>
+          <w:rtl/>
+        </w:rPr>
+        <w:t xml:space="preserve">הגדרה עדכנית יותר, המשמשת כיום את משרד החינוך, מתארת נשירה סמויה כמצב שבו התלמיד רשום במוסד החינוך אך מתאפיין בהיעדרויות מרובות, בשוטטות בשטח בית הספר ומחוצה לו בשעות הלימודים, בנוכחות פיזית בכיתה ללא תפקוד לימודי, בקושי למלא אחר חוקי המוסד, בקשיי הסתגלות והתנהגות ובמעורבות נמוכה בלימודים ובפעילויות (ברוך-קוברסקי ואחרים, 2022). בן רבי ואחרים (2014) מציעים לבחון את הניתוק מבית הספר בשלושה ממדים: הממד ההתנהגותי (היעדרויות, איחורים, מעורבות נמוכה), הממד הרגשי (תחושת ניכור וחוסר שייכות) והממד התפיסתי (תפיסת הלמידה כלא תורמת ולא משמעותית). הבחנה זו חשובה לעבודה הנוכחית, משום שהיא מלמדת כי הנשירה אינה אירוע אלא תהליך: התלמידה מתנתקת רגשית ותפיסתית זמן רב לפני שהיא מפסיקה להגיע, ובשלב זה בדיוק נבחנת יכולת הזיהוי של המורה.</w:t>
       </w:r>
     </w:p>
     <w:p>
@@ -1058,11 +1058,11 @@
           <w:szCs w:val="24"/>
           <w:rtl/>
         </w:rPr>
-        <w:t xml:space="preserve">עם זאת, המאפיינים המשותפים מסתירים הבדל מגדרי חשוב באופן שבו הסיכון בא לידי ביטוי. הספרות המחקרית מבחינה בין ביטויים מוחצנים של מצוקה, כגון תוקפנות, הפרת משמעת ועבריינות, לבין ביטויים מופנמים, כגון חרדה, דיכאון, הסתגרות, פגיעה עצמית והפרעות אכילה. מחקרים על זיהוי בעיות נפשיות בבית הספר מצאו שמורים מודאגים יותר מבעיות התנהגות מוחצנות מאשר מבעיות רגשיות מופנמות, ושמגדר הילד מנבא את דיוק הזיהוי (</w:t>
-      </w:r>
-      <w:r>
-        <w:rPr>
-          <w:rFonts w:ascii="David" w:cs="David" w:eastAsia="David" w:hAnsi="David"/>
+        <w:t xml:space="preserve">אבל המאפיינים המשותפים מסתירים הבדל מגדרי חשוב באופן שבו הסיכון בא לידי ביטוי. הספרות המחקרית מבחינה בין ביטויים מוחצנים של מצוקה, כגון תוקפנות, הפרת משמעת ועבריינות, לבין ביטויים מופנמים, כגון חרדה, דיכאון, הסתגרות, פגיעה עצמית והפרעות אכילה. מחקרים על זיהוי בעיות נפשיות בבית הספר מצאו שמורים מודאגים יותר מבעיות התנהגות מוחצנות מאשר מבעיות רגשיות מופנמות, ושמגדר הילד מנבא את דיוק הזיהוי (</w:t>
+      </w:r>
+      <w:r>
+        <w:rPr>
+          <w:rFonts w:ascii="Times New Roman" w:cs="Times New Roman" w:eastAsia="Times New Roman" w:hAnsi="Times New Roman"/>
           <w:b w:val="false"/>
           <w:bCs w:val="false"/>
           <w:i w:val="false"/>
@@ -1109,7 +1109,7 @@
       </w:r>
       <w:r>
         <w:rPr>
-          <w:rFonts w:ascii="David" w:cs="David" w:eastAsia="David" w:hAnsi="David"/>
+          <w:rFonts w:ascii="Times New Roman" w:cs="Times New Roman" w:eastAsia="Times New Roman" w:hAnsi="Times New Roman"/>
           <w:b w:val="false"/>
           <w:bCs w:val="false"/>
           <w:i w:val="false"/>
@@ -1135,7 +1135,7 @@
       </w:r>
       <w:r>
         <w:rPr>
-          <w:rFonts w:ascii="David" w:cs="David" w:eastAsia="David" w:hAnsi="David"/>
+          <w:rFonts w:ascii="Times New Roman" w:cs="Times New Roman" w:eastAsia="Times New Roman" w:hAnsi="Times New Roman"/>
           <w:b w:val="false"/>
           <w:bCs w:val="false"/>
           <w:i w:val="false"/>
@@ -1182,7 +1182,7 @@
       </w:r>
       <w:r>
         <w:rPr>
-          <w:rFonts w:ascii="David" w:cs="David" w:eastAsia="David" w:hAnsi="David"/>
+          <w:rFonts w:ascii="Times New Roman" w:cs="Times New Roman" w:eastAsia="Times New Roman" w:hAnsi="Times New Roman"/>
           <w:b w:val="false"/>
           <w:bCs w:val="false"/>
           <w:i w:val="false"/>
@@ -1373,7 +1373,7 @@
           <w:szCs w:val="24"/>
           <w:rtl/>
         </w:rPr>
-        <w:t xml:space="preserve">חשוב להדגיש כי גורמי הסיכון אינם פועלים בנפרד אלא מצטברים ומזינים זה את זה: מחלה של אם עשויה להביא לעומס טיפולי על הבת, להיעדרויות, לירידה בהישגים ולניתוק חברתי, וכל אלה יחד מגדילים את הסיכון לנשירה. הצטברות זו היא שהופכת את הזיהוי המוקדם לחשוב כל כך.</w:t>
+        <w:t xml:space="preserve">גורמי הסיכון אינם פועלים בנפרד אלא מצטברים ומזינים זה את זה: מחלה של אם עשויה להביא לעומס טיפולי על הבת, להיעדרויות, לירידה בהישגים ולניתוק חברתי, וכל אלה יחד מגדילים את הסיכון לנשירה. הצטברות זו היא שהופכת את הזיהוי המוקדם לחשוב כל כך.</w:t>
       </w:r>
     </w:p>
     <w:p>
@@ -1458,7 +1458,7 @@
           <w:szCs w:val="24"/>
           <w:rtl/>
         </w:rPr>
-        <w:t xml:space="preserve">נתוני הנשירה הגלויה מצביעים על פערים דומים. מחקר ברוקדייל שעקב אחר שנתון התלמידים שהיו בכיתה ו' בשנת 2013 והיו אמורים לסיים שתים עשרה שנות לימוד בשנת 2019, מצא כי 7.9% מכלל תלמידי השנתון עזבו את מערכת החינוך לפני סיום הלימודים. בקרב תלמידים יהודים במחוז דרום עמד השיעור על 2.1%, בקרב תלמידי החינוך הערבי (ללא בדואים בנגב וללא ערביי מזרח ירושלים) על 5.3%, ובקרב תלמידי החינוך הבדואי בנגב על 19.5%, כלומר גבוה פי כמה מן השיעור הכללי (ברוך-קוברסקי ואחרים, 2022). בחינוך הבדואי שיעור העוזבים בקרב הבנים (21.5%) גבוה משיעור העוזבות בקרב הבנות (17.5%), אך עיתוי העזיבה שונה באופן מובהק: בקרב הבנות חלק גדול בהרבה מן העזיבה מתרחש כבר בחטיבת הביניים (24.5% מן העוזבות לעומת 8.8% מן העוזבים), בעוד הבנים עוזבים בעיקר בכיתות י"א–י"ב (ברוך-קוברסקי ואחרים, 2022). ממצא זה חשוב במיוחד לעבודה הנוכחית, משום שהוא ממקם את חלון ההזדמנויות לזיהוי נערות בסיכון דווקא בחטיבת הביניים, כלומר אצל המחנכות של כיתות ז'–ט'.</w:t>
+        <w:t xml:space="preserve">נתוני הנשירה הגלויה מצביעים על פערים דומים. מחקר ברוקדייל שעקב אחר שנתון התלמידים שהיו בכיתה ו' בשנת 2013 והיו אמורים לסיים שתים עשרה שנות לימוד בשנת 2019, מצא כי 7.9% מכלל תלמידי השנתון עזבו את מערכת החינוך לפני סיום הלימודים. בקרב תלמידים יהודים במחוז דרום עמד השיעור על 2.1%, בקרב תלמידי החינוך הערבי (ללא בדואים בנגב וללא ערביי מזרח ירושלים) על 5.3%, ובקרב תלמידי החינוך הבדואי בנגב על 19.5%, כלומר גבוה פי כמה מן השיעור הכללי (ברוך-קוברסקי ואחרים, 2022). בחינוך הבדואי שיעור העוזבים בקרב הבנים (21.5%) גבוה משיעור העוזבות בקרב הבנות (17.5%), אך עיתוי העזיבה שונה באופן מובהק: בקרב הבנות חלק גדול בהרבה מן העזיבה מתרחש כבר בחטיבת הביניים (24.5% מן העוזבות לעומת 8.8% מן העוזבים), בעוד הבנים עוזבים בעיקר בכיתות י"א-י"ב (ברוך-קוברסקי ואחרים, 2022). ממצא זה חשוב במיוחד לעבודה הנוכחית, משום שהוא ממקם את חלון ההזדמנויות לזיהוי נערות בסיכון דווקא בחטיבת הביניים, כלומר אצל המחנכות של כיתות ז'-ט'.</w:t>
       </w:r>
     </w:p>
     <w:p>
@@ -1483,7 +1483,7 @@
       </w:r>
       <w:r>
         <w:rPr>
-          <w:rFonts w:ascii="David" w:cs="David" w:eastAsia="David" w:hAnsi="David"/>
+          <w:rFonts w:ascii="Times New Roman" w:cs="Times New Roman" w:eastAsia="Times New Roman" w:hAnsi="Times New Roman"/>
           <w:b w:val="false"/>
           <w:bCs w:val="false"/>
           <w:i w:val="false"/>
@@ -1505,20 +1505,20 @@
           <w:szCs w:val="24"/>
           <w:rtl/>
         </w:rPr>
-        <w:t xml:space="preserve"> בהיקף הניתוק התפיסתי מבית הספר, אך בולטת בשיעור גבוה יותר של ניתוק התנהגותי, המתבטא בהיעדרויות ובאיחורים מרובים, ובשיעור נמוך יותר של ניתוק רגשי (בן רבי ואחרים, 2014). מחקרים מארצות הברית מלמדים כי ניתן לזהות בשלב מוקדם מאוד את מי שצפויים לנשור: בלפנץ, הרצוג ומק-אייבר (</w:t>
-      </w:r>
-      <w:r>
-        <w:rPr>
-          <w:rFonts w:ascii="David" w:cs="David" w:eastAsia="David" w:hAnsi="David"/>
-          <w:b w:val="false"/>
-          <w:bCs w:val="false"/>
-          <w:i w:val="false"/>
-          <w:iCs w:val="false"/>
-          <w:sz w:val="24"/>
-          <w:szCs w:val="24"/>
-          <w:rtl w:val="false"/>
-        </w:rPr>
-        <w:t xml:space="preserve">Balfanz, Herzog, &amp; Mac Iver, 2007</w:t>
+        <w:t xml:space="preserve"> בהיקף הניתוק התפיסתי מבית הספר, אך בולטת בשיעור גבוה יותר של ניתוק התנהגותי, המתבטא בהיעדרויות ובאיחורים מרובים, ובשיעור נמוך יותר של ניתוק רגשי (בן רבי ואחרים, 2014). מחקרים מארצות הברית מלמדים כי ניתן לזהות בשלב מוקדם מאוד את מי שצפויים לנשור: בלפנץ ואחרים (</w:t>
+      </w:r>
+      <w:r>
+        <w:rPr>
+          <w:rFonts w:ascii="Times New Roman" w:cs="Times New Roman" w:eastAsia="Times New Roman" w:hAnsi="Times New Roman"/>
+          <w:b w:val="false"/>
+          <w:bCs w:val="false"/>
+          <w:i w:val="false"/>
+          <w:iCs w:val="false"/>
+          <w:sz w:val="24"/>
+          <w:szCs w:val="24"/>
+          <w:rtl w:val="false"/>
+        </w:rPr>
+        <w:t xml:space="preserve">Balfanz et al., 2007</w:t>
       </w:r>
       <w:r>
         <w:rPr>
@@ -1618,7 +1618,7 @@
           <w:szCs w:val="24"/>
           <w:rtl/>
         </w:rPr>
-        <w:t xml:space="preserve">בפרק זה יוצגו ארבע גישות תיאורטיות המאפשרות לבחון את שאלת המחקר מזוויות משלימות. המודל האקולוגי של ברונפנברנר ממקם את הנערה ואת המורה בתוך מערכות מקיפות, ומאפשר להבין את מקומה של המורה כחוליה מקשרת בין הבית, בית הספר והקהילה. תאוריית ההתקשרות, כפי שהורחבה לתחום יחסי מורה–תלמיד, מסבירה מדוע איכות הקשר עם המורה היא תנאי לזיהוי ולסיוע. אתיקת הדאגה של נודינגס מציעה מסגרת להבנת תפיסת התפקיד של מורות הרואות בדאגה לתלמידה חלק מהותי מן ההוראה. תאוריית התיוג מסבירה את הזהירות שנוקטות מורות בשימוש במונח "בסיכון" ואת המחיר החברתי של הסימון. לכל תאוריה יוצגו הנחות היסוד והחוקרים המרכזיים, ולאחריהן פסקה המקשרת אותה לסוגיה הנחקרת.</w:t>
+        <w:t xml:space="preserve">בפרק זה יוצגו ארבע גישות תיאורטיות המאפשרות לבחון את שאלת המחקר מזוויות משלימות. המודל האקולוגי של ברונפנברנר ממקם את הנערה ואת המורה בתוך מערכות מקיפות, ומאפשר להבין את מקומה של המורה כחוליה מקשרת בין הבית, בית הספר והקהילה. תאוריית ההתקשרות, כפי שהורחבה לתחום יחסי מורה-תלמיד, מסבירה מדוע איכות הקשר עם המורה היא תנאי לזיהוי ולסיוע. אתיקת הדאגה של נודינגס מציעה מסגרת להבנת תפיסת התפקיד של מורות הרואות בדאגה לתלמידה חלק מהותי מן ההוראה. תאוריית התיוג מסבירה את הזהירות שנוקטות מורות בשימוש במונח "בסיכון" ואת המחיר החברתי של הסימון. לכל תאוריה יוצגו הנחות היסוד והחוקרים המרכזיים, ולאחריהן פסקה המקשרת אותה לסוגיה הנחקרת.</w:t>
       </w:r>
     </w:p>
     <w:p>
@@ -1665,7 +1665,7 @@
       </w:r>
       <w:r>
         <w:rPr>
-          <w:rFonts w:ascii="David" w:cs="David" w:eastAsia="David" w:hAnsi="David"/>
+          <w:rFonts w:ascii="Times New Roman" w:cs="Times New Roman" w:eastAsia="Times New Roman" w:hAnsi="Times New Roman"/>
           <w:b w:val="false"/>
           <w:bCs w:val="false"/>
           <w:i w:val="false"/>
@@ -1708,7 +1708,7 @@
           <w:szCs w:val="24"/>
           <w:rtl/>
         </w:rPr>
-        <w:t xml:space="preserve">המודל האקולוגי רלוונטי לעבודתנו בשני מובנים. ראשית, הוא מאפשר להבין את גורמי הסיכון של הנערה כתוצר של אינטראקציה בין מערכות: מחלה במשפחה (מיקרו), היעדר תיאום בין הבית לבית הספר (מזו), מענה איטי של שירותי הרווחה (אקסו) ונורמות תרבותיות בדבר נישואים והשכלה (מקרו). שנית, וחשוב מכך, המודל ממקם את המורה בצומת שבין המערכות. המחנכת פועלת במיקרו-מערכת של הכיתה, אך היא גם זו שיוצרת את המזו-מערכת, כלומר את הקשר בין בית הספר לבין הבית, ובחברה קטנה וקהילתית היא עצמה חלק מן המקרו-מערכת של הנערה. עמדה זו מסבירה מדוע יכולת הזיהוי של המורה תלויה לא רק בהכשרתה אלא גם באיכות הקשרים בין המערכות שהיא נמצאת בתוכן, ומדוע היעדר תיאום בין המערכות מותיר אותה לבדה.</w:t>
+        <w:t xml:space="preserve">המודל האקולוגי רלוונטי לעבודה הנוכחית בשני מובנים. ראשית, הוא מאפשר להבין את גורמי הסיכון של הנערה כתוצר של אינטראקציה בין מערכות: מחלה במשפחה (מיקרו), היעדר תיאום בין הבית לבית הספר (מזו), מענה איטי של שירותי הרווחה (אקסו) ונורמות תרבותיות בדבר נישואים והשכלה (מקרו). שנית, ומעבר לכך, המודל ממקם את המורה בצומת שבין המערכות. המחנכת פועלת במיקרו-מערכת של הכיתה, אך היא גם זו שיוצרת את המזו-מערכת, כלומר את הקשר בין בית הספר לבין הבית, ובחברה קטנה וקהילתית היא עצמה חלק מן המקרו-מערכת של הנערה. עמדה זו מסבירה מדוע יכולת הזיהוי של המורה תלויה בהכשרתה ובאותה מידה באיכות הקשרים בין המערכות שהיא נמצאת בתוכן, ומדוע היעדר תיאום בין המערכות מותיר אותה לבדה.</w:t>
       </w:r>
     </w:p>
     <w:p>
@@ -1730,7 +1730,7 @@
           <w:szCs w:val="28"/>
           <w:rtl/>
         </w:rPr>
-        <w:t xml:space="preserve">2.2 תאוריית ההתקשרות ויחסי מורה–תלמיד</w:t>
+        <w:t xml:space="preserve">2.2 תאוריית ההתקשרות ויחסי מורה-תלמיד</w:t>
       </w:r>
     </w:p>
     <w:p>
@@ -1755,7 +1755,7 @@
       </w:r>
       <w:r>
         <w:rPr>
-          <w:rFonts w:ascii="David" w:cs="David" w:eastAsia="David" w:hAnsi="David"/>
+          <w:rFonts w:ascii="Times New Roman" w:cs="Times New Roman" w:eastAsia="Times New Roman" w:hAnsi="Times New Roman"/>
           <w:b w:val="false"/>
           <w:bCs w:val="false"/>
           <w:i w:val="false"/>
@@ -1781,7 +1781,7 @@
       </w:r>
       <w:r>
         <w:rPr>
-          <w:rFonts w:ascii="David" w:cs="David" w:eastAsia="David" w:hAnsi="David"/>
+          <w:rFonts w:ascii="Times New Roman" w:cs="Times New Roman" w:eastAsia="Times New Roman" w:hAnsi="Times New Roman"/>
           <w:b w:val="false"/>
           <w:bCs w:val="false"/>
           <w:i w:val="false"/>
@@ -1803,11 +1803,11 @@
           <w:szCs w:val="24"/>
           <w:rtl/>
         </w:rPr>
-        <w:t xml:space="preserve">) טען כי יחסי מורה–תלמיד הם מערכת יחסים בעלת מאפיינים של התקשרות, וכי מורה רגישה ועקבית יכולה לשמש עבור ילדים בסיכון בסיס בטוח משלים, ובמקרים מסוימים אף מתקן, לקשר לא בטוח בבית. המרה ופיאנטה (</w:t>
-      </w:r>
-      <w:r>
-        <w:rPr>
-          <w:rFonts w:ascii="David" w:cs="David" w:eastAsia="David" w:hAnsi="David"/>
+        <w:t xml:space="preserve">) טען כי יחסי מורה-תלמיד הם מערכת יחסים בעלת מאפיינים של התקשרות, וכי מורה רגישה ועקבית יכולה לשמש עבור ילדים בסיכון בסיס בטוח משלים, ובמקרים מסוימים אף מתקן, לקשר לא בטוח בבית. המרה ופיאנטה (</w:t>
+      </w:r>
+      <w:r>
+        <w:rPr>
+          <w:rFonts w:ascii="Times New Roman" w:cs="Times New Roman" w:eastAsia="Times New Roman" w:hAnsi="Times New Roman"/>
           <w:b w:val="false"/>
           <w:bCs w:val="false"/>
           <w:i w:val="false"/>
@@ -1850,7 +1850,7 @@
           <w:szCs w:val="24"/>
           <w:rtl/>
         </w:rPr>
-        <w:t xml:space="preserve">תאוריה זו מסבירה שני היבטים של שאלת המחקר. ראשית, היא מסבירה מדוע הקשר עם המחנכת יכול לשמש גורם מגן לנערה בסיכון: המחנכת עשויה להיות המבוגרת היחידה המספקת לה מקום שבו "לא בודקים אותה", ומעניקה לה תחושה שמישהו ישים לב אם לא תגיע. שנית, היא מציעה הסבר לכך שהזיהוי תלוי בקשר: נערה חושפת מידע על מצוקתה רק בפני מי שהיא חווה כבסיס בטוח, ולכן מורה השומרת על מרחק מקצועי עשויה שלא לראות דבר, לא משום שאין מה לראות אלא משום שהנערה אינה מראה לה. מכאן שהקשר אינו תוצאה של הזיהוי אלא תנאי מקדים לו. חשוב להדגיש כי תאוריית ההתקשרות מסבירה גם את הצד של המורה: כדי לשמש בסיס בטוח עבור תלמידה, המורה זקוקה בעצמה לבסיס בטוח מקצועי, כלומר לדמויות ולמסגרות שאליהן היא יכולה לפנות בעת מצוקה. מורה הפועלת ללא גיבוי כזה עלולה להתקשה לשמור על זמינות רגשית עקבית, ולנוע בין מעורבות יתר לבין הסתגרות, בדומה לדפוסי התקשרות לא בטוחה.</w:t>
+        <w:t xml:space="preserve">תאוריה זו מסבירה שני היבטים של שאלת המחקר. ראשית, היא מסבירה מדוע הקשר עם המחנכת יכול לשמש גורם מגן לנערה בסיכון: המחנכת עשויה להיות המבוגרת היחידה המספקת לה מקום שבו "לא בודקים אותה", ומעניקה לה תחושה שמישהו ישים לב אם לא תגיע. שנית, היא מציעה הסבר לכך שהזיהוי תלוי בקשר: נערה חושפת מידע על מצוקתה רק בפני מי שהיא חווה כבסיס בטוח, ולכן מורה השומרת על מרחק מקצועי עשויה שלא לראות דבר, לא משום שאין מה לראות אלא משום שהנערה אינה מראה לה. מכאן שהקשר אינו תוצאה של הזיהוי אלא תנאי מקדים לו. תאוריית ההתקשרות מסבירה גם את הצד של המורה: כדי לשמש בסיס בטוח עבור תלמידה, המורה זקוקה בעצמה לבסיס בטוח מקצועי, כלומר לדמויות ולמסגרות שאליהן היא יכולה לפנות בעת מצוקה. מורה הפועלת ללא גיבוי כזה עלולה להתקשה לשמור על זמינות רגשית עקבית, ולנוע בין מעורבות יתר לבין הסתגרות, בדומה לדפוסי התקשרות לא בטוחה.</w:t>
       </w:r>
     </w:p>
     <w:p>
@@ -1897,7 +1897,7 @@
       </w:r>
       <w:r>
         <w:rPr>
-          <w:rFonts w:ascii="David" w:cs="David" w:eastAsia="David" w:hAnsi="David"/>
+          <w:rFonts w:ascii="Times New Roman" w:cs="Times New Roman" w:eastAsia="Times New Roman" w:hAnsi="Times New Roman"/>
           <w:b w:val="false"/>
           <w:bCs w:val="false"/>
           <w:i w:val="false"/>
@@ -1923,7 +1923,7 @@
       </w:r>
       <w:r>
         <w:rPr>
-          <w:rFonts w:ascii="David" w:cs="David" w:eastAsia="David" w:hAnsi="David"/>
+          <w:rFonts w:ascii="Times New Roman" w:cs="Times New Roman" w:eastAsia="Times New Roman" w:hAnsi="Times New Roman"/>
           <w:b w:val="false"/>
           <w:bCs w:val="false"/>
           <w:i w:val="false"/>
@@ -1949,7 +1949,7 @@
       </w:r>
       <w:r>
         <w:rPr>
-          <w:rFonts w:ascii="David" w:cs="David" w:eastAsia="David" w:hAnsi="David"/>
+          <w:rFonts w:ascii="Times New Roman" w:cs="Times New Roman" w:eastAsia="Times New Roman" w:hAnsi="Times New Roman"/>
           <w:b w:val="false"/>
           <w:bCs w:val="false"/>
           <w:i w:val="false"/>
@@ -1992,7 +1992,7 @@
           <w:szCs w:val="24"/>
           <w:rtl/>
         </w:rPr>
-        <w:t xml:space="preserve">אתיקת הדאגה מספקת שפה לתיאור תפיסת התפקיד של מורות הרואות בליווי הרגשי של תלמידותיהן חלק מהותי מן ההוראה ולא תוספת לה. היא מסבירה גם מדוע מורות כאלה מתקשות להגדיר את גבולות התפקיד: הדאגה, על פי נודינגס, אינה נגזרת מהגדרת תפקיד אלא ממפגש עם צורך של אחר, ולכן היא אינה נעצרת בסוף יום הלימודים. יתרה מזאת, הדגש של נודינגס על רציפות מספק בסיס תיאורטי לטענה שיכולת הזיהוי תלויה בהיכרות מצטברת לאורך זמן, ושפיצול כיתות והחלפת מחנכות פוגעים בה. בה בעת, גישה זו מציבה שאלה ביקורתית: מה קורה כאשר האחריות לדאגה מוטלת על מורות יחידות, בלי שהמערכת עצמה בנויה על עקרון הדאגה?</w:t>
+        <w:t xml:space="preserve">אתיקת הדאגה מספקת שפה לתיאור תפיסת התפקיד של מורות הרואות בליווי הרגשי של תלמידותיהן חלק מהותי מן ההוראה ולא תוספת לה. היא מסבירה גם מדוע מורות כאלה מתקשות להגדיר את גבולות התפקיד: הדאגה, על פי נודינגס, אינה נגזרת מהגדרת תפקיד אלא ממפגש עם צורך של אחר, ולכן היא אינה נעצרת בסוף יום הלימודים. הדגש של נודינגס על רציפות מספק בסיס תיאורטי לטענה שיכולת הזיהוי תלויה בהיכרות מצטברת לאורך זמן, ושפיצול כיתות והחלפת מחנכות פוגעים בה. באותו זמן, גישה זו מציבה שאלה ביקורתית: מה קורה כאשר האחריות לדאגה מוטלת על מורות יחידות, בלי שהמערכת עצמה בנויה על עקרון הדאגה?</w:t>
       </w:r>
     </w:p>
     <w:p>
@@ -2039,7 +2039,7 @@
       </w:r>
       <w:r>
         <w:rPr>
-          <w:rFonts w:ascii="David" w:cs="David" w:eastAsia="David" w:hAnsi="David"/>
+          <w:rFonts w:ascii="Times New Roman" w:cs="Times New Roman" w:eastAsia="Times New Roman" w:hAnsi="Times New Roman"/>
           <w:b w:val="false"/>
           <w:bCs w:val="false"/>
           <w:i w:val="false"/>
@@ -2061,28 +2061,28 @@
           <w:szCs w:val="24"/>
           <w:rtl/>
         </w:rPr>
-        <w:t xml:space="preserve">), שטען כי סטייה אינה תכונה של המעשה אלא תוצאה של תהליך חברתי שבו קבוצות יוצרות כללים, מחילות אותם על אנשים מסוימים ומסמנות אותם כ"אחרים". על פי בקר, התווית עצמה משפיעה על האדם המסומן: היא משנה את יחסה של הסביבה אליו, מצמצמת את ההזדמנויות הפתוחות בפניו ועשויה להוביל אותו לאמץ את הזהות שהודבקה לו. בהקשר החינוכי משמעות הדבר היא שסימון תלמיד כ"בעייתי" או כ"בסיכון" עשוי להיות לא רק תיאור של מצב אלא גם גורם המעצב אותו.</w:t>
-      </w:r>
-    </w:p>
-    <w:p>
-      <w:pPr>
-        <w:keepNext w:val="false"/>
-        <w:bidi/>
-        <w:spacing w:after="120" w:before="0" w:line="360"/>
-        <w:jc w:val="both"/>
-      </w:pPr>
-      <w:r>
-        <w:rPr>
-          <w:rFonts w:ascii="David" w:cs="David" w:eastAsia="David" w:hAnsi="David"/>
-          <w:b w:val="false"/>
-          <w:bCs w:val="false"/>
-          <w:i w:val="false"/>
-          <w:iCs w:val="false"/>
-          <w:sz w:val="24"/>
-          <w:szCs w:val="24"/>
-          <w:rtl/>
-        </w:rPr>
-        <w:t xml:space="preserve">תאוריה זו רלוונטית לעבודתנו בשני היבטים. ראשית, היא מסבירה את הזהירות שנוקטות מורות בשימוש במונח "בסיכון" מול המשפחה: בחברה קהילתית קטנה, תווית כזאת אינה נשארת בבית הספר אלא מלווה את הנערה ואת משפחתה, ולכן המורה מנסחת את דבריה בשפה של הישגים ושל עתיד ולא בשפה של סיכון. שנית, היא מציעה הסבר לכך שדווקא הנערות השקטות נותרות מחוץ למעגל התיוג הפורמלי, ולכן גם מחוץ למעגל הטיפול: מערכת שמסמנת בעיקר את מי שמפריע, מזהה בעיקר את מי שמפריע. ההבחנה בין זיהוי לתיוג, בין לראות נערה לבין לסמן אותה, היא אחת הדילמות המרכזיות שבהן עוסקת עבודה זו.</w:t>
+        <w:t xml:space="preserve">), שטען כי סטייה אינה תכונה של המעשה אלא תוצאה של תהליך חברתי שבו קבוצות יוצרות כללים, מחילות אותם על אנשים מסוימים ומסמנות אותם כ"אחרים". על פי בקר, התווית עצמה משפיעה על האדם המסומן: היא משנה את יחסה של הסביבה אליו, מצמצמת את ההזדמנויות הפתוחות בפניו ועשויה להוביל אותו לאמץ את הזהות שהודבקה לו. בהקשר החינוכי משמעות הדבר היא שסימון תלמיד כ"בעייתי" או כ"בסיכון" עשוי להיות תיאור של מצב, אך גם גורם המעצב אותו.</w:t>
+      </w:r>
+    </w:p>
+    <w:p>
+      <w:pPr>
+        <w:keepNext w:val="false"/>
+        <w:bidi/>
+        <w:spacing w:after="120" w:before="0" w:line="360"/>
+        <w:jc w:val="both"/>
+      </w:pPr>
+      <w:r>
+        <w:rPr>
+          <w:rFonts w:ascii="David" w:cs="David" w:eastAsia="David" w:hAnsi="David"/>
+          <w:b w:val="false"/>
+          <w:bCs w:val="false"/>
+          <w:i w:val="false"/>
+          <w:iCs w:val="false"/>
+          <w:sz w:val="24"/>
+          <w:szCs w:val="24"/>
+          <w:rtl/>
+        </w:rPr>
+        <w:t xml:space="preserve">תאוריה זו רלוונטית לעבודה הנוכחית בשני היבטים. ראשית, היא מסבירה את הזהירות שנוקטות מורות בשימוש במונח "בסיכון" מול המשפחה: בחברה קהילתית קטנה, תווית כזאת אינה נשארת בבית הספר אלא מלווה את הנערה ואת משפחתה, ולכן המורה מנסחת את דבריה בשפה של הישגים ושל עתיד ולא בשפה של סיכון. שנית, היא מציעה הסבר לכך שדווקא הנערות השקטות נותרות מחוץ למעגל התיוג הפורמלי, ולכן גם מחוץ למעגל הטיפול: מערכת שמסמנת בעיקר את מי שמפריע, מזהה בעיקר את מי שמפריע. ההבחנה בין זיהוי לתיוג, בין לראות נערה לבין לסמן אותה, היא אחת הדילמות המרכזיות שבהן עוסקת עבודה זו.</w:t>
       </w:r>
     </w:p>
     <w:p>
@@ -2169,7 +2169,7 @@
           <w:szCs w:val="24"/>
           <w:rtl/>
         </w:rPr>
-        <w:t xml:space="preserve">מטרת פרק זה היא להציג את הידע המחקרי העדכני הרלוונטי לשאלת המחקר. הפרק מחולק לארבעה תת-פרקים, שכל אחד מהם בוחן היבט אחר של הסוגיה: מחקרים על זיהוי מוקדם של תלמידים בסיכון; מחקרים על תפיסת התפקיד של מורים בתחום הרווחה הרגשית של תלמידים; מחקרים על הקשר מורה–תלמיד כגורם מגן; ומחקרים על נערות בסיכון ונשירה בחברה הערבית והבדואית בישראל. כל מחקר יוצג בתמצית: מטרותיו, אוכלוסיית המחקר, שיטת המחקר, הממצאים והמסקנות העיקריות.</w:t>
+        <w:t xml:space="preserve">מטרת פרק זה היא להציג את הידע המחקרי העדכני הרלוונטי לשאלת המחקר. הפרק מחולק לארבעה תת-פרקים, שכל אחד מהם בוחן היבט אחר של הסוגיה: מחקרים על זיהוי מוקדם של תלמידים בסיכון; מחקרים על תפיסת התפקיד של מורים בתחום הרווחה הרגשית של תלמידים; מחקרים על הקשר מורה-תלמיד כגורם מגן; ומחקרים על נערות בסיכון ונשירה בחברה הערבית והבדואית בישראל. כל מחקר יוצג בתמצית: מטרותיו, אוכלוסיית המחקר, שיטת המחקר, הממצאים והמסקנות העיקריות.</w:t>
       </w:r>
     </w:p>
     <w:p>
@@ -2217,7 +2217,7 @@
       </w:r>
       <w:r>
         <w:rPr>
-          <w:rFonts w:ascii="David" w:cs="David" w:eastAsia="David" w:hAnsi="David"/>
+          <w:rFonts w:ascii="Times New Roman" w:cs="Times New Roman" w:eastAsia="Times New Roman" w:hAnsi="Times New Roman"/>
           <w:b/>
           <w:bCs/>
           <w:i w:val="false"/>
@@ -2226,7 +2226,7 @@
           <w:szCs w:val="26"/>
           <w:rtl w:val="false"/>
         </w:rPr>
-        <w:t xml:space="preserve">Balfanz, Herzog, &amp; Mac Iver, 2007</w:t>
+        <w:t xml:space="preserve">Balfanz et al., 2007</w:t>
       </w:r>
       <w:r>
         <w:rPr>
@@ -2286,7 +2286,7 @@
       </w:r>
       <w:r>
         <w:rPr>
-          <w:rFonts w:ascii="David" w:cs="David" w:eastAsia="David" w:hAnsi="David"/>
+          <w:rFonts w:ascii="Times New Roman" w:cs="Times New Roman" w:eastAsia="Times New Roman" w:hAnsi="Times New Roman"/>
           <w:b/>
           <w:bCs/>
           <w:i w:val="false"/>
@@ -2329,7 +2329,7 @@
           <w:szCs w:val="24"/>
           <w:rtl/>
         </w:rPr>
-        <w:t xml:space="preserve">מחקר זה ביקש לבחון את יכולתם של מורים לזהות בעיות נפשיות בקרב תלמידים, ובמיוחד את ההבדל בין זיהוי בעיות מוחצנות לבין זיהוי בעיות מופנמות. במחקר השתתפו 153 מורים בבתי ספר יסודיים בארצות הברית, שקראו תיאורי מקרה של ילדים עם בעיות התנהגות מוחצנות או מופנמות ברמת חומרה גבוהה או בינונית, ודירגו את חומרת הבעיה, את מידת דאגתם לילד ואת הצורך בהפניה לשירותי טיפול בבית הספר או בקהילה. הממצאים הראו כי המורים זיהו במידה גבוהה של דיוק ילדים עם בעיות חמורות, מוחצנות ומופנמות כאחד, אך היו פחות מדויקים ופחות נוטים לחשוב שילדים עם תסמינים בינוניים או תת-קליניים זקוקים לשירותים. המסקנה היא שהקושי העיקרי אינו בזיהוי המקרים הקיצוניים אלא בזיהוי המקרים "שבאמצע", שבהם הסימנים עדינים והמצוקה עדיין לא הגיעה לרמה קלינית. מחקר זה חשוב לעבודתנו משום שהוא מלמד כי הנערות הזקוקות ביותר לזיהוי מוקדם הן דווקא אלה שהתסמינים שלהן עדיין מעורפלים, ושזיהוין דורש רגישות שמעבר להכשרה בסיסית.</w:t>
+        <w:t xml:space="preserve">מחקר זה ביקש לבחון את יכולתם של מורים לזהות בעיות נפשיות בקרב תלמידים, ובמיוחד את ההבדל בין זיהוי בעיות מוחצנות לבין זיהוי בעיות מופנמות. במחקר השתתפו 153 מורים בבתי ספר יסודיים בארצות הברית, שקראו תיאורי מקרה של ילדים עם בעיות התנהגות מוחצנות או מופנמות ברמת חומרה גבוהה או בינונית, ודירגו את חומרת הבעיה, את מידת דאגתם לילד ואת הצורך בהפניה לשירותי טיפול בבית הספר או בקהילה. הממצאים הראו כי המורים זיהו במידה גבוהה של דיוק ילדים עם בעיות חמורות, מוחצנות ומופנמות כאחד, אך היו פחות מדויקים ופחות נוטים לחשוב שילדים עם תסמינים בינוניים או תת-קליניים זקוקים לשירותים. המסקנה היא שהקושי העיקרי אינו בזיהוי המקרים הקיצוניים אלא בזיהוי המקרים "שבאמצע", שבהם הסימנים עדינים והמצוקה עדיין לא הגיעה לרמה קלינית. מחקר זה תורם לעבודה הנוכחית משום שהוא מלמד כי הנערות הזקוקות ביותר לזיהוי מוקדם הן דווקא אלה שהתסמינים שלהן עדיין מעורפלים, ושזיהוין דורש רגישות שמעבר להכשרה בסיסית.</w:t>
       </w:r>
     </w:p>
     <w:p>
@@ -2355,7 +2355,7 @@
       </w:r>
       <w:r>
         <w:rPr>
-          <w:rFonts w:ascii="David" w:cs="David" w:eastAsia="David" w:hAnsi="David"/>
+          <w:rFonts w:ascii="Times New Roman" w:cs="Times New Roman" w:eastAsia="Times New Roman" w:hAnsi="Times New Roman"/>
           <w:b/>
           <w:bCs/>
           <w:i w:val="false"/>
@@ -2398,7 +2398,7 @@
           <w:szCs w:val="24"/>
           <w:rtl/>
         </w:rPr>
-        <w:t xml:space="preserve">מטרת המחקר הייתה לבחון אם מורים מזהים בעיות נפשיות של ילדים, וכיצד מאפייני הבעיה ומאפייני הילד משפיעים על הזיהוי. במחקר השתתפו 113 מורים בבתי ספר יסודיים בבריטניה, שמילאו שאלון המבוסס על תיאורי מקרה של ילדים עם תסמינים של הפרעה רגשית שכיחה ושל הפרעה התנהגותית שכיחה, ונשאלו על זיהוי הבעיה, על חומרתה ועל פנייה לעזרה. הממצאים הראו כי המורים היו מסוגלים לזהות את קיומה של בעיה ולדרג את חומרתה, אך היו מודאגים באופן מובהק יותר מן הילד עם ההפרעה ההתנהגותית מאשר מן הילד עם ההפרעה הרגשית. כמו כן נמצא כי מגדר הילד ניבא באופן עצמאי את דיוק הזיהוי. מסקנת החוקרות היא שמורים נוטים להעריך את חומרתן של בעיות רגשיות מופנמות פחות מזו של בעיות התנהגות, ושיש צורך בהכשרה ממוקדת לזיהוי מצוקה מופנמת. ממצא זה מסביר מדוע נערות, שמצוקתן מופנמת לרוב, עלולות להישאר מחוץ למעגל הזיהוי.</w:t>
+        <w:t xml:space="preserve">מטרת המחקר הייתה לבחון אם מורים מזהים בעיות נפשיות של ילדים, וכיצד מאפייני הבעיה ומאפייני הילד משפיעים על הזיהוי. במחקר השתתפו 113 מורים בבתי ספר יסודיים בבריטניה, שמילאו שאלון המבוסס על תיאורי מקרה של ילדים עם תסמינים של הפרעה רגשית שכיחה ושל הפרעה התנהגותית שכיחה, ונשאלו על זיהוי הבעיה, על חומרתה ועל פנייה לעזרה. הממצאים הראו כי המורים היו מסוגלים לזהות את קיומה של בעיה ולדרג את חומרתה, אך היו מודאגים באופן מובהק יותר מן הילד עם ההפרעה ההתנהגותית מאשר מן הילד עם ההפרעה הרגשית. נמצא גם כי מגדר הילד ניבא באופן עצמאי את דיוק הזיהוי. מסקנת החוקרות היא שמורים נוטים להעריך את חומרתן של בעיות רגשיות מופנמות פחות מזו של בעיות התנהגות, ושיש צורך בהכשרה ממוקדת לזיהוי מצוקה מופנמת. ממצא זה מסביר מדוע נערות, שמצוקתן מופנמת לרוב, עלולות להישאר מחוץ למעגל הזיהוי.</w:t>
       </w:r>
     </w:p>
     <w:p>
@@ -2420,7 +2420,7 @@
           <w:szCs w:val="26"/>
           <w:rtl/>
         </w:rPr>
-        <w:t xml:space="preserve">3.1.4 הנשירה הסמויה בישראל (בן רבי, ברוך-קוברסקי, נבות וקונסטנטינוב, 2014)</w:t>
+        <w:t xml:space="preserve">3.1.4 הנשירה הסמויה בישראל (בן רבי ואחרים, 2014)</w:t>
       </w:r>
     </w:p>
     <w:p>
@@ -2445,7 +2445,7 @@
       </w:r>
       <w:r>
         <w:rPr>
-          <w:rFonts w:ascii="David" w:cs="David" w:eastAsia="David" w:hAnsi="David"/>
+          <w:rFonts w:ascii="Times New Roman" w:cs="Times New Roman" w:eastAsia="Times New Roman" w:hAnsi="Times New Roman"/>
           <w:b w:val="false"/>
           <w:bCs w:val="false"/>
           <w:i w:val="false"/>
@@ -2471,7 +2471,7 @@
       </w:r>
       <w:r>
         <w:rPr>
-          <w:rFonts w:ascii="David" w:cs="David" w:eastAsia="David" w:hAnsi="David"/>
+          <w:rFonts w:ascii="Times New Roman" w:cs="Times New Roman" w:eastAsia="Times New Roman" w:hAnsi="Times New Roman"/>
           <w:b w:val="false"/>
           <w:bCs w:val="false"/>
           <w:i w:val="false"/>
@@ -2493,7 +2493,7 @@
           <w:szCs w:val="24"/>
           <w:rtl/>
         </w:rPr>
-        <w:t xml:space="preserve">; כי היקף הניתוק גבוה במיוחד בקרב בנים בחינוך הערבי; וכי תלמידים המדווחים על כמה ממדי ניתוק מאופיינים גם בהישגים נמוכים ובהתנהגויות סיכון. המסקנה המרכזית היא שיש לראות בנשירה הסמויה תופעה רבת פנים, שדורשת התייחסות לא רק לנוכחות אלא גם למעורבות בלמידה ולתחושת השייכות. המחקר תורם לעבודתנו את ההבחנה בין ממדי הניתוק, ומחזק את הטענה כי הזיהוי צריך להתמקד בהשתתפות ובשייכות, ולא רק בהיעדרויות ובציונים.</w:t>
+        <w:t xml:space="preserve">; כי היקף הניתוק גבוה במיוחד בקרב בנים בחינוך הערבי; וכי תלמידים המדווחים על כמה ממדי ניתוק מאופיינים גם בהישגים נמוכים ובהתנהגויות סיכון. המסקנה המרכזית היא שיש לראות בנשירה הסמויה תופעה רבת פנים, שדורשת התייחסות לנוכחות, למעורבות בלמידה ולתחושת השייכות. המחקר תורם לעבודה הנוכחית את ההבחנה בין ממדי הניתוק, ומחזק את הטענה כי הזיהוי צריך להתמקד בהשתתפות ובשייכות, ולא רק בהיעדרויות ובציונים.</w:t>
       </w:r>
     </w:p>
     <w:p>
@@ -2515,28 +2515,28 @@
           <w:szCs w:val="26"/>
           <w:rtl/>
         </w:rPr>
-        <w:t xml:space="preserve">3.1.5 הנשירה הגלויה והסמויה בקרב בני נוער (כהן-נבות, אלנבוגן-פרנקוביץ' וריינפלד, 2001)</w:t>
-      </w:r>
-    </w:p>
-    <w:p>
-      <w:pPr>
-        <w:keepNext w:val="false"/>
-        <w:bidi/>
-        <w:spacing w:after="120" w:before="0" w:line="360"/>
-        <w:jc w:val="both"/>
-      </w:pPr>
-      <w:r>
-        <w:rPr>
-          <w:rFonts w:ascii="David" w:cs="David" w:eastAsia="David" w:hAnsi="David"/>
-          <w:b w:val="false"/>
-          <w:bCs w:val="false"/>
-          <w:i w:val="false"/>
-          <w:iCs w:val="false"/>
-          <w:sz w:val="24"/>
-          <w:szCs w:val="24"/>
-          <w:rtl/>
-        </w:rPr>
-        <w:t xml:space="preserve">מחקר זה, שנערך במכון ברוקדייל בהזמנת הוועדה לקידום מעמד הילד של הכנסת, היה הניסיון הראשון מסוגו בישראל לאמוד את היקף הנשירה הסמויה ולא רק את היקף הנשירה הגלויה. מטרת המחקר הייתה להגדיר את התופעה, לאפיין את התלמידים הנושרים סמויים ולהעריך את שיעורם, תוך הדגשת נקודת מבטם של התלמידים עצמם על בית הספר. החוקרות הגדירו "נושרים סמויים" כתלמידים הרשומים בבית הספר באופן פורמלי אך אינם מפיקים את התועלת המצופה מתהליך הלמידה, ובחנו את התופעה באמצעות סקרים בקרב תלמידים ודיווחי צוותים חינוכיים. הממצאים הראו כי הנשירה הסמויה רחבה בהרבה מן הנשירה הגלויה, כי היא מתבטאת בהיעדרויות, בהישגים נמוכים, בתחושת ניכור ובניתוק חברתי, וכי היא שכיחה יותר בקרב תלמידים מרקע חברתי-כלכלי נמוך ובחינוך הערבי. בעקבות המחקר הוקמה ועדת כנסת מיוחדת לנושא הנשירה, שהגישה סדרת המלצות, ובהן הרחבת מערך הייעוץ והליווי בבתי הספר (בן רבי ואחרים, 2014). תרומתו של המחקר לעבודתנו היא בהצבת הנשירה הסמויה כתופעה בזכות עצמה, הדורשת זיהוי בתוך הכיתה ולא רק ברשומות הנוכחות, ובהדגשת נקודת המבט של התלמיד, שרק קשר אישי מאפשר להגיע אליה.</w:t>
+        <w:t xml:space="preserve">3.1.5 הנשירה הגלויה והסמויה בקרב בני נוער (כהן-נבות ואחרים, 2001)</w:t>
+      </w:r>
+    </w:p>
+    <w:p>
+      <w:pPr>
+        <w:keepNext w:val="false"/>
+        <w:bidi/>
+        <w:spacing w:after="120" w:before="0" w:line="360"/>
+        <w:jc w:val="both"/>
+      </w:pPr>
+      <w:r>
+        <w:rPr>
+          <w:rFonts w:ascii="David" w:cs="David" w:eastAsia="David" w:hAnsi="David"/>
+          <w:b w:val="false"/>
+          <w:bCs w:val="false"/>
+          <w:i w:val="false"/>
+          <w:iCs w:val="false"/>
+          <w:sz w:val="24"/>
+          <w:szCs w:val="24"/>
+          <w:rtl/>
+        </w:rPr>
+        <w:t xml:space="preserve">מחקר זה, שנערך במכון ברוקדייל בהזמנת הוועדה לקידום מעמד הילד של הכנסת, היה הניסיון הראשון מסוגו בישראל לאמוד את היקף הנשירה הסמויה ולא רק את היקף הנשירה הגלויה. מטרת המחקר הייתה להגדיר את התופעה, לאפיין את התלמידים הנושרים סמויים ולהעריך את שיעורם, תוך הדגשת נקודת מבטם של התלמידים עצמם על בית הספר. החוקרות הגדירו "נושרים סמויים" כתלמידים הרשומים בבית הספר באופן פורמלי אך אינם מפיקים את התועלת המצופה מתהליך הלמידה, ובחנו את התופעה באמצעות סקרים בקרב תלמידים ודיווחי צוותים חינוכיים. הממצאים הראו כי הנשירה הסמויה רחבה בהרבה מן הנשירה הגלויה, כי היא מתבטאת בהיעדרויות, בהישגים נמוכים, בתחושת ניכור ובניתוק חברתי, וכי היא שכיחה יותר בקרב תלמידים מרקע חברתי-כלכלי נמוך ובחינוך הערבי. בעקבות המחקר הוקמה ועדת כנסת מיוחדת לנושא הנשירה, שהגישה סדרת המלצות, ובהן הרחבת מערך הייעוץ והליווי בבתי הספר (בן רבי ואחרים, 2014). תרומתו של המחקר לעבודה הנוכחית היא בהצבת הנשירה הסמויה כתופעה בזכות עצמה, הדורשת זיהוי בתוך הכיתה ולא רק ברשומות הנוכחות, ובהדגשת נקודת המבט של התלמיד, שרק קשר אישי מאפשר להגיע אליה.</w:t>
       </w:r>
     </w:p>
     <w:p>
@@ -2584,7 +2584,7 @@
       </w:r>
       <w:r>
         <w:rPr>
-          <w:rFonts w:ascii="David" w:cs="David" w:eastAsia="David" w:hAnsi="David"/>
+          <w:rFonts w:ascii="Times New Roman" w:cs="Times New Roman" w:eastAsia="Times New Roman" w:hAnsi="Times New Roman"/>
           <w:b/>
           <w:bCs/>
           <w:i w:val="false"/>
@@ -2606,11 +2606,11 @@
           <w:szCs w:val="26"/>
           <w:rtl/>
         </w:rPr>
-        <w:t xml:space="preserve">ì, </w:t>
-      </w:r>
-      <w:r>
-        <w:rPr>
-          <w:rFonts w:ascii="David" w:cs="David" w:eastAsia="David" w:hAnsi="David"/>
+        <w:t xml:space="preserve">ì </w:t>
+      </w:r>
+      <w:r>
+        <w:rPr>
+          <w:rFonts w:ascii="Times New Roman" w:cs="Times New Roman" w:eastAsia="Times New Roman" w:hAnsi="Times New Roman"/>
           <w:b/>
           <w:bCs/>
           <w:i w:val="false"/>
@@ -2619,7 +2619,7 @@
           <w:szCs w:val="26"/>
           <w:rtl w:val="false"/>
         </w:rPr>
-        <w:t xml:space="preserve">Leavey, &amp; Best, 2008</w:t>
+        <w:t xml:space="preserve">et al., 2008</w:t>
       </w:r>
       <w:r>
         <w:rPr>
@@ -2653,7 +2653,7 @@
           <w:szCs w:val="24"/>
           <w:rtl/>
         </w:rPr>
-        <w:t xml:space="preserve">מחקר זה בחן כיצד מורים בבריטניה תופסים את הציפייה הגוברת מהם לשמש לא רק כמלמדים אלא גם כאנשי מקצוע בקו הראשון של בריאות הנפש של תלמידיהם. החוקרים ערכו ראיונות עומק עם מורים מבתי ספר יסודיים ועל-יסודיים, ובחנו את תפיסותיהם בדבר כשירותם, הכשרתם ואחריותם בתחום. הממצאים הצביעו על תחושה רחבה של חוסר הכנה: המורים דיווחו כי הם אמנם מבחינים בשינויים אצל תלמידים, אך אינם בטוחים מה משמעותם, אינם יודעים היכן עובר הגבול בין תפקידם החינוכי לבין תפקיד טיפולי, וחוששים לפעול באופן שגוי. הם תיארו גם היעדר תמיכה מספקת מצד שירותי בריאות הנפש, שהותיר אותם עם תחושת אחריות ללא סמכות וללא כלים. מסקנת החוקרים היא שההרחבה של תפקיד המורה לתחום בריאות הנפש התרחשה ללא הכשרה ותשתית מקבילות, ושיש לפתח הכשרה ומערכי תמיכה שיאפשרו למורים למלא תפקיד זה בביטחון. מחקר זה מספק רקע ישיר לשאלת תפיסת התפקיד ומעלה את הפער בין ציפייה להכשרה כסוגיה מרכזית.</w:t>
+        <w:t xml:space="preserve">מחקר זה בחן כיצד מורים בבריטניה תופסים את הציפייה הגוברת מהם לשמש, מעבר להוראה, גם אנשי מקצוע בקו הראשון של בריאות הנפש של תלמידיהם. החוקרים ערכו ראיונות עומק עם מורים מבתי ספר יסודיים ועל-יסודיים, ובחנו את תפיסותיהם בדבר כשירותם, הכשרתם ואחריותם בתחום. הממצאים הצביעו על תחושה רחבה של חוסר הכנה: המורים דיווחו כי הם אמנם מבחינים בשינויים אצל תלמידים, אך אינם בטוחים מה משמעותם, אינם יודעים היכן עובר הגבול בין תפקידם החינוכי לבין תפקיד טיפולי, וחוששים לפעול באופן שגוי. הם תיארו גם היעדר תמיכה מספקת מצד שירותי בריאות הנפש, שהותיר אותם עם תחושת אחריות ללא סמכות וללא כלים. מסקנת החוקרים היא שההרחבה של תפקיד המורה לתחום בריאות הנפש התרחשה ללא הכשרה ותשתית מקבילות, ושיש לפתח הכשרה ומערכי תמיכה שיאפשרו למורים למלא תפקיד זה בביטחון. מחקר זה מספק רקע ישיר לשאלת תפיסת התפקיד ומעלה את הפער בין ציפייה להכשרה כסוגיה מרכזית.</w:t>
       </w:r>
     </w:p>
     <w:p>
@@ -2679,7 +2679,7 @@
       </w:r>
       <w:r>
         <w:rPr>
-          <w:rFonts w:ascii="David" w:cs="David" w:eastAsia="David" w:hAnsi="David"/>
+          <w:rFonts w:ascii="Times New Roman" w:cs="Times New Roman" w:eastAsia="Times New Roman" w:hAnsi="Times New Roman"/>
           <w:b/>
           <w:bCs/>
           <w:i w:val="false"/>
@@ -2688,7 +2688,7 @@
           <w:szCs w:val="26"/>
           <w:rtl w:val="false"/>
         </w:rPr>
-        <w:t xml:space="preserve">Kidger, Gunnell, Biddle, Campbell, &amp; Donovan, 2010</w:t>
+        <w:t xml:space="preserve">Kidger et al., 2010</w:t>
       </w:r>
       <w:r>
         <w:rPr>
@@ -2722,7 +2722,7 @@
           <w:szCs w:val="24"/>
           <w:rtl/>
         </w:rPr>
-        <w:t xml:space="preserve">מטרת המחקר הייתה לבחון כיצד צוותי הוראה בבתי ספר על-יסודיים תופסים את תפקידם בתמיכה בבריאות הרגשית של תלמידים. החוקרים ערכו מחקר איכותני בשמונה בתי ספר באנגליה, שכלל ראיונות וקבוצות מיקוד עם מורים ואנשי צוות. הממצאים הראו כי רוב המורים ראו בתמיכה הרגשית בתלמידים "חלק בלתי נפרד מן ההוראה", אך בה בעת תיארו מתח בין תפיסה זו לבין דרישות ההישגים, עומס העבודה והיעדר זמן. חלק מהמורים הביעו דאגה שהתמיכה הרגשית נשענת על נכונות אישית של מורים מסוימים ולא על מבנה ארגוני, ושמורים שאינם "טיפוסים כאלה" משאירים תלמידים ללא מענה. עלה גם הצורך של המורים עצמם בתמיכה רגשית, שכן העיסוק במצוקת תלמידים מכביד עליהם. המסקנה המרכזית היא שיש להעביר את התמיכה הרגשית מן התחום של יוזמה אישית לתחום של אחריות מוסדית, הכוללת זמן, הכשרה ותמיכה לצוות. מחקר זה חשוב לעבודתנו משום שהוא מאיר את התלות של הסיוע לתלמידים ב"רצון הטוב" של מורות יחידות.</w:t>
+        <w:t xml:space="preserve">מטרת המחקר הייתה לבחון כיצד צוותי הוראה בבתי ספר על-יסודיים תופסים את תפקידם בתמיכה בבריאות הרגשית של תלמידים. החוקרים ערכו מחקר איכותני בשמונה בתי ספר באנגליה, שכלל ראיונות וקבוצות מיקוד עם מורים ואנשי צוות. הממצאים הראו כי רוב המורים ראו בתמיכה הרגשית בתלמידים "חלק בלתי נפרד מן ההוראה", אך בה בעת תיארו מתח בין תפיסה זו לבין דרישות ההישגים, עומס העבודה והיעדר זמן. חלק מהמורים הביעו דאגה שהתמיכה הרגשית נשענת על נכונות אישית של מורים מסוימים ולא על מבנה ארגוני, ושמורים שאינם "טיפוסים כאלה" משאירים תלמידים ללא מענה. עלה גם הצורך של המורים עצמם בתמיכה רגשית, שכן העיסוק במצוקת תלמידים מכביד עליהם. המסקנה המרכזית היא שיש להעביר את התמיכה הרגשית מן התחום של יוזמה אישית לתחום של אחריות מוסדית, הכוללת זמן, הכשרה ותמיכה לצוות. מחקר זה תורם לעבודה הנוכחית משום שהוא מאיר את התלות של הסיוע לתלמידים ב"רצון הטוב" של מורות יחידות.</w:t>
       </w:r>
     </w:p>
     <w:p>
@@ -2748,7 +2748,7 @@
       </w:r>
       <w:r>
         <w:rPr>
-          <w:rFonts w:ascii="David" w:cs="David" w:eastAsia="David" w:hAnsi="David"/>
+          <w:rFonts w:ascii="Times New Roman" w:cs="Times New Roman" w:eastAsia="Times New Roman" w:hAnsi="Times New Roman"/>
           <w:b/>
           <w:bCs/>
           <w:i w:val="false"/>
@@ -2757,7 +2757,7 @@
           <w:szCs w:val="26"/>
           <w:rtl w:val="false"/>
         </w:rPr>
-        <w:t xml:space="preserve">Reinke, Stormont, Herman, Puri, &amp; Goel, 2011</w:t>
+        <w:t xml:space="preserve">Reinke et al., 2011</w:t>
       </w:r>
       <w:r>
         <w:rPr>
@@ -2791,7 +2791,7 @@
           <w:szCs w:val="24"/>
           <w:rtl/>
         </w:rPr>
-        <w:t xml:space="preserve">מחקר זה בחן את תפיסותיהם של מורים בדבר צורכי בריאות הנפש של תלמידיהם, הידע והכשרתם בתחום, תפקידם בתמיכה בתלמידים והחסמים שהם חווים. במחקר השתתפו 292 מורים מחמישה מחוזות חינוך בארצות הברית, שמילאו שאלון מובנה. הממצאים הראו כי המורים ראו בפסיכולוג בית הספר את בעל התפקיד המרכזי ברוב היבטי הטיפול, ובהם סינון, הערכה, מעקב והפניה, אך ראו בעצמם בעלי תפקיד מרכזי ביישום התערבויות בכיתה ובזיהוי ראשוני של תלמידים במצוקה. רק מיעוט מן המורים חשו שיש להם הידע והמיומנויות הדרושים לתמוך בבריאות הנפש של תלמידיהם, ורובם ציינו כחסמים עיקריים היעדר הכשרה, מחסור באנשי מקצוע בבית הספר ומחסור בזמן. המסקנה היא שמורים מבחינים בין תפקיד ה"מזהה והמפנה", שהם מקבלים על עצמם, לבין תפקיד ה"מאבחן והמטפל", שאותו הם מייעדים לאנשי מקצוע, ושהחסמים העיקריים הם מבניים ולא מוטיבציוניים. מחקר זה מסייע לנו להבחין בין רכיבי תפיסת התפקיד ולבחון היכן ממקמות עצמן המחנכות שרואיינו.</w:t>
+        <w:t xml:space="preserve">מחקר זה בחן את תפיסותיהם של מורים בדבר צורכי בריאות הנפש של תלמידיהם, הידע והכשרתם בתחום, תפקידם בתמיכה בתלמידים והחסמים שהם חווים. במחקר השתתפו 292 מורים מחמישה מחוזות חינוך בארצות הברית, שמילאו שאלון מובנה. הממצאים הראו כי המורים ראו בפסיכולוג בית הספר את בעל התפקיד המרכזי ברוב היבטי הטיפול, ובהם סינון, הערכה, מעקב והפניה, אך ראו בעצמם בעלי תפקיד מרכזי ביישום התערבויות בכיתה ובזיהוי ראשוני של תלמידים במצוקה. רק מיעוט מן המורים חשו שיש להם הידע והמיומנויות הדרושים לתמוך בבריאות הנפש של תלמידיהם, ורובם ציינו כחסמים עיקריים היעדר הכשרה, מחסור באנשי מקצוע בבית הספר ומחסור בזמן. המסקנה היא שמורים מבחינים בין תפקיד ה"מזהה והמפנה", שהם מקבלים על עצמם, לבין תפקיד ה"מאבחן והמטפל", שאותו הם מייעדים לאנשי מקצוע, ושהחסמים העיקריים הם מבניים ולא מוטיבציוניים. מחקר זה מסייע להבחין בין רכיבי תפיסת התפקיד ולבחון היכן ממקמות עצמן המחנכות שרואיינו.</w:t>
       </w:r>
     </w:p>
     <w:p>
@@ -2856,7 +2856,7 @@
           <w:szCs w:val="28"/>
           <w:rtl/>
         </w:rPr>
-        <w:t xml:space="preserve">3.3 מחקרים על הקשר מורה–תלמיד כגורם מגן</w:t>
+        <w:t xml:space="preserve">3.3 מחקרים על הקשר מורה-תלמיד כגורם מגן</w:t>
       </w:r>
     </w:p>
     <w:p>
@@ -2878,11 +2878,11 @@
           <w:szCs w:val="26"/>
           <w:rtl/>
         </w:rPr>
-        <w:t xml:space="preserve">3.3.1 השפעת יחסי מורה–תלמיד על מעורבות והישגים: מטא-אנליזה (</w:t>
-      </w:r>
-      <w:r>
-        <w:rPr>
-          <w:rFonts w:ascii="David" w:cs="David" w:eastAsia="David" w:hAnsi="David"/>
+        <w:t xml:space="preserve">3.3.1 השפעת יחסי מורה-תלמיד על מעורבות והישגים: מטא-אנליזה (</w:t>
+      </w:r>
+      <w:r>
+        <w:rPr>
+          <w:rFonts w:ascii="Times New Roman" w:cs="Times New Roman" w:eastAsia="Times New Roman" w:hAnsi="Times New Roman"/>
           <w:b/>
           <w:bCs/>
           <w:i w:val="false"/>
@@ -2891,7 +2891,7 @@
           <w:szCs w:val="26"/>
           <w:rtl w:val="false"/>
         </w:rPr>
-        <w:t xml:space="preserve">Roorda, Koomen, Spilt, &amp; Oort, 2011</w:t>
+        <w:t xml:space="preserve">Roorda et al., 2011</w:t>
       </w:r>
       <w:r>
         <w:rPr>
@@ -2925,7 +2925,7 @@
           <w:szCs w:val="24"/>
           <w:rtl/>
         </w:rPr>
-        <w:t xml:space="preserve">מטרת המחקר הייתה לבחון, באמצעות מטא-אנליזה, את הקשר בין האיכות הרגשית של יחסי מורה–תלמיד לבין המעורבות הבית ספרית וההישגים של תלמידים. החוקרים ניתחו 99 מחקרים שנערכו בקרב תלמידים מגיל הגן ועד לתיכון. הממצאים הראו כי הקשר בין יחסים חיוביים ושליליים עם המורה לבין מעורבות התלמיד היה בעוצמה בינונית עד גבוהה, בעוד הקשר להישגים היה בעוצמה קטנה עד בינונית. ממצא חשוב במיוחד לעבודתנו הוא שההשפעה של יחסי מורה–תלמיד על מעורבות נמצאה חזקה יותר בכיתות הגבוהות, כלומר בחטיבת הביניים ובתיכון, ולא נחלשה עם הגיל כפי שניתן היה לצפות. כמו כן נמצא שהשפעת הקשר חזקה יותר בקרב תלמידים מרקע חברתי-כלכלי נמוך ובקרב תלמידים בסיכון לימודי. מסקנת החוקרים היא שיחסי מורה–תלמיד הם משאב מרכזי לקידום מעורבות דווקא בקרב מתבגרים בסיכון, ושיש להשקיע בטיפוחם גם בשלבי החינוך העל-יסודי. מחקר זה מעניק תוקף אמפירי לטענה שהקשר עם המחנכת בחטיבת הביניים הוא גורם מגן עבור נערות בסיכון.</w:t>
+        <w:t xml:space="preserve">מטרת המחקר הייתה לבחון, באמצעות מטא-אנליזה, את הקשר בין האיכות הרגשית של יחסי מורה-תלמיד לבין המעורבות הבית ספרית וההישגים של תלמידים. החוקרים ניתחו 99 מחקרים שנערכו בקרב תלמידים מגיל הגן ועד לתיכון. הממצאים הראו כי הקשר בין יחסים חיוביים ושליליים עם המורה לבין מעורבות התלמיד היה בעוצמה בינונית עד גבוהה, בעוד הקשר להישגים היה בעוצמה קטנה עד בינונית. ממצא חשוב במיוחד לעבודה הנוכחית הוא שההשפעה של יחסי מורה-תלמיד על מעורבות נמצאה חזקה יותר בכיתות הגבוהות, כלומר בחטיבת הביניים ובתיכון, ולא נחלשה עם הגיל כפי שניתן היה לצפות. נמצא גם שהשפעת הקשר חזקה יותר בקרב תלמידים מרקע חברתי-כלכלי נמוך ובקרב תלמידים בסיכון לימודי. מסקנת החוקרים היא שיחסי מורה-תלמיד הם משאב מרכזי לקידום מעורבות דווקא בקרב מתבגרים בסיכון, ושיש להשקיע בטיפוחם גם בשלבי החינוך העל-יסודי. מחקר זה מעניק תוקף אמפירי לטענה שהקשר עם המחנכת בחטיבת הביניים הוא גורם מגן עבור נערות בסיכון.</w:t>
       </w:r>
     </w:p>
     <w:p>
@@ -2947,11 +2947,11 @@
           <w:szCs w:val="26"/>
           <w:rtl/>
         </w:rPr>
-        <w:t xml:space="preserve">3.3.2 יחסי מורה–ילד מוקדמים ומסלול ההתפתחות (</w:t>
-      </w:r>
-      <w:r>
-        <w:rPr>
-          <w:rFonts w:ascii="David" w:cs="David" w:eastAsia="David" w:hAnsi="David"/>
+        <w:t xml:space="preserve">3.3.2 יחסי מורה-ילד מוקדמים ומסלול ההתפתחות (</w:t>
+      </w:r>
+      <w:r>
+        <w:rPr>
+          <w:rFonts w:ascii="Times New Roman" w:cs="Times New Roman" w:eastAsia="Times New Roman" w:hAnsi="Times New Roman"/>
           <w:b/>
           <w:bCs/>
           <w:i w:val="false"/>
@@ -2994,7 +2994,7 @@
           <w:szCs w:val="24"/>
           <w:rtl/>
         </w:rPr>
-        <w:t xml:space="preserve">מחקר זה בחן אם איכות הקשר בין המורה לילד בגן חובה מנבאת את תפקודו הלימודי וההתנהגותי בבית הספר עד כיתה ח'. במחקר השתתפו 179 ילדים שנעקבו לאורך תשע שנים, ומוריהם בגן דיווחו על איכות הקשר עמם, ובמיוחד על מידת הקונפליקט והתלות ביחסים. הממצאים הראו כי דיווחי המורות על קונפליקט ותלות ביחסים בגן ניבאו הישגים והתנהגות בכיתות היסודי ובחטיבת הביניים, גם לאחר פיקוח על יכולת קוגניטיבית ועל התנהגות בגן. הקשר היה חזק במיוחד בקרב ילדים שהחלו את דרכם עם רמה גבוהה של בעיות התנהגות: ילדים כאלה שזכו לקשר חיובי עם המורה הציגו תפקוד טוב יותר בהמשך מילדים דומים שיחסיהם עם המורה היו עמוסי קונפליקט. המסקנה היא שיחסי מורה–תלמיד אינם רק תוצאה של תפקוד הילד אלא גם גורם המעצב את מסלולו, ושהם יכולים לשמש גורם מגן דווקא לילדים בסיכון. המחקר תורם לעבודתנו את ההבנה שהשקעה בקשר עם תלמידה בסיכון היא התערבות בזכות עצמה, ולא רק צעד לקראת הפניה.</w:t>
+        <w:t xml:space="preserve">מחקר זה בחן אם איכות הקשר בין המורה לילד בגן חובה מנבאת את תפקודו הלימודי וההתנהגותי בבית הספר עד כיתה ח'. במחקר השתתפו 179 ילדים שנעקבו לאורך תשע שנים, ומוריהם בגן דיווחו על איכות הקשר עמם, ובמיוחד על מידת הקונפליקט והתלות ביחסים. הממצאים הראו כי דיווחי המורות על קונפליקט ותלות ביחסים בגן ניבאו הישגים והתנהגות בכיתות היסודי ובחטיבת הביניים, גם לאחר פיקוח על יכולת קוגניטיבית ועל התנהגות בגן. הקשר היה חזק במיוחד בקרב ילדים שהחלו את דרכם עם רמה גבוהה של בעיות התנהגות: ילדים כאלה שזכו לקשר חיובי עם המורה הציגו תפקוד טוב יותר בהמשך מילדים דומים שיחסיהם עם המורה היו עמוסי קונפליקט. המסקנה היא שיחסי מורה-תלמיד אינם תוצאה בלבד של תפקוד הילד, והם גם גורם המעצב את מסלולו, ושהם יכולים לשמש גורם מגן דווקא לילדים בסיכון. המחקר תורם לעבודה הנוכחית את ההבנה שהשקעה בקשר עם תלמידה בסיכון היא התערבות בזכות עצמה, ולא רק צעד לקראת הפניה.</w:t>
       </w:r>
     </w:p>
     <w:p>
@@ -3042,7 +3042,7 @@
       </w:r>
       <w:r>
         <w:rPr>
-          <w:rFonts w:ascii="David" w:cs="David" w:eastAsia="David" w:hAnsi="David"/>
+          <w:rFonts w:ascii="Times New Roman" w:cs="Times New Roman" w:eastAsia="Times New Roman" w:hAnsi="Times New Roman"/>
           <w:b/>
           <w:bCs/>
           <w:i w:val="false"/>
@@ -3085,7 +3085,7 @@
           <w:szCs w:val="24"/>
           <w:rtl/>
         </w:rPr>
-        <w:t xml:space="preserve">מטרת המחקר הייתה להבין את תופעת הנשירה של נערות בדואיות ממערכת החינוך הציבורית בנגב. אבו-רביעה-קווידר, סוציולוגית של החינוך ובעצמה האישה הבדואית הראשונה בישראל שקיבלה תואר דוקטור, ערכה מחקר איכותני שכלל ראיונות עם נערות שנשרו, עם אבותיהן ועם אנשי חינוך. הממצאים הראו כי הנשירה אינה נובעת בעיקר מכישלון לימודי או מחוסר רצון של הנערות, אלא מהתנגשות בין תפיסת המודרניות של מוסדות החינוך הישראליים, המקדמים חינוך משותף לבנים ולבנות בבתי ספר מרוחקים, לבין המסורת המהווה את האתוס התרבותי של האבות, החוששים לכבוד המשפחה ולביטחון בנותיהם. במצב זה האב מוציא את הבת מבית הספר, לעיתים לקראת נישואים, והנערה נותרת ללא קול. המסקנה של החוקרת היא שפתרון הנשירה אינו יכול להתבסס על כפיית מודרניות מבחוץ, אלא על שילוב ערכי הקהילה בתוך תהליך המודרניזציה, למשל באמצעות בתי ספר קרובים ומסגרות המקובלות על המשפחה. מחקר זה חשוב לעבודתנו משום שהוא ממקם את הנשירה של נערות בהקשר משפחתי-תרבותי שהמורה אינה שולטת בו, אך שהיכרותה עמו היא תנאי לפעולה יעילה.</w:t>
+        <w:t xml:space="preserve">מטרת המחקר הייתה להבין את תופעת הנשירה של נערות בדואיות ממערכת החינוך הציבורית בנגב. אבו-רביעה-קווידר, סוציולוגית של החינוך ובעצמה האישה הבדואית הראשונה בישראל שקיבלה תואר דוקטור, ערכה מחקר איכותני שכלל ראיונות עם נערות שנשרו, עם אבותיהן ועם אנשי חינוך. הממצאים הראו כי הנשירה אינה נובעת בעיקר מכישלון לימודי או מחוסר רצון של הנערות, אלא מהתנגשות בין תפיסת המודרניות של מוסדות החינוך הישראליים, המקדמים חינוך משותף לבנים ולבנות בבתי ספר מרוחקים, לבין המסורת המהווה את האתוס התרבותי של האבות, החוששים לכבוד המשפחה ולביטחון בנותיהם. במצב זה האב מוציא את הבת מבית הספר, לעיתים לקראת נישואים, והנערה נותרת ללא קול. המסקנה של החוקרת היא שפתרון הנשירה אינו יכול להתבסס על כפיית מודרניות מבחוץ, אלא על שילוב ערכי הקהילה בתוך תהליך המודרניזציה, למשל באמצעות בתי ספר קרובים ומסגרות המקובלות על המשפחה. מחקר זה תורם לעבודה הנוכחית משום שהוא ממקם את הנשירה של נערות בהקשר משפחתי-תרבותי שהמורה אינה שולטת בו, אך שהיכרותה עמו היא תנאי לפעולה יעילה.</w:t>
       </w:r>
     </w:p>
     <w:p>
@@ -3258,7 +3258,7 @@
           <w:szCs w:val="24"/>
           <w:rtl/>
         </w:rPr>
-        <w:t xml:space="preserve">מטרת המחקר היא לבחון את תהליך הזיהוי של נערות בסיכון ואת תפיסת התפקיד של המורה בסיוע להן, מנקודת מבטן של מחנכות המלמדות בחטיבות ביניים בחברה הערבית בישראל. המחקר מבקש להבין לא רק מה המחנכות עושות, אלא כיצד הן מבינות את מה שהן עושות: מה נחשב בעיניהן לסימן, מה מניע אותן לפעול, היכן הן ממקמות את גבולות תפקידן ומה הן חוות בתהליך.</w:t>
+        <w:t xml:space="preserve">מטרת המחקר היא לבחון את תהליך הזיהוי של נערות בסיכון ואת תפיסת התפקיד של המורה בסיוע להן, מנקודת מבטן של מחנכות המלמדות בחטיבות ביניים בחברה הערבית בישראל. המחקר מבקש להבין מה המחנכות עושות, וגם כיצד הן מבינות את מה שהן עושות: מה נחשב בעיניהן לסימן, מה מניע אותן לפעול, היכן הן ממקמות את גבולות תפקידן ומה הן חוות בתהליך.</w:t>
       </w:r>
     </w:p>
     <w:p>
@@ -3385,7 +3385,7 @@
           <w:szCs w:val="24"/>
           <w:rtl/>
         </w:rPr>
-        <w:t xml:space="preserve">היבט נוסף שיש להתייחס אליו הוא מיקומן של החוקרות ביחס לשדה. שתי כותבות העבודה הן בנות החברה הערבית, בוגרות מערכת החינוך הערבית ומכירות מבפנים את המתחים שהעבודה עוסקת בהם. היכרות זו היא יתרון, שכן היא מאפשרת להבין רמזים, מונחים והקשרים שחוקרת מבחוץ עשויה לפספס, ומקלה על יצירת אמון עם המרואיינות. אך היא גם מחייבת ערנות: החוקרת המכירה את השדה עלולה להניח שהיא מבינה את המרואיינת עוד לפני שזו סיימה לדבר, ולפרש את דבריה על פי חוויותיה שלה. במחקר זה ניסינו להתמודד עם סיכון זה באמצעות שאלות המשך המבקשות מן המרואיינת לפרט ולהדגים, באמצעות ניסוח שמות התימות במילותיה שלה, ובאמצעות דיון בין שתינו על הפרשנות, כמפורט בסעיף התוקף והמהימנות.</w:t>
+        <w:t xml:space="preserve">היבט נוסף שיש להתייחס אליו הוא מיקומן של החוקרות ביחס לשדה. שתי החוקרות הן בנות החברה הערבית, בוגרות מערכת החינוך הערבית ומכירות מבפנים את המתחים שהעבודה עוסקת בהם. היכרות זו היא יתרון, שכן היא מאפשרת להבין רמזים, מונחים והקשרים שחוקרת מבחוץ עשויה לפספס, ומקלה על יצירת אמון עם המרואיינות. אך היא גם מחייבת ערנות: החוקרת המכירה את השדה עלולה להניח שהיא מבינה את המרואיינת עוד לפני שזו סיימה לדבר, ולפרש את דבריה על פי חוויותיה שלה. במחקר זה נעשה ניסיון להתמודד עם סיכון זה באמצעות שאלות המשך המבקשות מן המרואיינת לפרט ולהדגים, באמצעות ניסוח שמות התימות במילותיה שלה, ובאמצעות דיון בין שתי החוקרות על הפרשנות, כמפורט בסעיף התוקף והמהימנות.</w:t>
       </w:r>
     </w:p>
     <w:p>
@@ -3428,7 +3428,7 @@
           <w:szCs w:val="24"/>
           <w:rtl/>
         </w:rPr>
-        <w:t xml:space="preserve">אוכלוסיית המחקר היא מחנכות בחטיבות ביניים ביישובים ערביים בישראל. הבחירה במחנכות, ולא במורות מקצועיות בלבד, נעשתה משום שהזיהוי והליווי של תלמידים הם חלק מוגדר מתפקיד המחנכת, ומשום שהיא פוגשת את תלמידותיה מספר שעות גדול יותר בשבוע. הבחירה בחטיבת הביניים נעשתה על בסיס הספרות, המלמדת כי נערות עוזבות את בית הספר מוקדם יותר מנערים, כבר בשלב זה (ברוך-קוברסקי ואחרים, 2022), ולכן חלון ההזדמנויות לזיהוי נמצא בכיתות ז'–ט'.</w:t>
+        <w:t xml:space="preserve">אוכלוסיית המחקר היא מחנכות בחטיבות ביניים ביישובים ערביים בישראל. הבחירה במחנכות, ולא במורות מקצועיות בלבד, נעשתה משום שהזיהוי והליווי של תלמידים הם חלק מוגדר מתפקיד המחנכת, ומשום שהיא פוגשת את תלמידותיה מספר שעות גדול יותר בשבוע. הבחירה בחטיבת הביניים נעשתה על בסיס הספרות, המלמדת כי נערות עוזבות את בית הספר מוקדם יותר מנערים, כבר בשלב זה (ברוך-קוברסקי ואחרים, 2022), ולכן חלון ההזדמנויות לזיהוי נמצא בכיתות ז'-ט'.</w:t>
       </w:r>
     </w:p>
     <w:p>
@@ -3471,7 +3471,7 @@
           <w:shd w:fill="FFFF00" w:color="auto" w:val="clear"/>
           <w:rtl/>
         </w:rPr>
-        <w:t xml:space="preserve">[להשלמה לאחר ביצוע הראיונות הנוספים: יש להוסיף כאן את פרטי המרואיינות הנוספות (מספר, גיל, ותק, כיתת חינוך, יישוב באופן כללי), ולתאר את הליך הגיוס (למשל: פנייה ישירה למחנכות מוכרות ושיטת "כדור שלג"). מומלץ לשאוף לארבע–שש מרואיינות בסך הכול, בהתאם לדוגמאות העבודות בקורס. יש למחוק הערה זו לאחר ההשלמה.]</w:t>
+        <w:t xml:space="preserve">המדגם המתוכנן כולל שמונה מחנכות, ארבע לכל חוקרת, מיישובים ערביים שונים ובעלות ותק מגוון, כדי לאפשר השוואה בין מחנכות בנות היישוב שבו הן מלמדות לבין מחנכות המגיעות מבחוץ, ובין ותיקות לצעירות. [להשלמה לאחר ביצוע הראיונות: יש להוסיף כאן טבלה או פסקה עם פרטי כל מרואיינת (שם בדוי, גיל, ותק, כיתת חינוך, אזור בארץ), ולתאר את הליך הגיוס. יש למחוק הערה זו לאחר ההשלמה.]</w:t>
       </w:r>
     </w:p>
     <w:p>
@@ -3514,7 +3514,7 @@
           <w:szCs w:val="24"/>
           <w:rtl/>
         </w:rPr>
-        <w:t xml:space="preserve">כלי המחקר הוא ריאיון חצי מובנה. ריאיון מסוג זה מורכב משאלות שנכתבו מראש אך ניתנות לשינוי, להשמטה ולהרחבה בהתאם לדינמיקה הנוצרת במהלך השיחה, ומטרתו להבין את התפיסות, האמונות והחוויות של המרואיינת מנקודת מבטה (שקדי, 2003). מדריך הריאיון כלל חמש עשרה שאלות פתוחות (ראו נספח א'), שנוסחו על פי העקרונות שנלמדו בקורס: שאלות תיאוריות ומקיפות בפתיחה ("ספרי לי על עצמך ועל הדרך שהביאה אותך להוראה"), שאלות המזמינות דוגמאות ומקרים בהמשך ("ספרי לי על מקרה ספציפי שבו זיהית נערה במצב סיכון"), והימנעות משאלות סגורות, משאלות המתחילות במילה "האם" ומשאלות מכוונות. שאלות רגישות מבחינה אישית או תרבותית, כגון השאלה על ההשפעה של ההקשר הקהילתי ועל מקרה של כישלון, מוקמו בשליש האחרון של הריאיון, לאחר שנוצרו אמון ונינוחות. השאלות אורגנו על פי שלושה צירים המקבילים לשאלות המשנה: תהליך הזיהוי והסימנים (שאלות 4–7), הפעולה לאחר הזיהוי והממשקים עם גורמים אחרים (שאלות 8–12), ותפיסת התפקיד וגבולותיו (שאלות 3, 13–15).</w:t>
+        <w:t xml:space="preserve">כלי המחקר הוא ריאיון חצי מובנה. ריאיון מסוג זה מורכב משאלות שנכתבו מראש אך ניתנות לשינוי, להשמטה ולהרחבה בהתאם לדינמיקה הנוצרת במהלך השיחה, ומטרתו להבין את התפיסות, האמונות והחוויות של המרואיינת מנקודת מבטה (שקדי, 2003). מדריך הריאיון כלל חמש עשרה שאלות פתוחות (ראו נספח א'), שנוסחו על פי העקרונות שנלמדו בקורס (סלע-שיוביץ, 2026): שאלות תיאוריות ומקיפות בפתיחה ("ספרי לי על עצמך ועל הדרך שהביאה אותך להוראה"), שאלות המזמינות דוגמאות ומקרים בהמשך ("ספרי לי על מקרה ספציפי שבו זיהית נערה במצב סיכון"), והימנעות משאלות סגורות, משאלות המתחילות במילה "האם" ומשאלות מכוונות. שאלות רגישות מבחינה אישית או תרבותית, כגון השאלה על ההשפעה של ההקשר הקהילתי ועל מקרה של כישלון, מוקמו בשליש האחרון של הריאיון, לאחר שנוצרו אמון ונינוחות. השאלות אורגנו על פי שלושה צירים המקבילים לשאלות המשנה: תהליך הזיהוי והסימנים (שאלות 4-7), הפעולה לאחר הזיהוי והממשקים עם גורמים אחרים (שאלות 8-12), ותפיסת התפקיד וגבולותיו (שאלות 3, 13-15).</w:t>
       </w:r>
     </w:p>
     <w:p>
@@ -3622,7 +3622,7 @@
           <w:szCs w:val="24"/>
           <w:rtl/>
         </w:rPr>
-        <w:t xml:space="preserve">ניתוח הנתונים נעשה בשיטת הניתוח הנושאי (התימטי), כפי שנלמדה בקורס ובהתאם לעקרונות המחקר האיכותני-פרשני. שקדי (2003) מתאר את הקטגוריזציה, כלומר חיבור של חלקי מידע הנראים שייכים לאותה תופעה, כבסיס לניתוח האיכותני, ומדגיש כי תהליך הניתוח חייב להיות שיטתי, מובנה בשלבים ושקוף, כך שמתבונן מן הצד יוכל להבין כיצד הגיעו החוקרות מן הנתונים אל הממצאים.</w:t>
+        <w:t xml:space="preserve">ניתוח הנתונים נעשה בשיטת הניתוח הנושאי (התימטי), כפי שנלמדה בקורס (סלע-שיוביץ, 2026) ובהתאם לעקרונות המחקר האיכותני-פרשני. שקדי (2003) מתאר את הקטגוריזציה, כלומר חיבור של חלקי מידע הנראים שייכים לאותה תופעה, כבסיס לניתוח האיכותני, ומדגיש כי תהליך הניתוח חייב להיות שיטתי, מובנה בשלבים ושקוף, כך שמתבונן מן הצד יוכל להבין כיצד הגיעו החוקרות מן הנתונים אל הממצאים.</w:t>
       </w:r>
     </w:p>
     <w:p>
@@ -3686,7 +3686,7 @@
           <w:szCs w:val="24"/>
           <w:rtl/>
         </w:rPr>
-        <w:t xml:space="preserve">כדי להגביר את אמינות הממצאים ננקטו כמה צעדים. ראשית, הריאיון הוקלט ותומלל במלואו, ללא עריכה או תיקון של לשון המרואיינת, כך שהניתוח נשען על דבריה כפי שנאמרו. שנית, שמות התימות נוסחו במילותיה של המרואיינת, כדי לצמצם את המרחק בין הנתונים לפרשנות. שלישית, שתי כותבות העבודה קראו את התמלול וסימנו יחידות משמעות באופן עצמאי, ולאחר מכן השוו את הסימונים ודנו בהבדלים עד להסכמה, באופן שמאפשר בקרה הדדית על הפרשנות. רביעית, בפרק הממצאים הופרדו הציטוטים מן הפרשנות באופן גרפי, כדי לאפשר לקוראת לבחון בעצמה את הקשר בין הנתון לפרשנותו. חמישית, כל המקורות התיאורטיים והמחקריים שבעבודה אומתו מול הפרסום המקורי או מול רשומה ביבליוגרפית רשמית.</w:t>
+        <w:t xml:space="preserve">כדי להגביר את אמינות הממצאים ננקטו כמה צעדים. ראשית, הריאיון הוקלט ותומלל במלואו, ללא עריכה או תיקון של לשון המרואיינת, כך שהניתוח נשען על דבריה כפי שנאמרו. שנית, שמות התימות נוסחו במילותיה של המרואיינת, כדי לצמצם את המרחק בין הנתונים לפרשנות. שלישית, שתי החוקרות קראו את התמלול וסימנו יחידות משמעות באופן עצמאי, ולאחר מכן השוו את הסימונים ודנו בהבדלים עד להסכמה, באופן שמאפשר בקרה הדדית על הפרשנות. רביעית, בפרק הממצאים הופרדו הציטוטים מן הפרשנות באופן גרפי, כדי לאפשר לקוראת לבחון בעצמה את הקשר בין הנתון לפרשנותו. חמישית, כל המקורות התיאורטיים והמחקריים שבעבודה אומתו מול הפרסום המקורי או מול רשומה ביבליוגרפית רשמית.</w:t>
       </w:r>
     </w:p>
     <w:p>
@@ -3729,7 +3729,7 @@
           <w:szCs w:val="24"/>
           <w:rtl/>
         </w:rPr>
-        <w:t xml:space="preserve">המחקר נערך על פי כללי האתיקה המקובלים במחקר איכותני. המרואיינת קיבלה הסבר על מטרת המחקר ועל אופן השימוש בחומרים, וחתמה על טופס הסכמה מדעת שבו הובהר כי ההשתתפות היא רשות ולא חובה, וכי היא רשאית להפסיק בכל שלב. שמה של המרואיינת הוחלף בשם בדוי, ושמות התלמידות שהוזכרו בריאיון צוינו באות בלבד או שונו. שם היישוב ושם בית הספר הושמטו, ופרטים שעשויים לזהות את המרואיינת או את תלמידותיה טושטשו. ההקלטה נשמרה בקובץ מוגן ותימחק עם סיום העבודה. סוגיה אתית ייחודית שעלתה במחקר זה היא שהמרואיינת סיפרה על מקרים של תלמידות ממשיות, ובהם מידע רגיש על משפחותיהן; הקפדנו לכלול בתמלול ובניתוח רק את הפרטים הדרושים להבנת הממצאים, ולהשמיט כל פרט העלול לאפשר זיהוי של נערה או משפחה.</w:t>
+        <w:t xml:space="preserve">המחקר נערך על פי כללי האתיקה המקובלים במחקר איכותני. המרואיינת קיבלה הסבר על מטרת המחקר ועל אופן השימוש בחומרים, וחתמה על טופס הסכמה מדעת שבו הובהר כי ההשתתפות היא רשות ולא חובה, וכי היא רשאית להפסיק בכל שלב. שמה של המרואיינת הוחלף בשם בדוי, ושמות התלמידות שהוזכרו בריאיון צוינו באות בלבד או שונו. שם היישוב ושם בית הספר הושמטו, ופרטים שעשויים לזהות את המרואיינת או את תלמידותיה טושטשו. ההקלטה נשמרה בקובץ מוגן ותימחק עם סיום העבודה. סוגיה אתית ייחודית שעלתה במחקר זה היא שהמרואיינת סיפרה על מקרים של תלמידות ממשיות, ובהם מידע רגיש על משפחותיהן; בתמלול ובניתוח נכללו רק הפרטים הדרושים להבנת הממצאים, ולהשמיט כל פרט העלול לאפשר זיהוי של נערה או משפחה.</w:t>
       </w:r>
     </w:p>
     <w:p>
@@ -3908,17 +3908,17 @@
     <w:p>
       <w:pPr>
         <w:bidi/>
-        <w:spacing w:after="160" w:before="40" w:line="276"/>
-        <w:ind w:left="850" w:right="850"/>
-        <w:jc w:val="both"/>
-      </w:pPr>
-      <w:r>
-        <w:rPr>
-          <w:rFonts w:ascii="David" w:cs="David" w:eastAsia="David" w:hAnsi="David"/>
-          <w:b w:val="false"/>
-          <w:bCs w:val="false"/>
-          <w:i/>
-          <w:iCs/>
+        <w:spacing w:after="160" w:before="40" w:line="360"/>
+        <w:ind w:right="709"/>
+        <w:jc w:val="both"/>
+      </w:pPr>
+      <w:r>
+        <w:rPr>
+          <w:rFonts w:ascii="David" w:cs="David" w:eastAsia="David" w:hAnsi="David"/>
+          <w:b w:val="false"/>
+          <w:bCs w:val="false"/>
+          <w:i w:val="false"/>
+          <w:iCs w:val="false"/>
           <w:sz w:val="24"/>
           <w:szCs w:val="24"/>
           <w:rtl/>
@@ -3929,17 +3929,17 @@
     <w:p>
       <w:pPr>
         <w:bidi/>
-        <w:spacing w:after="160" w:before="40" w:line="276"/>
-        <w:ind w:left="850" w:right="850"/>
-        <w:jc w:val="both"/>
-      </w:pPr>
-      <w:r>
-        <w:rPr>
-          <w:rFonts w:ascii="David" w:cs="David" w:eastAsia="David" w:hAnsi="David"/>
-          <w:b w:val="false"/>
-          <w:bCs w:val="false"/>
-          <w:i/>
-          <w:iCs/>
+        <w:spacing w:after="160" w:before="40" w:line="360"/>
+        <w:ind w:right="709"/>
+        <w:jc w:val="both"/>
+      </w:pPr>
+      <w:r>
+        <w:rPr>
+          <w:rFonts w:ascii="David" w:cs="David" w:eastAsia="David" w:hAnsi="David"/>
+          <w:b w:val="false"/>
+          <w:bCs w:val="false"/>
+          <w:i w:val="false"/>
+          <w:iCs w:val="false"/>
           <w:sz w:val="24"/>
           <w:szCs w:val="24"/>
           <w:rtl/>
@@ -3965,7 +3965,7 @@
           <w:szCs w:val="24"/>
           <w:rtl/>
         </w:rPr>
-        <w:t xml:space="preserve">מעניין לציין שחלק מן הסימנים שסמאח מתארת התגלו לה מתוך מקרה מסוים ולא מתוך הכשרה. כך, לאחר שתלמידה חשפה את מצבה בחיבור בנושא חופשי ולא בשיחה, החלה סמאח לתת "בכל שנה לפחות שני חיבורים בנושא חופשי" ולקרוא אותם "גם בשביל השפה וגם בשביל מה שמסתתר מאחוריה". כלי הזיהוי, אם כן, מתפתח מתוך הפרקטיקה ומצטבר עם הוותק, והוא ידע אישי שאינו מתועד ואינו מועבר למורות אחרות.</w:t>
+        <w:t xml:space="preserve">חלק מן הסימנים שסמאח מתארת התגלו לה מתוך מקרה מסוים ולא מתוך הכשרה. כך, לאחר שתלמידה חשפה את מצבה בחיבור בנושא חופשי ולא בשיחה, החלה סמאח לתת "בכל שנה לפחות שני חיבורים בנושא חופשי" ולקרוא אותם "גם בשביל השפה וגם בשביל מה שמסתתר מאחוריה". כלי הזיהוי, אם כן, מתפתח מתוך הפרקטיקה ומצטבר עם הוותק, והוא ידע אישי שאינו מתועד ואינו מועבר למורות אחרות.</w:t>
       </w:r>
     </w:p>
     <w:p>
@@ -4029,23 +4029,23 @@
           <w:szCs w:val="24"/>
           <w:rtl/>
         </w:rPr>
-        <w:t xml:space="preserve">עם זאת, הריאיון חושף גם את המחיר של גישה זו. סמאח מודה בגלוי שהצעד הראשון שלה אינו היועצת, ושהיא מעכבת את הדיווח הפורמלי עד שנוצר קשר. היא מודעת לכך שאין לה הצדקה מקצועית מסודרת להחלטה זו, ומנסחת את הדילמה במלוא חריפותה: דיווח מוקדם עשוי לאבד את הנערה ואת המידע יחד, ודיווח מאוחר עשוי לאבד זמן יקר.</w:t>
-      </w:r>
-    </w:p>
-    <w:p>
-      <w:pPr>
-        <w:bidi/>
-        <w:spacing w:after="160" w:before="40" w:line="276"/>
-        <w:ind w:left="850" w:right="850"/>
-        <w:jc w:val="both"/>
-      </w:pPr>
-      <w:r>
-        <w:rPr>
-          <w:rFonts w:ascii="David" w:cs="David" w:eastAsia="David" w:hAnsi="David"/>
-          <w:b w:val="false"/>
-          <w:bCs w:val="false"/>
-          <w:i/>
-          <w:iCs/>
+        <w:t xml:space="preserve">אבל הריאיון חושף גם את המחיר של גישה זו. סמאח מודה בגלוי שהצעד הראשון שלה אינו היועצת, ושהיא מעכבת את הדיווח הפורמלי עד שנוצר קשר. היא מודעת לכך שאין לה הצדקה מקצועית מסודרת להחלטה זו, ומנסחת את הדילמה במלוא חריפותה: דיווח מוקדם עשוי לאבד את הנערה ואת המידע יחד, ודיווח מאוחר עשוי לאבד זמן יקר.</w:t>
+      </w:r>
+    </w:p>
+    <w:p>
+      <w:pPr>
+        <w:bidi/>
+        <w:spacing w:after="160" w:before="40" w:line="360"/>
+        <w:ind w:right="709"/>
+        <w:jc w:val="both"/>
+      </w:pPr>
+      <w:r>
+        <w:rPr>
+          <w:rFonts w:ascii="David" w:cs="David" w:eastAsia="David" w:hAnsi="David"/>
+          <w:b w:val="false"/>
+          <w:bCs w:val="false"/>
+          <w:i w:val="false"/>
+          <w:iCs w:val="false"/>
           <w:sz w:val="24"/>
           <w:szCs w:val="24"/>
           <w:rtl/>
@@ -4071,7 +4071,7 @@
           <w:szCs w:val="24"/>
           <w:rtl/>
         </w:rPr>
-        <w:t xml:space="preserve">ראוי לשים לב לכך שהאסטרטגיה שסמאח מתארת בנויה משני רבדים של זמן. הרובד הראשון הוא ארוך-טווח ומניעתי: אמירת שלום בשם בכל בוקר, שיחות צדדיות שאינן קשורות למצוקה, נוכחות בשער בית הספר לפני הצלצול. פעולות אלה אינן מכוונות לנערה מסוימת, אלא בונות מראש את התשתית שתאפשר שיחה כאשר יהיה בכך צורך. הרובד השני הוא קצר-טווח ומכוון: כאשר זוהה שינוי, סמאח יוצרת "הזדמנות", כלומר סיטואציה שאינה מסומנת כשיחה. ההבחנה בין שני הרבדים חשובה משום שהיא מלמדת כי חלק גדול מן העבודה של הזיהוי נעשה עוד לפני שיש מה לזהות, ולכן הוא אינו נראה ואינו נמדד, ובלשונה של סמאח: "זה חלק מהעבודה שאף אחד לא רואה ולא מודד".</w:t>
+        <w:t xml:space="preserve">האסטרטגיה שסמאח מתארת בנויה משני רבדים של זמן. הרובד הראשון הוא ארוך טווח ומניעתי: אמירת שלום בשם בכל בוקר, שיחות צדדיות שאינן קשורות למצוקה, נוכחות בשער בית הספר לפני הצלצול. פעולות אלה אינן מכוונות לנערה מסוימת, אלא בונות מראש את התשתית שתאפשר שיחה כאשר יהיה בכך צורך. הרובד השני הוא קצר טווח ומכוון: כאשר זוהה שינוי, סמאח יוצרת "הזדמנות", כלומר סיטואציה שאינה מסומנת כשיחה. ההבחנה בין שני הרבדים חשובה משום שהיא מלמדת כי חלק גדול מן העבודה של הזיהוי נעשה עוד לפני שיש מה לזהות, ולכן הוא אינו נראה ואינו נמדד, ובלשונה של סמאח: "זה חלק מהעבודה שאף אחד לא רואה ולא מודד".</w:t>
       </w:r>
     </w:p>
     <w:p>
@@ -4141,17 +4141,17 @@
     <w:p>
       <w:pPr>
         <w:bidi/>
-        <w:spacing w:after="160" w:before="40" w:line="276"/>
-        <w:ind w:left="850" w:right="850"/>
-        <w:jc w:val="both"/>
-      </w:pPr>
-      <w:r>
-        <w:rPr>
-          <w:rFonts w:ascii="David" w:cs="David" w:eastAsia="David" w:hAnsi="David"/>
-          <w:b w:val="false"/>
-          <w:bCs w:val="false"/>
-          <w:i/>
-          <w:iCs/>
+        <w:spacing w:after="160" w:before="40" w:line="360"/>
+        <w:ind w:right="709"/>
+        <w:jc w:val="both"/>
+      </w:pPr>
+      <w:r>
+        <w:rPr>
+          <w:rFonts w:ascii="David" w:cs="David" w:eastAsia="David" w:hAnsi="David"/>
+          <w:b w:val="false"/>
+          <w:bCs w:val="false"/>
+          <w:i w:val="false"/>
+          <w:iCs w:val="false"/>
           <w:sz w:val="24"/>
           <w:szCs w:val="24"/>
           <w:rtl/>
@@ -4247,17 +4247,17 @@
     <w:p>
       <w:pPr>
         <w:bidi/>
-        <w:spacing w:after="160" w:before="40" w:line="276"/>
-        <w:ind w:left="850" w:right="850"/>
-        <w:jc w:val="both"/>
-      </w:pPr>
-      <w:r>
-        <w:rPr>
-          <w:rFonts w:ascii="David" w:cs="David" w:eastAsia="David" w:hAnsi="David"/>
-          <w:b w:val="false"/>
-          <w:bCs w:val="false"/>
-          <w:i/>
-          <w:iCs/>
+        <w:spacing w:after="160" w:before="40" w:line="360"/>
+        <w:ind w:right="709"/>
+        <w:jc w:val="both"/>
+      </w:pPr>
+      <w:r>
+        <w:rPr>
+          <w:rFonts w:ascii="David" w:cs="David" w:eastAsia="David" w:hAnsi="David"/>
+          <w:b w:val="false"/>
+          <w:bCs w:val="false"/>
+          <w:i w:val="false"/>
+          <w:iCs w:val="false"/>
           <w:sz w:val="24"/>
           <w:szCs w:val="24"/>
           <w:rtl/>
@@ -4353,17 +4353,17 @@
     <w:p>
       <w:pPr>
         <w:bidi/>
-        <w:spacing w:after="160" w:before="40" w:line="276"/>
-        <w:ind w:left="850" w:right="850"/>
-        <w:jc w:val="both"/>
-      </w:pPr>
-      <w:r>
-        <w:rPr>
-          <w:rFonts w:ascii="David" w:cs="David" w:eastAsia="David" w:hAnsi="David"/>
-          <w:b w:val="false"/>
-          <w:bCs w:val="false"/>
-          <w:i/>
-          <w:iCs/>
+        <w:spacing w:after="160" w:before="40" w:line="360"/>
+        <w:ind w:right="709"/>
+        <w:jc w:val="both"/>
+      </w:pPr>
+      <w:r>
+        <w:rPr>
+          <w:rFonts w:ascii="David" w:cs="David" w:eastAsia="David" w:hAnsi="David"/>
+          <w:b w:val="false"/>
+          <w:bCs w:val="false"/>
+          <w:i w:val="false"/>
+          <w:iCs w:val="false"/>
           <w:sz w:val="24"/>
           <w:szCs w:val="24"/>
           <w:rtl/>
@@ -4459,17 +4459,17 @@
     <w:p>
       <w:pPr>
         <w:bidi/>
-        <w:spacing w:after="160" w:before="40" w:line="276"/>
-        <w:ind w:left="850" w:right="850"/>
-        <w:jc w:val="both"/>
-      </w:pPr>
-      <w:r>
-        <w:rPr>
-          <w:rFonts w:ascii="David" w:cs="David" w:eastAsia="David" w:hAnsi="David"/>
-          <w:b w:val="false"/>
-          <w:bCs w:val="false"/>
-          <w:i/>
-          <w:iCs/>
+        <w:spacing w:after="160" w:before="40" w:line="360"/>
+        <w:ind w:right="709"/>
+        <w:jc w:val="both"/>
+      </w:pPr>
+      <w:r>
+        <w:rPr>
+          <w:rFonts w:ascii="David" w:cs="David" w:eastAsia="David" w:hAnsi="David"/>
+          <w:b w:val="false"/>
+          <w:bCs w:val="false"/>
+          <w:i w:val="false"/>
+          <w:iCs w:val="false"/>
           <w:sz w:val="24"/>
           <w:szCs w:val="24"/>
           <w:rtl/>
@@ -4651,7 +4651,7 @@
       </w:r>
       <w:r>
         <w:rPr>
-          <w:rFonts w:ascii="David" w:cs="David" w:eastAsia="David" w:hAnsi="David"/>
+          <w:rFonts w:ascii="Times New Roman" w:cs="Times New Roman" w:eastAsia="Times New Roman" w:hAnsi="Times New Roman"/>
           <w:b w:val="false"/>
           <w:bCs w:val="false"/>
           <w:i w:val="false"/>
@@ -4694,11 +4694,11 @@
           <w:szCs w:val="24"/>
           <w:rtl/>
         </w:rPr>
-        <w:t xml:space="preserve">בה בעת, הממצא מרחיב את הספרות בנקודה חשובה. מחקרים על זיהוי בעיות מופנמות (</w:t>
-      </w:r>
-      <w:r>
-        <w:rPr>
-          <w:rFonts w:ascii="David" w:cs="David" w:eastAsia="David" w:hAnsi="David"/>
+        <w:t xml:space="preserve">באותו זמן, הממצא מרחיב את הספרות בנקודה חשובה. מחקרים על זיהוי בעיות מופנמות (</w:t>
+      </w:r>
+      <w:r>
+        <w:rPr>
+          <w:rFonts w:ascii="Times New Roman" w:cs="Times New Roman" w:eastAsia="Times New Roman" w:hAnsi="Times New Roman"/>
           <w:b w:val="false"/>
           <w:bCs w:val="false"/>
           <w:i w:val="false"/>
@@ -4724,7 +4724,7 @@
       </w:r>
       <w:r>
         <w:rPr>
-          <w:rFonts w:ascii="David" w:cs="David" w:eastAsia="David" w:hAnsi="David"/>
+          <w:rFonts w:ascii="Times New Roman" w:cs="Times New Roman" w:eastAsia="Times New Roman" w:hAnsi="Times New Roman"/>
           <w:b w:val="false"/>
           <w:bCs w:val="false"/>
           <w:i w:val="false"/>
@@ -4789,11 +4789,11 @@
           <w:szCs w:val="24"/>
           <w:rtl/>
         </w:rPr>
-        <w:t xml:space="preserve">הממצא השני, שהקשר קודם לזיהוי ולא נובע ממנו, מתפרש היטב לאור תאוריית ההתקשרות כפי שהורחבה ליחסי מורה–תלמיד. פיאנטה (</w:t>
-      </w:r>
-      <w:r>
-        <w:rPr>
-          <w:rFonts w:ascii="David" w:cs="David" w:eastAsia="David" w:hAnsi="David"/>
+        <w:t xml:space="preserve">הממצא השני, שהקשר קודם לזיהוי ולא נובע ממנו, מתפרש היטב לאור תאוריית ההתקשרות כפי שהורחבה ליחסי מורה-תלמיד. פיאנטה (</w:t>
+      </w:r>
+      <w:r>
+        <w:rPr>
+          <w:rFonts w:ascii="Times New Roman" w:cs="Times New Roman" w:eastAsia="Times New Roman" w:hAnsi="Times New Roman"/>
           <w:b w:val="false"/>
           <w:bCs w:val="false"/>
           <w:i w:val="false"/>
@@ -4819,7 +4819,7 @@
       </w:r>
       <w:r>
         <w:rPr>
-          <w:rFonts w:ascii="David" w:cs="David" w:eastAsia="David" w:hAnsi="David"/>
+          <w:rFonts w:ascii="Times New Roman" w:cs="Times New Roman" w:eastAsia="Times New Roman" w:hAnsi="Times New Roman"/>
           <w:b w:val="false"/>
           <w:bCs w:val="false"/>
           <w:i w:val="false"/>
@@ -4845,7 +4845,7 @@
       </w:r>
       <w:r>
         <w:rPr>
-          <w:rFonts w:ascii="David" w:cs="David" w:eastAsia="David" w:hAnsi="David"/>
+          <w:rFonts w:ascii="Times New Roman" w:cs="Times New Roman" w:eastAsia="Times New Roman" w:hAnsi="Times New Roman"/>
           <w:b w:val="false"/>
           <w:bCs w:val="false"/>
           <w:i w:val="false"/>
@@ -4867,32 +4867,32 @@
           <w:szCs w:val="24"/>
           <w:rtl/>
         </w:rPr>
-        <w:t xml:space="preserve">), שמצאה שהשפעת יחסי מורה–תלמיד על מעורבות חזקה יותר דווקא בחטיבת הביניים ובתיכון ובקרב תלמידים בסיכון, מחזקת את הטענה שהשקעה בקשר עם נערות בגיל זה אינה עניין של אישיות המורה אלא של התערבות בעלת תוקף.</w:t>
-      </w:r>
-    </w:p>
-    <w:p>
-      <w:pPr>
-        <w:keepNext w:val="false"/>
-        <w:bidi/>
-        <w:spacing w:after="120" w:before="0" w:line="360"/>
-        <w:jc w:val="both"/>
-      </w:pPr>
-      <w:r>
-        <w:rPr>
-          <w:rFonts w:ascii="David" w:cs="David" w:eastAsia="David" w:hAnsi="David"/>
-          <w:b w:val="false"/>
-          <w:bCs w:val="false"/>
-          <w:i w:val="false"/>
-          <w:iCs w:val="false"/>
-          <w:sz w:val="24"/>
-          <w:szCs w:val="24"/>
-          <w:rtl/>
-        </w:rPr>
-        <w:t xml:space="preserve">עם זאת, הממצא מעלה גם סתירה עם הנוהל, שסמאח עצמה מודעת לה: הבניית הקשר גוזלת זמן ומעכבת דיווח. הספרות אינה מספקת לכך תשובה חד-משמעית. הפתרון שמתאר ריינקה ואחרים (</w:t>
-      </w:r>
-      <w:r>
-        <w:rPr>
-          <w:rFonts w:ascii="David" w:cs="David" w:eastAsia="David" w:hAnsi="David"/>
+        <w:t xml:space="preserve">), שמצאה שהשפעת יחסי מורה-תלמיד על מעורבות חזקה יותר דווקא בחטיבת הביניים ובתיכון ובקרב תלמידים בסיכון, מחזקת את הטענה שהשקעה בקשר עם נערות בגיל זה אינה עניין של אישיות המורה אלא של התערבות בעלת תוקף.</w:t>
+      </w:r>
+    </w:p>
+    <w:p>
+      <w:pPr>
+        <w:keepNext w:val="false"/>
+        <w:bidi/>
+        <w:spacing w:after="120" w:before="0" w:line="360"/>
+        <w:jc w:val="both"/>
+      </w:pPr>
+      <w:r>
+        <w:rPr>
+          <w:rFonts w:ascii="David" w:cs="David" w:eastAsia="David" w:hAnsi="David"/>
+          <w:b w:val="false"/>
+          <w:bCs w:val="false"/>
+          <w:i w:val="false"/>
+          <w:iCs w:val="false"/>
+          <w:sz w:val="24"/>
+          <w:szCs w:val="24"/>
+          <w:rtl/>
+        </w:rPr>
+        <w:t xml:space="preserve">אבל הממצא מעלה גם סתירה עם הנוהל, שסמאח עצמה מודעת לה: הבניית הקשר גוזלת זמן ומעכבת דיווח. הספרות אינה מספקת לכך תשובה חד-משמעית. הפתרון שמתאר ריינקה ואחרים (</w:t>
+      </w:r>
+      <w:r>
+        <w:rPr>
+          <w:rFonts w:ascii="Times New Roman" w:cs="Times New Roman" w:eastAsia="Times New Roman" w:hAnsi="Times New Roman"/>
           <w:b w:val="false"/>
           <w:bCs w:val="false"/>
           <w:i w:val="false"/>
@@ -4961,7 +4961,7 @@
       </w:r>
       <w:r>
         <w:rPr>
-          <w:rFonts w:ascii="David" w:cs="David" w:eastAsia="David" w:hAnsi="David"/>
+          <w:rFonts w:ascii="Times New Roman" w:cs="Times New Roman" w:eastAsia="Times New Roman" w:hAnsi="Times New Roman"/>
           <w:b w:val="false"/>
           <w:bCs w:val="false"/>
           <w:i w:val="false"/>
@@ -5004,11 +5004,11 @@
           <w:szCs w:val="24"/>
           <w:rtl/>
         </w:rPr>
-        <w:t xml:space="preserve">הפתרון של סמאח, התחייבות לשקיפות במקום הבטחת חיסיון, ראוי לתשומת לב מיוחדת משום שהוא מציע מודל מעשי לדילמה שהספרות מתארת אך אינה פותרת. רותי ואחרים (</w:t>
-      </w:r>
-      <w:r>
-        <w:rPr>
-          <w:rFonts w:ascii="David" w:cs="David" w:eastAsia="David" w:hAnsi="David"/>
+        <w:t xml:space="preserve">הפתרון של סמאח, התחייבות לשקיפות במקום הבטחת חיסיון, בולט משום שהוא מציע מודל מעשי לדילמה שהספרות מתארת אך אינה פותרת. רותי ואחרים (</w:t>
+      </w:r>
+      <w:r>
+        <w:rPr>
+          <w:rFonts w:ascii="Times New Roman" w:cs="Times New Roman" w:eastAsia="Times New Roman" w:hAnsi="Times New Roman"/>
           <w:b w:val="false"/>
           <w:bCs w:val="false"/>
           <w:i w:val="false"/>
@@ -5034,7 +5034,7 @@
       </w:r>
       <w:r>
         <w:rPr>
-          <w:rFonts w:ascii="David" w:cs="David" w:eastAsia="David" w:hAnsi="David"/>
+          <w:rFonts w:ascii="Times New Roman" w:cs="Times New Roman" w:eastAsia="Times New Roman" w:hAnsi="Times New Roman"/>
           <w:b w:val="false"/>
           <w:bCs w:val="false"/>
           <w:i w:val="false"/>
@@ -5060,7 +5060,7 @@
       </w:r>
       <w:r>
         <w:rPr>
-          <w:rFonts w:ascii="David" w:cs="David" w:eastAsia="David" w:hAnsi="David"/>
+          <w:rFonts w:ascii="Times New Roman" w:cs="Times New Roman" w:eastAsia="Times New Roman" w:hAnsi="Times New Roman"/>
           <w:b w:val="false"/>
           <w:bCs w:val="false"/>
           <w:i w:val="false"/>
@@ -5082,7 +5082,7 @@
           <w:szCs w:val="24"/>
           <w:rtl/>
         </w:rPr>
-        <w:t xml:space="preserve">) תיארו את המתח בין נכונות אישית לבין היעדר מבנה. סמאח ממחישה מה קורה כשמורה נאלצת לפתור מתח זה לבדה: היא מפתחת, מתוך מקרה כואב, כלל עבודה ("אני אומרת מראש מה אני יכולה ומה אני לא יכולה") שהוא בעל ערך מקצועי ממשי, אך נותר ידע פרטי. ממצא זה מציע שהכשרת מורים בתחום צריכה לכלול לא רק "מה לדווח ולמי" אלא גם "מה לומר לנערה על הדיווח".</w:t>
+        <w:t xml:space="preserve">) תיארו את המתח בין נכונות אישית לבין היעדר מבנה. סמאח ממחישה מה קורה כשמורה נאלצת לפתור מתח זה לבדה: היא מפתחת, מתוך מקרה כואב, כלל עבודה ("אני אומרת מראש מה אני יכולה ומה אני לא יכולה") שהוא בעל ערך מקצועי ממשי, אך נותר ידע פרטי. ממצא זה מציע שהכשרת מורים בתחום צריכה לכלול, מעבר ל"מה לדווח ולמי", גם "מה לומר לנערה על הדיווח".</w:t>
       </w:r>
     </w:p>
     <w:p>
@@ -5129,7 +5129,7 @@
       </w:r>
       <w:r>
         <w:rPr>
-          <w:rFonts w:ascii="David" w:cs="David" w:eastAsia="David" w:hAnsi="David"/>
+          <w:rFonts w:ascii="Times New Roman" w:cs="Times New Roman" w:eastAsia="Times New Roman" w:hAnsi="Times New Roman"/>
           <w:b w:val="false"/>
           <w:bCs w:val="false"/>
           <w:i w:val="false"/>
@@ -5176,7 +5176,7 @@
       </w:r>
       <w:r>
         <w:rPr>
-          <w:rFonts w:ascii="David" w:cs="David" w:eastAsia="David" w:hAnsi="David"/>
+          <w:rFonts w:ascii="Times New Roman" w:cs="Times New Roman" w:eastAsia="Times New Roman" w:hAnsi="Times New Roman"/>
           <w:b w:val="false"/>
           <w:bCs w:val="false"/>
           <w:i w:val="false"/>
@@ -5202,7 +5202,7 @@
       </w:r>
       <w:r>
         <w:rPr>
-          <w:rFonts w:ascii="David" w:cs="David" w:eastAsia="David" w:hAnsi="David"/>
+          <w:rFonts w:ascii="Times New Roman" w:cs="Times New Roman" w:eastAsia="Times New Roman" w:hAnsi="Times New Roman"/>
           <w:b w:val="false"/>
           <w:bCs w:val="false"/>
           <w:i w:val="false"/>
@@ -5271,7 +5271,7 @@
       </w:r>
       <w:r>
         <w:rPr>
-          <w:rFonts w:ascii="David" w:cs="David" w:eastAsia="David" w:hAnsi="David"/>
+          <w:rFonts w:ascii="Times New Roman" w:cs="Times New Roman" w:eastAsia="Times New Roman" w:hAnsi="Times New Roman"/>
           <w:b w:val="false"/>
           <w:bCs w:val="false"/>
           <w:i w:val="false"/>
@@ -5361,7 +5361,7 @@
       </w:r>
       <w:r>
         <w:rPr>
-          <w:rFonts w:ascii="David" w:cs="David" w:eastAsia="David" w:hAnsi="David"/>
+          <w:rFonts w:ascii="Times New Roman" w:cs="Times New Roman" w:eastAsia="Times New Roman" w:hAnsi="Times New Roman"/>
           <w:b w:val="false"/>
           <w:bCs w:val="false"/>
           <w:i w:val="false"/>
@@ -5387,7 +5387,7 @@
       </w:r>
       <w:r>
         <w:rPr>
-          <w:rFonts w:ascii="David" w:cs="David" w:eastAsia="David" w:hAnsi="David"/>
+          <w:rFonts w:ascii="Times New Roman" w:cs="Times New Roman" w:eastAsia="Times New Roman" w:hAnsi="Times New Roman"/>
           <w:b w:val="false"/>
           <w:bCs w:val="false"/>
           <w:i w:val="false"/>
@@ -5434,7 +5434,7 @@
       </w:r>
       <w:r>
         <w:rPr>
-          <w:rFonts w:ascii="David" w:cs="David" w:eastAsia="David" w:hAnsi="David"/>
+          <w:rFonts w:ascii="Times New Roman" w:cs="Times New Roman" w:eastAsia="Times New Roman" w:hAnsi="Times New Roman"/>
           <w:b w:val="false"/>
           <w:bCs w:val="false"/>
           <w:i w:val="false"/>
@@ -5460,7 +5460,7 @@
       </w:r>
       <w:r>
         <w:rPr>
-          <w:rFonts w:ascii="David" w:cs="David" w:eastAsia="David" w:hAnsi="David"/>
+          <w:rFonts w:ascii="Times New Roman" w:cs="Times New Roman" w:eastAsia="Times New Roman" w:hAnsi="Times New Roman"/>
           <w:b w:val="false"/>
           <w:bCs w:val="false"/>
           <w:i w:val="false"/>
@@ -5486,7 +5486,7 @@
       </w:r>
       <w:r>
         <w:rPr>
-          <w:rFonts w:ascii="David" w:cs="David" w:eastAsia="David" w:hAnsi="David"/>
+          <w:rFonts w:ascii="Times New Roman" w:cs="Times New Roman" w:eastAsia="Times New Roman" w:hAnsi="Times New Roman"/>
           <w:b w:val="false"/>
           <w:bCs w:val="false"/>
           <w:i w:val="false"/>
@@ -5551,11 +5551,11 @@
           <w:szCs w:val="24"/>
           <w:rtl/>
         </w:rPr>
-        <w:t xml:space="preserve">בהתאם להנחיות הכתיבה, יש לבחון גם באיזה אופן הממצאים פועלים לשימור הסדר החברתי ובאיזה אופן הם מערערים עליו. מצד אחד, הפרקטיקות שסמאח מתארת מערערות על הסדר הקיים: היא מסרבת לראות בנשירת נערה תוצאה טבעית של מסורת, מתעקשת להישאר בקשר עם נערות שהמערכת "סיימה" עמן, ורואה בשקטות, שהמערכת אינה רואה, את מוקד תפקידה. מצד אחר, הזהירות שהיא נוקטת מול המשפחות, הדיבור בשפה של הישגים ולא של סיכון והימנעות מהתערבות ישירה בהחלטות על נישואים, עשויות להתפרש כשימור של הסדר: המורה פועלת בתוך כללי המשחק הקהילתיים ואינה מאתגרת אותם בגלוי. ואולם ניתוח מעמיק יותר מלמד שהזהירות הזו היא עצמה אסטרטגיה של ערעור מבפנים: כפי שמציעה אבו-רביעה-קווידר (</w:t>
-      </w:r>
-      <w:r>
-        <w:rPr>
-          <w:rFonts w:ascii="David" w:cs="David" w:eastAsia="David" w:hAnsi="David"/>
+        <w:t xml:space="preserve">בהתאם להנחיות הכתיבה, יש לבחון גם באיזה אופן הממצאים פועלים לשימור הסדר החברתי ובאיזה אופן הם מערערים עליו. מצד אחד, הפרקטיקות שסמאח מתארת מערערות על הסדר הקיים: היא מסרבת לראות בנשירת נערה תוצאה טבעית של מסורת, מתעקשת להישאר בקשר עם נערות שהמערכת "סיימה" עמן, ורואה בשקטות, שהמערכת אינה רואה, את מוקד תפקידה. מצד אחר, הזהירות שהיא נוקטת מול המשפחות, הדיבור בשפה של הישגים ולא של סיכון והימנעות מהתערבות ישירה בהחלטות על נישואים, עשויות להתפרש כשימור של הסדר: המורה פועלת בתוך כללי המשחק הקהילתיים ואינה מאתגרת אותם בגלוי. אבל ניתוח מעמיק יותר מלמד שהזהירות הזו היא עצמה אסטרטגיה של ערעור מבפנים: כפי שמציעה אבו-רביעה-קווידר (</w:t>
+      </w:r>
+      <w:r>
+        <w:rPr>
+          <w:rFonts w:ascii="Times New Roman" w:cs="Times New Roman" w:eastAsia="Times New Roman" w:hAnsi="Times New Roman"/>
           <w:b w:val="false"/>
           <w:bCs w:val="false"/>
           <w:i w:val="false"/>
@@ -5577,7 +5577,7 @@
           <w:szCs w:val="24"/>
           <w:rtl/>
         </w:rPr>
-        <w:t xml:space="preserve">), שינוי בחברה מסורתית אינו מושג בכפייה מבחוץ אלא בשילוב ערכי הקהילה בתוך תהליך השינוי, וסמאח, בת המקום, עושה בדיוק זאת כאשר היא מגייסת דוד, מדברת עם אב על תעודת בגרות ומקפידה שהנערה תדע מכל צעד. בה בעת, יש להכיר בכך שהפרקטיקה הזאת, שנשענת על מורה יחידה, משמרת סדר אחר: סדר שבו האחריות לרווחת הנערות מוטלת על נשים בעבודה בלתי נראית ובלתי מתוגמלת, "שאף אחד לא רואה ולא מודד".</w:t>
+        <w:t xml:space="preserve">), שינוי בחברה מסורתית אינו מושג בכפייה מבחוץ אלא בשילוב ערכי הקהילה בתוך תהליך השינוי, וסמאח, בת המקום, עושה בדיוק זאת כאשר היא מגייסת דוד, מדברת עם אב על תעודת בגרות ומקפידה שהנערה תדע מכל צעד. באותו זמן, יש להכיר בכך שהפרקטיקה הזאת, שנשענת על מורה יחידה, משמרת סדר אחר: סדר שבו האחריות לרווחת הנערות מוטלת על נשים בעבודה בלתי נראית ובלתי מתוגמלת, "שאף אחד לא רואה ולא מודד".</w:t>
       </w:r>
     </w:p>
     <w:p>
@@ -5730,7 +5730,7 @@
       </w:r>
       <w:r>
         <w:rPr>
-          <w:rFonts w:ascii="David" w:cs="David" w:eastAsia="David" w:hAnsi="David"/>
+          <w:rFonts w:ascii="Times New Roman" w:cs="Times New Roman" w:eastAsia="Times New Roman" w:hAnsi="Times New Roman"/>
           <w:b w:val="false"/>
           <w:bCs w:val="false"/>
           <w:i w:val="false"/>
@@ -5794,7 +5794,7 @@
           <w:szCs w:val="24"/>
           <w:rtl/>
         </w:rPr>
-        <w:t xml:space="preserve">3. נוהל בית ספרי המגדיר לא רק את נמען הדיווח אלא גם מה מתרחש לאחריו: מי מלווה את המחנכת, באיזה לוח זמנים היא מקבלת עדכון, ומה נאמר לתלמידה על התהליך. הנוהל צריך לכלול הנחיה בדבר שקיפות כלפי התלמידה, ברוח הפתרון שפיתחה המרואיינת.</w:t>
+        <w:t xml:space="preserve">3. נוהל בית ספרי המגדיר את נמען הדיווח וגם מה מתרחש לאחריו: מי מלווה את המחנכת, באיזה לוח זמנים היא מקבלת עדכון, ומה נאמר לתלמידה על התהליך. הנוהל צריך לכלול הנחיה בדבר שקיפות כלפי התלמידה, ברוח הפתרון שפיתחה המרואיינת.</w:t>
       </w:r>
     </w:p>
     <w:p>
@@ -5861,7 +5861,7 @@
       </w:r>
       <w:r>
         <w:rPr>
-          <w:rFonts w:ascii="David" w:cs="David" w:eastAsia="David" w:hAnsi="David"/>
+          <w:rFonts w:ascii="Times New Roman" w:cs="Times New Roman" w:eastAsia="Times New Roman" w:hAnsi="Times New Roman"/>
           <w:b w:val="false"/>
           <w:bCs w:val="false"/>
           <w:i w:val="false"/>
@@ -5887,7 +5887,7 @@
       </w:r>
       <w:r>
         <w:rPr>
-          <w:rFonts w:ascii="David" w:cs="David" w:eastAsia="David" w:hAnsi="David"/>
+          <w:rFonts w:ascii="Times New Roman" w:cs="Times New Roman" w:eastAsia="Times New Roman" w:hAnsi="Times New Roman"/>
           <w:b w:val="false"/>
           <w:bCs w:val="false"/>
           <w:i w:val="false"/>
@@ -6038,7 +6038,7 @@
           <w:szCs w:val="24"/>
           <w:rtl/>
         </w:rPr>
-        <w:t xml:space="preserve">מן המחקר עולים כמה כיוונים להמשך. ראשית, יש מקום למחקר רחב יותר שיכלול מחנכות ממספר יישובים ובתי ספר, ובהן מורות שאינן בנות היישוב שבו הן מלמדות, כדי לבחון את ההשפעה של השייכות הקהילתית על הזיהוי ועל תפיסת התפקיד. שנית, מומלץ לבחון את נקודת המבט של מורות מקצועיות, ולא רק של מחנכות, ולשאול מה קורה למידע שמורה מקצועית מבחינה בו. שלישית, ראוי לבחון את הצד השני של הקשר, כלומר את נקודת המבט של הנערות עצמן: מה גורם לנערה לספר למורה מסוימת ולא לאחרת, וכיצד היא חווה את הדיווח. רביעית, מחקר השוואתי בין מחנכות בחברה הערבית ובחברה היהודית, או בין מחנכות בנות למחנכי בנים, יוכל לבודד את ההיבטים התרבותיים והמגדריים של התהליך. חמישית, מחקר הערכה של תוכנית התערבות המבוססת על ההמלצות שלעיל, ובמיוחד קבוצת עמיתים מונחית למחנכות, יוכל לבחון אם ליווי מקצועי מצמצם את הפחד הכפול ואת השחיקה שתוארו בריאיון.</w:t>
+        <w:t xml:space="preserve">מן המחקר עולים כמה כיוונים להמשך. ראשית, יש מקום למחקר רחב יותר שיכלול מחנכות ממספר יישובים ובתי ספר, ובהן מורות שאינן בנות היישוב שבו הן מלמדות, כדי לבחון את ההשפעה של השייכות הקהילתית על הזיהוי ועל תפיסת התפקיד. שנית, מומלץ לבחון את נקודת המבט של מורות מקצועיות, ולא רק של מחנכות, ולשאול מה קורה למידע שמורה מקצועית מבחינה בו. שלישית, יש מקום לבחון את הצד השני של הקשר, כלומר את נקודת המבט של הנערות עצמן: מה גורם לנערה לספר למורה מסוימת ולא לאחרת, וכיצד היא חווה את הדיווח. רביעית, מחקר השוואתי בין מחנכות בחברה הערבית ובחברה היהודית, או בין מחנכות בנות למחנכי בנים, יוכל לבודד את ההיבטים התרבותיים והמגדריים של התהליך. חמישית, מחקר הערכה של תוכנית התערבות המבוססת על ההמלצות שלעיל, ובמיוחד קבוצת עמיתים מונחית למחנכות, יוכל לבחון אם ליווי מקצועי מצמצם את הפחד הכפול ואת השחיקה שתוארו בריאיון.</w:t>
       </w:r>
     </w:p>
     <w:p>
@@ -6145,28 +6145,28 @@
           <w:shd w:fill="FFFF00" w:color="auto" w:val="clear"/>
           <w:rtl/>
         </w:rPr>
-        <w:t xml:space="preserve">[להתאמה אישית: מומלץ להוסיף כאן שתיים–שלוש שורות על החוויה האישית של כל אחת מכן: מה הפתיע אתכן, מה היה קשה לשמוע, ואיך השתנתה תפיסתכן את תפקיד המורה בעקבות העבודה. יש למחוק הערה זו לאחר ההשלמה.]</w:t>
-      </w:r>
-    </w:p>
-    <w:p>
-      <w:pPr>
-        <w:keepNext w:val="false"/>
-        <w:bidi/>
-        <w:spacing w:after="120" w:before="0" w:line="360"/>
-        <w:jc w:val="both"/>
-      </w:pPr>
-      <w:r>
-        <w:rPr>
-          <w:rFonts w:ascii="David" w:cs="David" w:eastAsia="David" w:hAnsi="David"/>
-          <w:b w:val="false"/>
-          <w:bCs w:val="false"/>
-          <w:i w:val="false"/>
-          <w:iCs w:val="false"/>
-          <w:sz w:val="24"/>
-          <w:szCs w:val="24"/>
-          <w:rtl/>
-        </w:rPr>
-        <w:t xml:space="preserve">אנו מסיימות את העבודה עם הערכה עמוקה יותר לעבודה הבלתי נראית של מחנכות, ועם הבנה שהשאלה "כיצד מורות מזהות נערות בסיכון" אינה רק שאלה מחקרית אלא גם שאלה של מדיניות: מה המערכת עושה כדי שיהיה למורות מה לראות, זמן לראות, ומישהו לפנות אליו כשראו.</w:t>
+        <w:t xml:space="preserve">[להתאמה אישית: מומלץ להוסיף כאן שתיים או שלוש שורות על החוויה האישית של כל אחת מכן: מה הפתיע אתכן, מה היה קשה לשמוע, ואיך השתנתה תפיסתכן את תפקיד המורה בעקבות העבודה. יש למחוק הערה זו לאחר ההשלמה.]</w:t>
+      </w:r>
+    </w:p>
+    <w:p>
+      <w:pPr>
+        <w:keepNext w:val="false"/>
+        <w:bidi/>
+        <w:spacing w:after="120" w:before="0" w:line="360"/>
+        <w:jc w:val="both"/>
+      </w:pPr>
+      <w:r>
+        <w:rPr>
+          <w:rFonts w:ascii="David" w:cs="David" w:eastAsia="David" w:hAnsi="David"/>
+          <w:b w:val="false"/>
+          <w:bCs w:val="false"/>
+          <w:i w:val="false"/>
+          <w:iCs w:val="false"/>
+          <w:sz w:val="24"/>
+          <w:szCs w:val="24"/>
+          <w:rtl/>
+        </w:rPr>
+        <w:t xml:space="preserve">אנו מסיימות את העבודה עם הערכה עמוקה יותר לעבודה הבלתי נראית של מחנכות, ועם הבנה שהשאלה "כיצד מורות מזהות נערות בסיכון" היא שאלה מחקרית וגם שאלה של מדיניות: מה המערכת עושה כדי שיהיה למורות מה לראות, זמן לראות, ומישהו לפנות אליו כשראו.</w:t>
       </w:r>
     </w:p>
     <w:p>
@@ -6232,35 +6232,14 @@
           <w:szCs w:val="32"/>
           <w:rtl/>
         </w:rPr>
-        <w:t xml:space="preserve">ביבליוגרפיה</w:t>
-      </w:r>
-    </w:p>
-    <w:p>
-      <w:pPr>
-        <w:keepNext w:val="false"/>
-        <w:bidi/>
-        <w:spacing w:after="120" w:before="0" w:line="360"/>
-        <w:jc w:val="right"/>
-      </w:pPr>
-      <w:r>
-        <w:rPr>
-          <w:rFonts w:ascii="David" w:cs="David" w:eastAsia="David" w:hAnsi="David"/>
-          <w:b/>
-          <w:bCs/>
-          <w:i w:val="false"/>
-          <w:iCs w:val="false"/>
-          <w:sz w:val="24"/>
-          <w:szCs w:val="24"/>
-          <w:rtl/>
-        </w:rPr>
-        <w:t xml:space="preserve">מקורות בעברית</w:t>
+        <w:t xml:space="preserve">רשימת מקורות</w:t>
       </w:r>
     </w:p>
     <w:p>
       <w:pPr>
         <w:bidi/>
         <w:spacing w:after="120" w:line="360"/>
-        <w:ind w:left="720" w:hanging="720"/>
+        <w:ind w:left="709" w:hanging="709"/>
         <w:jc w:val="left"/>
       </w:pPr>
       <w:r>
@@ -6274,14 +6253,40 @@
           <w:szCs w:val="24"/>
           <w:rtl/>
         </w:rPr>
-        <w:t xml:space="preserve">אבו-עסבה, ח' (2007). החינוך הערבי בישראל: דילמות של מיעוט לאומי. ירושלים: מכון פלורסהיימר למחקרי מדיניות.</w:t>
+        <w:t xml:space="preserve">אבו-עסבה, ח' (2007). </w:t>
+      </w:r>
+      <w:r>
+        <w:rPr>
+          <w:rFonts w:ascii="David" w:cs="David" w:eastAsia="David" w:hAnsi="David"/>
+          <w:b w:val="false"/>
+          <w:bCs w:val="false"/>
+          <w:i/>
+          <w:iCs/>
+          <w:sz w:val="24"/>
+          <w:szCs w:val="24"/>
+          <w:rtl/>
+        </w:rPr>
+        <w:t xml:space="preserve">החינוך הערבי בישראל: דילמות של מיעוט לאומי</w:t>
+      </w:r>
+      <w:r>
+        <w:rPr>
+          <w:rFonts w:ascii="David" w:cs="David" w:eastAsia="David" w:hAnsi="David"/>
+          <w:b w:val="false"/>
+          <w:bCs w:val="false"/>
+          <w:i w:val="false"/>
+          <w:iCs w:val="false"/>
+          <w:sz w:val="24"/>
+          <w:szCs w:val="24"/>
+          <w:rtl/>
+        </w:rPr>
+        <w:t xml:space="preserve">. מכון פלורסהיימר למחקרי מדיניות.</w:t>
       </w:r>
     </w:p>
     <w:p>
       <w:pPr>
         <w:bidi/>
         <w:spacing w:after="120" w:line="360"/>
-        <w:ind w:left="720" w:hanging="720"/>
+        <w:ind w:left="709" w:hanging="709"/>
         <w:jc w:val="left"/>
       </w:pPr>
       <w:r>
@@ -6295,14 +6300,40 @@
           <w:szCs w:val="24"/>
           <w:rtl/>
         </w:rPr>
-        <w:t xml:space="preserve">בן רבי, ד', ברוך-קוברסקי, ר', נבות, מ' וקונסטנטינוב, ו' (2014). הנשירה הסמויה בישראל: בחינה מחודשת של ניתוק בקרב תלמידי בתי ספר (דמ-14-686). ירושלים: מאיירס-ג'וינט-מכון ברוקדייל.</w:t>
+        <w:t xml:space="preserve">בן רבי, ד', ברוך-קוברסקי, ר', נבות, מ', וקונסטנטינוב, ו' (2014). </w:t>
+      </w:r>
+      <w:r>
+        <w:rPr>
+          <w:rFonts w:ascii="David" w:cs="David" w:eastAsia="David" w:hAnsi="David"/>
+          <w:b w:val="false"/>
+          <w:bCs w:val="false"/>
+          <w:i/>
+          <w:iCs/>
+          <w:sz w:val="24"/>
+          <w:szCs w:val="24"/>
+          <w:rtl/>
+        </w:rPr>
+        <w:t xml:space="preserve">הנשירה הסמויה בישראל: בחינה מחודשת של ניתוק בקרב תלמידי בתי ספר</w:t>
+      </w:r>
+      <w:r>
+        <w:rPr>
+          <w:rFonts w:ascii="David" w:cs="David" w:eastAsia="David" w:hAnsi="David"/>
+          <w:b w:val="false"/>
+          <w:bCs w:val="false"/>
+          <w:i w:val="false"/>
+          <w:iCs w:val="false"/>
+          <w:sz w:val="24"/>
+          <w:szCs w:val="24"/>
+          <w:rtl/>
+        </w:rPr>
+        <w:t xml:space="preserve"> (דמ-14-686). מאיירס-ג'וינט-מכון ברוקדייל.</w:t>
       </w:r>
     </w:p>
     <w:p>
       <w:pPr>
         <w:bidi/>
         <w:spacing w:after="120" w:line="360"/>
-        <w:ind w:left="720" w:hanging="720"/>
+        <w:ind w:left="709" w:hanging="709"/>
         <w:jc w:val="left"/>
       </w:pPr>
       <w:r>
@@ -6316,14 +6347,40 @@
           <w:szCs w:val="24"/>
           <w:rtl/>
         </w:rPr>
-        <w:t xml:space="preserve">ברוך-קוברסקי, ר', גלעד, ע', זוהר, ל', קונסטנטינוב, ו', בן סימון, ב', אייזיק, ע' ומורן-גלעד, ל' (2022). נשירה בקרב תלמידים בחינוך הבדואי בנגב (דמ-22-902). ירושלים: מכון מאיירס-ג'וינט-ברוקדייל.</w:t>
+        <w:t xml:space="preserve">ברוך-קוברסקי, ר', גלעד, ע', זוהר, ל', קונסטנטינוב, ו', בן סימון, ב', אייזיק, ע', ומורן-גלעד, ל' (2022). </w:t>
+      </w:r>
+      <w:r>
+        <w:rPr>
+          <w:rFonts w:ascii="David" w:cs="David" w:eastAsia="David" w:hAnsi="David"/>
+          <w:b w:val="false"/>
+          <w:bCs w:val="false"/>
+          <w:i/>
+          <w:iCs/>
+          <w:sz w:val="24"/>
+          <w:szCs w:val="24"/>
+          <w:rtl/>
+        </w:rPr>
+        <w:t xml:space="preserve">נשירה בקרב תלמידים בחינוך הבדואי בנגב</w:t>
+      </w:r>
+      <w:r>
+        <w:rPr>
+          <w:rFonts w:ascii="David" w:cs="David" w:eastAsia="David" w:hAnsi="David"/>
+          <w:b w:val="false"/>
+          <w:bCs w:val="false"/>
+          <w:i w:val="false"/>
+          <w:iCs w:val="false"/>
+          <w:sz w:val="24"/>
+          <w:szCs w:val="24"/>
+          <w:rtl/>
+        </w:rPr>
+        <w:t xml:space="preserve"> (דמ-22-902). מכון מאיירס-ג'וינט-ברוקדייל.</w:t>
       </w:r>
     </w:p>
     <w:p>
       <w:pPr>
         <w:bidi/>
         <w:spacing w:after="120" w:line="360"/>
-        <w:ind w:left="720" w:hanging="720"/>
+        <w:ind w:left="709" w:hanging="709"/>
         <w:jc w:val="left"/>
       </w:pPr>
       <w:r>
@@ -6337,14 +6394,40 @@
           <w:szCs w:val="24"/>
           <w:rtl/>
         </w:rPr>
-        <w:t xml:space="preserve">גרופר, ע' ורומי, ש' (עורכים) (2014). ילדים ומתבגרים במצבי סיכון בישראל: כרך א – תמונת מצב של התחום ותוכני ליבה. תל אביב: מכון מופ"ת.</w:t>
+        <w:t xml:space="preserve">גרופר, ע', ורומי, ש' (עורכים). (2014). </w:t>
+      </w:r>
+      <w:r>
+        <w:rPr>
+          <w:rFonts w:ascii="David" w:cs="David" w:eastAsia="David" w:hAnsi="David"/>
+          <w:b w:val="false"/>
+          <w:bCs w:val="false"/>
+          <w:i/>
+          <w:iCs/>
+          <w:sz w:val="24"/>
+          <w:szCs w:val="24"/>
+          <w:rtl/>
+        </w:rPr>
+        <w:t xml:space="preserve">ילדים ומתבגרים במצבי סיכון בישראל: כרך א. תמונת מצב של התחום ותוכני ליבה</w:t>
+      </w:r>
+      <w:r>
+        <w:rPr>
+          <w:rFonts w:ascii="David" w:cs="David" w:eastAsia="David" w:hAnsi="David"/>
+          <w:b w:val="false"/>
+          <w:bCs w:val="false"/>
+          <w:i w:val="false"/>
+          <w:iCs w:val="false"/>
+          <w:sz w:val="24"/>
+          <w:szCs w:val="24"/>
+          <w:rtl/>
+        </w:rPr>
+        <w:t xml:space="preserve">. מכון מופ"ת.</w:t>
       </w:r>
     </w:p>
     <w:p>
       <w:pPr>
         <w:bidi/>
         <w:spacing w:after="120" w:line="360"/>
-        <w:ind w:left="720" w:hanging="720"/>
+        <w:ind w:left="709" w:hanging="709"/>
         <w:jc w:val="left"/>
       </w:pPr>
       <w:r>
@@ -6358,14 +6441,40 @@
           <w:szCs w:val="24"/>
           <w:rtl/>
         </w:rPr>
-        <w:t xml:space="preserve">כהן-נבות, מ', אלנבוגן-פרנקוביץ', ש' וריינפלד, ת' (2001). הנשירה הגלויה והסמויה בקרב בני נוער. ירושלים: מאיירס-ג'וינט-מכון ברוקדייל ומרכז המחקר והמידע של הכנסת.</w:t>
+        <w:t xml:space="preserve">כהן-נבות, מ', אלנבוגן-פרנקוביץ', ש', וריינפלד, ת' (2001). </w:t>
+      </w:r>
+      <w:r>
+        <w:rPr>
+          <w:rFonts w:ascii="David" w:cs="David" w:eastAsia="David" w:hAnsi="David"/>
+          <w:b w:val="false"/>
+          <w:bCs w:val="false"/>
+          <w:i/>
+          <w:iCs/>
+          <w:sz w:val="24"/>
+          <w:szCs w:val="24"/>
+          <w:rtl/>
+        </w:rPr>
+        <w:t xml:space="preserve">הנשירה הגלויה והסמויה בקרב בני נוער</w:t>
+      </w:r>
+      <w:r>
+        <w:rPr>
+          <w:rFonts w:ascii="David" w:cs="David" w:eastAsia="David" w:hAnsi="David"/>
+          <w:b w:val="false"/>
+          <w:bCs w:val="false"/>
+          <w:i w:val="false"/>
+          <w:iCs w:val="false"/>
+          <w:sz w:val="24"/>
+          <w:szCs w:val="24"/>
+          <w:rtl/>
+        </w:rPr>
+        <w:t xml:space="preserve">. מאיירס-ג'וינט-מכון ברוקדייל ומרכז המחקר והמידע של הכנסת.</w:t>
       </w:r>
     </w:p>
     <w:p>
       <w:pPr>
         <w:bidi/>
         <w:spacing w:after="120" w:line="360"/>
-        <w:ind w:left="720" w:hanging="720"/>
+        <w:ind w:left="709" w:hanging="709"/>
         <w:jc w:val="left"/>
       </w:pPr>
       <w:r>
@@ -6379,14 +6488,66 @@
           <w:szCs w:val="24"/>
           <w:rtl/>
         </w:rPr>
-        <w:t xml:space="preserve">להב, ח' (2000). נוער בסיכון: התופעה בפרספקטיבה. מניתוק לשילוב, 10.</w:t>
+        <w:t xml:space="preserve">להב, ח' (2000). נוער בסיכון: התופעה בפרספקטיבה. </w:t>
+      </w:r>
+      <w:r>
+        <w:rPr>
+          <w:rFonts w:ascii="David" w:cs="David" w:eastAsia="David" w:hAnsi="David"/>
+          <w:b w:val="false"/>
+          <w:bCs w:val="false"/>
+          <w:i/>
+          <w:iCs/>
+          <w:sz w:val="24"/>
+          <w:szCs w:val="24"/>
+          <w:rtl/>
+        </w:rPr>
+        <w:t xml:space="preserve">מניתוק לשילוב</w:t>
+      </w:r>
+      <w:r>
+        <w:rPr>
+          <w:rFonts w:ascii="David" w:cs="David" w:eastAsia="David" w:hAnsi="David"/>
+          <w:b w:val="false"/>
+          <w:bCs w:val="false"/>
+          <w:i w:val="false"/>
+          <w:iCs w:val="false"/>
+          <w:sz w:val="24"/>
+          <w:szCs w:val="24"/>
+          <w:rtl/>
+        </w:rPr>
+        <w:t xml:space="preserve">, </w:t>
+      </w:r>
+      <w:r>
+        <w:rPr>
+          <w:rFonts w:ascii="David" w:cs="David" w:eastAsia="David" w:hAnsi="David"/>
+          <w:b w:val="false"/>
+          <w:bCs w:val="false"/>
+          <w:i/>
+          <w:iCs/>
+          <w:sz w:val="24"/>
+          <w:szCs w:val="24"/>
+          <w:rtl/>
+        </w:rPr>
+        <w:t xml:space="preserve">10</w:t>
+      </w:r>
+      <w:r>
+        <w:rPr>
+          <w:rFonts w:ascii="David" w:cs="David" w:eastAsia="David" w:hAnsi="David"/>
+          <w:b w:val="false"/>
+          <w:bCs w:val="false"/>
+          <w:i w:val="false"/>
+          <w:iCs w:val="false"/>
+          <w:sz w:val="24"/>
+          <w:szCs w:val="24"/>
+          <w:rtl/>
+        </w:rPr>
+        <w:t xml:space="preserve">.</w:t>
       </w:r>
     </w:p>
     <w:p>
       <w:pPr>
         <w:bidi/>
         <w:spacing w:after="120" w:line="360"/>
-        <w:ind w:left="720" w:hanging="720"/>
+        <w:ind w:left="709" w:hanging="709"/>
         <w:jc w:val="left"/>
       </w:pPr>
       <w:r>
@@ -6400,14 +6561,40 @@
           <w:szCs w:val="24"/>
           <w:rtl/>
         </w:rPr>
-        <w:t xml:space="preserve">סבו-לאל, ר' (2017). ילדים ובני נוער בסיכון בישראל (דמ-17-748). ירושלים: מכון מאיירס-ג'וינט-ברוקדייל.</w:t>
+        <w:t xml:space="preserve">סבו-לאל, ר' (2017). </w:t>
+      </w:r>
+      <w:r>
+        <w:rPr>
+          <w:rFonts w:ascii="David" w:cs="David" w:eastAsia="David" w:hAnsi="David"/>
+          <w:b w:val="false"/>
+          <w:bCs w:val="false"/>
+          <w:i/>
+          <w:iCs/>
+          <w:sz w:val="24"/>
+          <w:szCs w:val="24"/>
+          <w:rtl/>
+        </w:rPr>
+        <w:t xml:space="preserve">ילדים ובני נוער בסיכון בישראל</w:t>
+      </w:r>
+      <w:r>
+        <w:rPr>
+          <w:rFonts w:ascii="David" w:cs="David" w:eastAsia="David" w:hAnsi="David"/>
+          <w:b w:val="false"/>
+          <w:bCs w:val="false"/>
+          <w:i w:val="false"/>
+          <w:iCs w:val="false"/>
+          <w:sz w:val="24"/>
+          <w:szCs w:val="24"/>
+          <w:rtl/>
+        </w:rPr>
+        <w:t xml:space="preserve"> (דמ-17-748). מכון מאיירס-ג'וינט-ברוקדייל.</w:t>
       </w:r>
     </w:p>
     <w:p>
       <w:pPr>
         <w:bidi/>
         <w:spacing w:after="120" w:line="360"/>
-        <w:ind w:left="720" w:hanging="720"/>
+        <w:ind w:left="709" w:hanging="709"/>
         <w:jc w:val="left"/>
       </w:pPr>
       <w:r>
@@ -6421,14 +6608,40 @@
           <w:szCs w:val="24"/>
           <w:rtl/>
         </w:rPr>
-        <w:t xml:space="preserve">סבו-לאל, ר' וחסין, ט' (2011). מצבי סיכון בקרב ילדים ובני נוער: איתור ומיפוי במסגרת התכנית הלאומית לילדים ולנוער בסיכון (דמ-11-589). ירושלים: מאיירס-ג'וינט-מכון ברוקדייל.</w:t>
+        <w:t xml:space="preserve">סבו-לאל, ר', וחסין, ט' (2011). </w:t>
+      </w:r>
+      <w:r>
+        <w:rPr>
+          <w:rFonts w:ascii="David" w:cs="David" w:eastAsia="David" w:hAnsi="David"/>
+          <w:b w:val="false"/>
+          <w:bCs w:val="false"/>
+          <w:i/>
+          <w:iCs/>
+          <w:sz w:val="24"/>
+          <w:szCs w:val="24"/>
+          <w:rtl/>
+        </w:rPr>
+        <w:t xml:space="preserve">מצבי סיכון בקרב ילדים ובני נוער: איתור ומיפוי במסגרת התכנית הלאומית לילדים ולנוער בסיכון</w:t>
+      </w:r>
+      <w:r>
+        <w:rPr>
+          <w:rFonts w:ascii="David" w:cs="David" w:eastAsia="David" w:hAnsi="David"/>
+          <w:b w:val="false"/>
+          <w:bCs w:val="false"/>
+          <w:i w:val="false"/>
+          <w:iCs w:val="false"/>
+          <w:sz w:val="24"/>
+          <w:szCs w:val="24"/>
+          <w:rtl/>
+        </w:rPr>
+        <w:t xml:space="preserve"> (דמ-11-589). מאיירס-ג'וינט-מכון ברוקדייל.</w:t>
       </w:r>
     </w:p>
     <w:p>
       <w:pPr>
         <w:bidi/>
         <w:spacing w:after="120" w:line="360"/>
-        <w:ind w:left="720" w:hanging="720"/>
+        <w:ind w:left="709" w:hanging="709"/>
         <w:jc w:val="left"/>
       </w:pPr>
       <w:r>
@@ -6442,14 +6655,40 @@
           <w:szCs w:val="24"/>
           <w:rtl/>
         </w:rPr>
-        <w:t xml:space="preserve">צבר בן-יהושע, נ' (עורכת) (2016). מסורות וזרמים במחקר האיכותני: תפיסות, אסטרטגיות וכלים מתקדמים. תל אביב: מכון מופ"ת.</w:t>
+        <w:t xml:space="preserve">סלע-שיוביץ, ר' (2026). </w:t>
+      </w:r>
+      <w:r>
+        <w:rPr>
+          <w:rFonts w:ascii="David" w:cs="David" w:eastAsia="David" w:hAnsi="David"/>
+          <w:b w:val="false"/>
+          <w:bCs w:val="false"/>
+          <w:i/>
+          <w:iCs/>
+          <w:sz w:val="24"/>
+          <w:szCs w:val="24"/>
+          <w:rtl/>
+        </w:rPr>
+        <w:t xml:space="preserve">ניתוח נתונים: מחקר איכותני</w:t>
+      </w:r>
+      <w:r>
+        <w:rPr>
+          <w:rFonts w:ascii="David" w:cs="David" w:eastAsia="David" w:hAnsi="David"/>
+          <w:b w:val="false"/>
+          <w:bCs w:val="false"/>
+          <w:i w:val="false"/>
+          <w:iCs w:val="false"/>
+          <w:sz w:val="24"/>
+          <w:szCs w:val="24"/>
+          <w:rtl/>
+        </w:rPr>
+        <w:t xml:space="preserve"> [מצגת הרצאה]. הקורס "היבטים חינוכיים בעבודה עם נוער בסיכון", הקריה האקדמית אונו.</w:t>
       </w:r>
     </w:p>
     <w:p>
       <w:pPr>
         <w:bidi/>
         <w:spacing w:after="120" w:line="360"/>
-        <w:ind w:left="720" w:hanging="720"/>
+        <w:ind w:left="709" w:hanging="709"/>
         <w:jc w:val="left"/>
       </w:pPr>
       <w:r>
@@ -6463,14 +6702,40 @@
           <w:szCs w:val="24"/>
           <w:rtl/>
         </w:rPr>
-        <w:t xml:space="preserve">רזר, מ' (2009). "לא נוטשים": מודל דינמי להכשרת מורים לעבודה עם תלמידים בסיכון והדרה חברתית במסגרת בית הספר. מפגש לעבודה חינוכית-סוציאלית, 29.</w:t>
+        <w:t xml:space="preserve">צבר בן-יהושע, נ' (עורכת). (2016). </w:t>
+      </w:r>
+      <w:r>
+        <w:rPr>
+          <w:rFonts w:ascii="David" w:cs="David" w:eastAsia="David" w:hAnsi="David"/>
+          <w:b w:val="false"/>
+          <w:bCs w:val="false"/>
+          <w:i/>
+          <w:iCs/>
+          <w:sz w:val="24"/>
+          <w:szCs w:val="24"/>
+          <w:rtl/>
+        </w:rPr>
+        <w:t xml:space="preserve">מסורות וזרמים במחקר האיכותני: תפיסות, אסטרטגיות וכלים מתקדמים</w:t>
+      </w:r>
+      <w:r>
+        <w:rPr>
+          <w:rFonts w:ascii="David" w:cs="David" w:eastAsia="David" w:hAnsi="David"/>
+          <w:b w:val="false"/>
+          <w:bCs w:val="false"/>
+          <w:i w:val="false"/>
+          <w:iCs w:val="false"/>
+          <w:sz w:val="24"/>
+          <w:szCs w:val="24"/>
+          <w:rtl/>
+        </w:rPr>
+        <w:t xml:space="preserve">. מכון מופ"ת.</w:t>
       </w:r>
     </w:p>
     <w:p>
       <w:pPr>
         <w:bidi/>
         <w:spacing w:after="120" w:line="360"/>
-        <w:ind w:left="720" w:hanging="720"/>
+        <w:ind w:left="709" w:hanging="709"/>
         <w:jc w:val="left"/>
       </w:pPr>
       <w:r>
@@ -6484,14 +6749,66 @@
           <w:szCs w:val="24"/>
           <w:rtl/>
         </w:rPr>
-        <w:t xml:space="preserve">רסנר, נ' וזעירא, ע' (2014). נערות במצבי מצוקה קשים: סקירת ספרות. ירושלים: מכון חרוב.</w:t>
+        <w:t xml:space="preserve">רזר, מ' (2009). "לא נוטשים": מודל דינמי להכשרת מורים לעבודה עם תלמידים בסיכון והדרה חברתית במסגרת בית הספר. </w:t>
+      </w:r>
+      <w:r>
+        <w:rPr>
+          <w:rFonts w:ascii="David" w:cs="David" w:eastAsia="David" w:hAnsi="David"/>
+          <w:b w:val="false"/>
+          <w:bCs w:val="false"/>
+          <w:i/>
+          <w:iCs/>
+          <w:sz w:val="24"/>
+          <w:szCs w:val="24"/>
+          <w:rtl/>
+        </w:rPr>
+        <w:t xml:space="preserve">מפגש לעבודה חינוכית-סוציאלית</w:t>
+      </w:r>
+      <w:r>
+        <w:rPr>
+          <w:rFonts w:ascii="David" w:cs="David" w:eastAsia="David" w:hAnsi="David"/>
+          <w:b w:val="false"/>
+          <w:bCs w:val="false"/>
+          <w:i w:val="false"/>
+          <w:iCs w:val="false"/>
+          <w:sz w:val="24"/>
+          <w:szCs w:val="24"/>
+          <w:rtl/>
+        </w:rPr>
+        <w:t xml:space="preserve">, </w:t>
+      </w:r>
+      <w:r>
+        <w:rPr>
+          <w:rFonts w:ascii="David" w:cs="David" w:eastAsia="David" w:hAnsi="David"/>
+          <w:b w:val="false"/>
+          <w:bCs w:val="false"/>
+          <w:i/>
+          <w:iCs/>
+          <w:sz w:val="24"/>
+          <w:szCs w:val="24"/>
+          <w:rtl/>
+        </w:rPr>
+        <w:t xml:space="preserve">29</w:t>
+      </w:r>
+      <w:r>
+        <w:rPr>
+          <w:rFonts w:ascii="David" w:cs="David" w:eastAsia="David" w:hAnsi="David"/>
+          <w:b w:val="false"/>
+          <w:bCs w:val="false"/>
+          <w:i w:val="false"/>
+          <w:iCs w:val="false"/>
+          <w:sz w:val="24"/>
+          <w:szCs w:val="24"/>
+          <w:rtl/>
+        </w:rPr>
+        <w:t xml:space="preserve">.</w:t>
       </w:r>
     </w:p>
     <w:p>
       <w:pPr>
         <w:bidi/>
         <w:spacing w:after="120" w:line="360"/>
-        <w:ind w:left="720" w:hanging="720"/>
+        <w:ind w:left="709" w:hanging="709"/>
         <w:jc w:val="left"/>
       </w:pPr>
       <w:r>
@@ -6505,14 +6822,40 @@
           <w:szCs w:val="24"/>
           <w:rtl/>
         </w:rPr>
-        <w:t xml:space="preserve">שלסקי, ש' ואריאלי, מ' (2001). מהגישה הפרשנית לגישות פוסט-מודרניסטיות בחקר החינוך. בתוך נ' צבר בן-יהושע (עורכת), מסורות וזרמים במחקר האיכותי (עמ' 31–76). לוד: דביר.</w:t>
+        <w:t xml:space="preserve">רסנר, נ', וזעירא, ע' (2014). </w:t>
+      </w:r>
+      <w:r>
+        <w:rPr>
+          <w:rFonts w:ascii="David" w:cs="David" w:eastAsia="David" w:hAnsi="David"/>
+          <w:b w:val="false"/>
+          <w:bCs w:val="false"/>
+          <w:i/>
+          <w:iCs/>
+          <w:sz w:val="24"/>
+          <w:szCs w:val="24"/>
+          <w:rtl/>
+        </w:rPr>
+        <w:t xml:space="preserve">נערות במצבי מצוקה קשים: סקירת ספרות</w:t>
+      </w:r>
+      <w:r>
+        <w:rPr>
+          <w:rFonts w:ascii="David" w:cs="David" w:eastAsia="David" w:hAnsi="David"/>
+          <w:b w:val="false"/>
+          <w:bCs w:val="false"/>
+          <w:i w:val="false"/>
+          <w:iCs w:val="false"/>
+          <w:sz w:val="24"/>
+          <w:szCs w:val="24"/>
+          <w:rtl/>
+        </w:rPr>
+        <w:t xml:space="preserve">. מכון חרוב.</w:t>
       </w:r>
     </w:p>
     <w:p>
       <w:pPr>
         <w:bidi/>
         <w:spacing w:after="120" w:line="360"/>
-        <w:ind w:left="720" w:hanging="720"/>
+        <w:ind w:left="709" w:hanging="709"/>
         <w:jc w:val="left"/>
       </w:pPr>
       <w:r>
@@ -6526,14 +6869,40 @@
           <w:szCs w:val="24"/>
           <w:rtl/>
         </w:rPr>
-        <w:t xml:space="preserve">שמיד, ה' (2006). דין וחשבון הוועדה הציבורית לבדיקת מצבם של ילדים ובני נוער בסיכון ובמצוקה. ירושלים: משרד הרווחה.</w:t>
+        <w:t xml:space="preserve">שלסקי, ש', ואריאלי, מ' (2001). מהגישה הפרשנית לגישות פוסט-מודרניסטיות בחקר החינוך. בתוך נ' צבר בן-יהושע (עורכת), </w:t>
+      </w:r>
+      <w:r>
+        <w:rPr>
+          <w:rFonts w:ascii="David" w:cs="David" w:eastAsia="David" w:hAnsi="David"/>
+          <w:b w:val="false"/>
+          <w:bCs w:val="false"/>
+          <w:i/>
+          <w:iCs/>
+          <w:sz w:val="24"/>
+          <w:szCs w:val="24"/>
+          <w:rtl/>
+        </w:rPr>
+        <w:t xml:space="preserve">מסורות וזרמים במחקר האיכותי</w:t>
+      </w:r>
+      <w:r>
+        <w:rPr>
+          <w:rFonts w:ascii="David" w:cs="David" w:eastAsia="David" w:hAnsi="David"/>
+          <w:b w:val="false"/>
+          <w:bCs w:val="false"/>
+          <w:i w:val="false"/>
+          <w:iCs w:val="false"/>
+          <w:sz w:val="24"/>
+          <w:szCs w:val="24"/>
+          <w:rtl/>
+        </w:rPr>
+        <w:t xml:space="preserve"> (עמ' 31-76). דביר.</w:t>
       </w:r>
     </w:p>
     <w:p>
       <w:pPr>
         <w:bidi/>
         <w:spacing w:after="120" w:line="360"/>
-        <w:ind w:left="720" w:hanging="720"/>
+        <w:ind w:left="709" w:hanging="709"/>
         <w:jc w:val="left"/>
       </w:pPr>
       <w:r>
@@ -6547,300 +6916,1677 @@
           <w:szCs w:val="24"/>
           <w:rtl/>
         </w:rPr>
-        <w:t xml:space="preserve">שקדי, א' (2003). מילים המנסות לגעת: מחקר איכותני – תאוריה ויישום. תל אביב: רמות.</w:t>
-      </w:r>
-    </w:p>
-    <w:p>
-      <w:pPr>
-        <w:keepNext w:val="false"/>
-        <w:bidi/>
-        <w:spacing w:after="120" w:before="240" w:line="360"/>
-        <w:jc w:val="right"/>
-      </w:pPr>
-      <w:r>
-        <w:rPr>
-          <w:rFonts w:ascii="David" w:cs="David" w:eastAsia="David" w:hAnsi="David"/>
-          <w:b/>
-          <w:bCs/>
-          <w:i w:val="false"/>
-          <w:iCs w:val="false"/>
-          <w:sz w:val="24"/>
-          <w:szCs w:val="24"/>
-          <w:rtl/>
-        </w:rPr>
-        <w:t xml:space="preserve">מקורות באנגלית</w:t>
+        <w:t xml:space="preserve">שמיד, ה' (2006). </w:t>
+      </w:r>
+      <w:r>
+        <w:rPr>
+          <w:rFonts w:ascii="David" w:cs="David" w:eastAsia="David" w:hAnsi="David"/>
+          <w:b w:val="false"/>
+          <w:bCs w:val="false"/>
+          <w:i/>
+          <w:iCs/>
+          <w:sz w:val="24"/>
+          <w:szCs w:val="24"/>
+          <w:rtl/>
+        </w:rPr>
+        <w:t xml:space="preserve">דין וחשבון הוועדה הציבורית לבדיקת מצבם של ילדים ובני נוער בסיכון ובמצוקה</w:t>
+      </w:r>
+      <w:r>
+        <w:rPr>
+          <w:rFonts w:ascii="David" w:cs="David" w:eastAsia="David" w:hAnsi="David"/>
+          <w:b w:val="false"/>
+          <w:bCs w:val="false"/>
+          <w:i w:val="false"/>
+          <w:iCs w:val="false"/>
+          <w:sz w:val="24"/>
+          <w:szCs w:val="24"/>
+          <w:rtl/>
+        </w:rPr>
+        <w:t xml:space="preserve">. משרד הרווחה.</w:t>
+      </w:r>
+    </w:p>
+    <w:p>
+      <w:pPr>
+        <w:bidi/>
+        <w:spacing w:after="120" w:line="360"/>
+        <w:ind w:left="709" w:hanging="709"/>
+        <w:jc w:val="left"/>
+      </w:pPr>
+      <w:r>
+        <w:rPr>
+          <w:rFonts w:ascii="David" w:cs="David" w:eastAsia="David" w:hAnsi="David"/>
+          <w:b w:val="false"/>
+          <w:bCs w:val="false"/>
+          <w:i w:val="false"/>
+          <w:iCs w:val="false"/>
+          <w:sz w:val="24"/>
+          <w:szCs w:val="24"/>
+          <w:rtl/>
+        </w:rPr>
+        <w:t xml:space="preserve">שקדי, א' (2003). </w:t>
+      </w:r>
+      <w:r>
+        <w:rPr>
+          <w:rFonts w:ascii="David" w:cs="David" w:eastAsia="David" w:hAnsi="David"/>
+          <w:b w:val="false"/>
+          <w:bCs w:val="false"/>
+          <w:i/>
+          <w:iCs/>
+          <w:sz w:val="24"/>
+          <w:szCs w:val="24"/>
+          <w:rtl/>
+        </w:rPr>
+        <w:t xml:space="preserve">מילים המנסות לגעת: מחקר איכותני, תאוריה ויישום</w:t>
+      </w:r>
+      <w:r>
+        <w:rPr>
+          <w:rFonts w:ascii="David" w:cs="David" w:eastAsia="David" w:hAnsi="David"/>
+          <w:b w:val="false"/>
+          <w:bCs w:val="false"/>
+          <w:i w:val="false"/>
+          <w:iCs w:val="false"/>
+          <w:sz w:val="24"/>
+          <w:szCs w:val="24"/>
+          <w:rtl/>
+        </w:rPr>
+        <w:t xml:space="preserve">. רמות.</w:t>
       </w:r>
     </w:p>
     <w:p>
       <w:pPr>
         <w:bidi w:val="false"/>
         <w:spacing w:after="120" w:line="360"/>
-        <w:ind w:left="720" w:hanging="720"/>
+        <w:ind w:left="709" w:hanging="709"/>
         <w:jc w:val="left"/>
       </w:pPr>
       <w:r>
         <w:rPr>
-          <w:rFonts w:ascii="David" w:cs="David" w:eastAsia="David" w:hAnsi="David"/>
-          <w:sz w:val="24"/>
-          <w:szCs w:val="24"/>
-          <w:rtl w:val="false"/>
-        </w:rPr>
-        <w:t xml:space="preserve">Abu-Rabia-Queder, S. (2006). Between tradition and modernization: Understanding the problem of female Bedouin dropouts. British Journal of Sociology of Education, 27(1), 3–17.</w:t>
+          <w:rFonts w:ascii="Times New Roman" w:cs="Times New Roman" w:eastAsia="Times New Roman" w:hAnsi="Times New Roman"/>
+          <w:b w:val="false"/>
+          <w:bCs w:val="false"/>
+          <w:i w:val="false"/>
+          <w:iCs w:val="false"/>
+          <w:sz w:val="24"/>
+          <w:szCs w:val="24"/>
+          <w:rtl w:val="false"/>
+        </w:rPr>
+        <w:t xml:space="preserve">Abu-Rabia-Queder, S.</w:t>
+      </w:r>
+      <w:r>
+        <w:rPr>
+          <w:rFonts w:ascii="Times New Roman" w:cs="Times New Roman" w:eastAsia="Times New Roman" w:hAnsi="Times New Roman"/>
+          <w:b w:val="false"/>
+          <w:bCs w:val="false"/>
+          <w:i w:val="false"/>
+          <w:iCs w:val="false"/>
+          <w:sz w:val="24"/>
+          <w:szCs w:val="24"/>
+          <w:rtl w:val="false"/>
+        </w:rPr>
+        <w:t xml:space="preserve"> (2006). </w:t>
+      </w:r>
+      <w:r>
+        <w:rPr>
+          <w:rFonts w:ascii="Times New Roman" w:cs="Times New Roman" w:eastAsia="Times New Roman" w:hAnsi="Times New Roman"/>
+          <w:b w:val="false"/>
+          <w:bCs w:val="false"/>
+          <w:i w:val="false"/>
+          <w:iCs w:val="false"/>
+          <w:sz w:val="24"/>
+          <w:szCs w:val="24"/>
+          <w:rtl w:val="false"/>
+        </w:rPr>
+        <w:t xml:space="preserve">Between tradition and modernization: Understanding the problem of female Bedouin dropouts.</w:t>
+      </w:r>
+      <w:r>
+        <w:rPr>
+          <w:rFonts w:ascii="Times New Roman" w:cs="Times New Roman" w:eastAsia="Times New Roman" w:hAnsi="Times New Roman"/>
+          <w:b w:val="false"/>
+          <w:bCs w:val="false"/>
+          <w:i w:val="false"/>
+          <w:iCs w:val="false"/>
+          <w:sz w:val="24"/>
+          <w:szCs w:val="24"/>
+          <w:rtl w:val="false"/>
+        </w:rPr>
+        <w:t xml:space="preserve"> </w:t>
+      </w:r>
+      <w:r>
+        <w:rPr>
+          <w:rFonts w:ascii="Times New Roman" w:cs="Times New Roman" w:eastAsia="Times New Roman" w:hAnsi="Times New Roman"/>
+          <w:b w:val="false"/>
+          <w:bCs w:val="false"/>
+          <w:i/>
+          <w:iCs/>
+          <w:sz w:val="24"/>
+          <w:szCs w:val="24"/>
+          <w:rtl w:val="false"/>
+        </w:rPr>
+        <w:t xml:space="preserve">British Journal of Sociology of Education</w:t>
+      </w:r>
+      <w:r>
+        <w:rPr>
+          <w:rFonts w:ascii="Times New Roman" w:cs="Times New Roman" w:eastAsia="Times New Roman" w:hAnsi="Times New Roman"/>
+          <w:b w:val="false"/>
+          <w:bCs w:val="false"/>
+          <w:i w:val="false"/>
+          <w:iCs w:val="false"/>
+          <w:sz w:val="24"/>
+          <w:szCs w:val="24"/>
+          <w:rtl w:val="false"/>
+        </w:rPr>
+        <w:t xml:space="preserve">, </w:t>
+      </w:r>
+      <w:r>
+        <w:rPr>
+          <w:rFonts w:ascii="Times New Roman" w:cs="Times New Roman" w:eastAsia="Times New Roman" w:hAnsi="Times New Roman"/>
+          <w:b w:val="false"/>
+          <w:bCs w:val="false"/>
+          <w:i/>
+          <w:iCs/>
+          <w:sz w:val="24"/>
+          <w:szCs w:val="24"/>
+          <w:rtl w:val="false"/>
+        </w:rPr>
+        <w:t xml:space="preserve">27</w:t>
+      </w:r>
+      <w:r>
+        <w:rPr>
+          <w:rFonts w:ascii="Times New Roman" w:cs="Times New Roman" w:eastAsia="Times New Roman" w:hAnsi="Times New Roman"/>
+          <w:b w:val="false"/>
+          <w:bCs w:val="false"/>
+          <w:i w:val="false"/>
+          <w:iCs w:val="false"/>
+          <w:sz w:val="24"/>
+          <w:szCs w:val="24"/>
+          <w:rtl w:val="false"/>
+        </w:rPr>
+        <w:t xml:space="preserve">(1), 3-17.</w:t>
       </w:r>
     </w:p>
     <w:p>
       <w:pPr>
         <w:bidi w:val="false"/>
         <w:spacing w:after="120" w:line="360"/>
-        <w:ind w:left="720" w:hanging="720"/>
+        <w:ind w:left="709" w:hanging="709"/>
         <w:jc w:val="left"/>
       </w:pPr>
       <w:r>
         <w:rPr>
-          <w:rFonts w:ascii="David" w:cs="David" w:eastAsia="David" w:hAnsi="David"/>
-          <w:sz w:val="24"/>
-          <w:szCs w:val="24"/>
-          <w:rtl w:val="false"/>
-        </w:rPr>
-        <w:t xml:space="preserve">Balfanz, R., Herzog, L., &amp; Mac Iver, D. J. (2007). Preventing student disengagement and keeping students on the graduation path in urban middle-grades schools: Early identification and effective interventions. Educational Psychologist, 42(4), 223–235.</w:t>
+          <w:rFonts w:ascii="Times New Roman" w:cs="Times New Roman" w:eastAsia="Times New Roman" w:hAnsi="Times New Roman"/>
+          <w:b w:val="false"/>
+          <w:bCs w:val="false"/>
+          <w:i w:val="false"/>
+          <w:iCs w:val="false"/>
+          <w:sz w:val="24"/>
+          <w:szCs w:val="24"/>
+          <w:rtl w:val="false"/>
+        </w:rPr>
+        <w:t xml:space="preserve">Balfanz, R., Herzog, L., &amp; Mac Iver, D. J.</w:t>
+      </w:r>
+      <w:r>
+        <w:rPr>
+          <w:rFonts w:ascii="Times New Roman" w:cs="Times New Roman" w:eastAsia="Times New Roman" w:hAnsi="Times New Roman"/>
+          <w:b w:val="false"/>
+          <w:bCs w:val="false"/>
+          <w:i w:val="false"/>
+          <w:iCs w:val="false"/>
+          <w:sz w:val="24"/>
+          <w:szCs w:val="24"/>
+          <w:rtl w:val="false"/>
+        </w:rPr>
+        <w:t xml:space="preserve"> (2007). </w:t>
+      </w:r>
+      <w:r>
+        <w:rPr>
+          <w:rFonts w:ascii="Times New Roman" w:cs="Times New Roman" w:eastAsia="Times New Roman" w:hAnsi="Times New Roman"/>
+          <w:b w:val="false"/>
+          <w:bCs w:val="false"/>
+          <w:i w:val="false"/>
+          <w:iCs w:val="false"/>
+          <w:sz w:val="24"/>
+          <w:szCs w:val="24"/>
+          <w:rtl w:val="false"/>
+        </w:rPr>
+        <w:t xml:space="preserve">Preventing student disengagement and keeping students on the graduation path in urban middle-grades schools: Early identification and effective interventions.</w:t>
+      </w:r>
+      <w:r>
+        <w:rPr>
+          <w:rFonts w:ascii="Times New Roman" w:cs="Times New Roman" w:eastAsia="Times New Roman" w:hAnsi="Times New Roman"/>
+          <w:b w:val="false"/>
+          <w:bCs w:val="false"/>
+          <w:i w:val="false"/>
+          <w:iCs w:val="false"/>
+          <w:sz w:val="24"/>
+          <w:szCs w:val="24"/>
+          <w:rtl w:val="false"/>
+        </w:rPr>
+        <w:t xml:space="preserve"> </w:t>
+      </w:r>
+      <w:r>
+        <w:rPr>
+          <w:rFonts w:ascii="Times New Roman" w:cs="Times New Roman" w:eastAsia="Times New Roman" w:hAnsi="Times New Roman"/>
+          <w:b w:val="false"/>
+          <w:bCs w:val="false"/>
+          <w:i/>
+          <w:iCs/>
+          <w:sz w:val="24"/>
+          <w:szCs w:val="24"/>
+          <w:rtl w:val="false"/>
+        </w:rPr>
+        <w:t xml:space="preserve">Educational Psychologist</w:t>
+      </w:r>
+      <w:r>
+        <w:rPr>
+          <w:rFonts w:ascii="Times New Roman" w:cs="Times New Roman" w:eastAsia="Times New Roman" w:hAnsi="Times New Roman"/>
+          <w:b w:val="false"/>
+          <w:bCs w:val="false"/>
+          <w:i w:val="false"/>
+          <w:iCs w:val="false"/>
+          <w:sz w:val="24"/>
+          <w:szCs w:val="24"/>
+          <w:rtl w:val="false"/>
+        </w:rPr>
+        <w:t xml:space="preserve">, </w:t>
+      </w:r>
+      <w:r>
+        <w:rPr>
+          <w:rFonts w:ascii="Times New Roman" w:cs="Times New Roman" w:eastAsia="Times New Roman" w:hAnsi="Times New Roman"/>
+          <w:b w:val="false"/>
+          <w:bCs w:val="false"/>
+          <w:i/>
+          <w:iCs/>
+          <w:sz w:val="24"/>
+          <w:szCs w:val="24"/>
+          <w:rtl w:val="false"/>
+        </w:rPr>
+        <w:t xml:space="preserve">42</w:t>
+      </w:r>
+      <w:r>
+        <w:rPr>
+          <w:rFonts w:ascii="Times New Roman" w:cs="Times New Roman" w:eastAsia="Times New Roman" w:hAnsi="Times New Roman"/>
+          <w:b w:val="false"/>
+          <w:bCs w:val="false"/>
+          <w:i w:val="false"/>
+          <w:iCs w:val="false"/>
+          <w:sz w:val="24"/>
+          <w:szCs w:val="24"/>
+          <w:rtl w:val="false"/>
+        </w:rPr>
+        <w:t xml:space="preserve">(4), 223-235.</w:t>
       </w:r>
     </w:p>
     <w:p>
       <w:pPr>
         <w:bidi w:val="false"/>
         <w:spacing w:after="120" w:line="360"/>
-        <w:ind w:left="720" w:hanging="720"/>
+        <w:ind w:left="709" w:hanging="709"/>
         <w:jc w:val="left"/>
       </w:pPr>
       <w:r>
         <w:rPr>
-          <w:rFonts w:ascii="David" w:cs="David" w:eastAsia="David" w:hAnsi="David"/>
-          <w:sz w:val="24"/>
-          <w:szCs w:val="24"/>
-          <w:rtl w:val="false"/>
-        </w:rPr>
-        <w:t xml:space="preserve">Becker, H. S. (1963). Outsiders: Studies in the sociology of deviance. New York: Free Press.</w:t>
+          <w:rFonts w:ascii="Times New Roman" w:cs="Times New Roman" w:eastAsia="Times New Roman" w:hAnsi="Times New Roman"/>
+          <w:b w:val="false"/>
+          <w:bCs w:val="false"/>
+          <w:i w:val="false"/>
+          <w:iCs w:val="false"/>
+          <w:sz w:val="24"/>
+          <w:szCs w:val="24"/>
+          <w:rtl w:val="false"/>
+        </w:rPr>
+        <w:t xml:space="preserve">Becker, H. S.</w:t>
+      </w:r>
+      <w:r>
+        <w:rPr>
+          <w:rFonts w:ascii="Times New Roman" w:cs="Times New Roman" w:eastAsia="Times New Roman" w:hAnsi="Times New Roman"/>
+          <w:b w:val="false"/>
+          <w:bCs w:val="false"/>
+          <w:i w:val="false"/>
+          <w:iCs w:val="false"/>
+          <w:sz w:val="24"/>
+          <w:szCs w:val="24"/>
+          <w:rtl w:val="false"/>
+        </w:rPr>
+        <w:t xml:space="preserve"> (1963). </w:t>
+      </w:r>
+      <w:r>
+        <w:rPr>
+          <w:rFonts w:ascii="Times New Roman" w:cs="Times New Roman" w:eastAsia="Times New Roman" w:hAnsi="Times New Roman"/>
+          <w:b w:val="false"/>
+          <w:bCs w:val="false"/>
+          <w:i/>
+          <w:iCs/>
+          <w:sz w:val="24"/>
+          <w:szCs w:val="24"/>
+          <w:rtl w:val="false"/>
+        </w:rPr>
+        <w:t xml:space="preserve">Outsiders: Studies in the sociology of deviance</w:t>
+      </w:r>
+      <w:r>
+        <w:rPr>
+          <w:rFonts w:ascii="Times New Roman" w:cs="Times New Roman" w:eastAsia="Times New Roman" w:hAnsi="Times New Roman"/>
+          <w:b w:val="false"/>
+          <w:bCs w:val="false"/>
+          <w:i w:val="false"/>
+          <w:iCs w:val="false"/>
+          <w:sz w:val="24"/>
+          <w:szCs w:val="24"/>
+          <w:rtl w:val="false"/>
+        </w:rPr>
+        <w:t xml:space="preserve">. </w:t>
+      </w:r>
+      <w:r>
+        <w:rPr>
+          <w:rFonts w:ascii="Times New Roman" w:cs="Times New Roman" w:eastAsia="Times New Roman" w:hAnsi="Times New Roman"/>
+          <w:b w:val="false"/>
+          <w:bCs w:val="false"/>
+          <w:i w:val="false"/>
+          <w:iCs w:val="false"/>
+          <w:sz w:val="24"/>
+          <w:szCs w:val="24"/>
+          <w:rtl w:val="false"/>
+        </w:rPr>
+        <w:t xml:space="preserve">Free Press.</w:t>
       </w:r>
     </w:p>
     <w:p>
       <w:pPr>
         <w:bidi w:val="false"/>
         <w:spacing w:after="120" w:line="360"/>
-        <w:ind w:left="720" w:hanging="720"/>
+        <w:ind w:left="709" w:hanging="709"/>
         <w:jc w:val="left"/>
       </w:pPr>
       <w:r>
         <w:rPr>
-          <w:rFonts w:ascii="David" w:cs="David" w:eastAsia="David" w:hAnsi="David"/>
-          <w:sz w:val="24"/>
-          <w:szCs w:val="24"/>
-          <w:rtl w:val="false"/>
-        </w:rPr>
-        <w:t xml:space="preserve">Bowlby, J. (1969). Attachment and loss: Vol. 1. Attachment. New York: Basic Books.</w:t>
+          <w:rFonts w:ascii="Times New Roman" w:cs="Times New Roman" w:eastAsia="Times New Roman" w:hAnsi="Times New Roman"/>
+          <w:b w:val="false"/>
+          <w:bCs w:val="false"/>
+          <w:i w:val="false"/>
+          <w:iCs w:val="false"/>
+          <w:sz w:val="24"/>
+          <w:szCs w:val="24"/>
+          <w:rtl w:val="false"/>
+        </w:rPr>
+        <w:t xml:space="preserve">Bowlby, J.</w:t>
+      </w:r>
+      <w:r>
+        <w:rPr>
+          <w:rFonts w:ascii="Times New Roman" w:cs="Times New Roman" w:eastAsia="Times New Roman" w:hAnsi="Times New Roman"/>
+          <w:b w:val="false"/>
+          <w:bCs w:val="false"/>
+          <w:i w:val="false"/>
+          <w:iCs w:val="false"/>
+          <w:sz w:val="24"/>
+          <w:szCs w:val="24"/>
+          <w:rtl w:val="false"/>
+        </w:rPr>
+        <w:t xml:space="preserve"> (1969). </w:t>
+      </w:r>
+      <w:r>
+        <w:rPr>
+          <w:rFonts w:ascii="Times New Roman" w:cs="Times New Roman" w:eastAsia="Times New Roman" w:hAnsi="Times New Roman"/>
+          <w:b w:val="false"/>
+          <w:bCs w:val="false"/>
+          <w:i/>
+          <w:iCs/>
+          <w:sz w:val="24"/>
+          <w:szCs w:val="24"/>
+          <w:rtl w:val="false"/>
+        </w:rPr>
+        <w:t xml:space="preserve">Attachment and loss: Vol. 1. Attachment</w:t>
+      </w:r>
+      <w:r>
+        <w:rPr>
+          <w:rFonts w:ascii="Times New Roman" w:cs="Times New Roman" w:eastAsia="Times New Roman" w:hAnsi="Times New Roman"/>
+          <w:b w:val="false"/>
+          <w:bCs w:val="false"/>
+          <w:i w:val="false"/>
+          <w:iCs w:val="false"/>
+          <w:sz w:val="24"/>
+          <w:szCs w:val="24"/>
+          <w:rtl w:val="false"/>
+        </w:rPr>
+        <w:t xml:space="preserve">. </w:t>
+      </w:r>
+      <w:r>
+        <w:rPr>
+          <w:rFonts w:ascii="Times New Roman" w:cs="Times New Roman" w:eastAsia="Times New Roman" w:hAnsi="Times New Roman"/>
+          <w:b w:val="false"/>
+          <w:bCs w:val="false"/>
+          <w:i w:val="false"/>
+          <w:iCs w:val="false"/>
+          <w:sz w:val="24"/>
+          <w:szCs w:val="24"/>
+          <w:rtl w:val="false"/>
+        </w:rPr>
+        <w:t xml:space="preserve">Basic Books.</w:t>
       </w:r>
     </w:p>
     <w:p>
       <w:pPr>
         <w:bidi w:val="false"/>
         <w:spacing w:after="120" w:line="360"/>
-        <w:ind w:left="720" w:hanging="720"/>
+        <w:ind w:left="709" w:hanging="709"/>
         <w:jc w:val="left"/>
       </w:pPr>
       <w:r>
         <w:rPr>
-          <w:rFonts w:ascii="David" w:cs="David" w:eastAsia="David" w:hAnsi="David"/>
-          <w:sz w:val="24"/>
-          <w:szCs w:val="24"/>
-          <w:rtl w:val="false"/>
-        </w:rPr>
-        <w:t xml:space="preserve">Bronfenbrenner, U. (1979). The ecology of human development: Experiments by nature and design. Cambridge, MA: Harvard University Press.</w:t>
+          <w:rFonts w:ascii="Times New Roman" w:cs="Times New Roman" w:eastAsia="Times New Roman" w:hAnsi="Times New Roman"/>
+          <w:b w:val="false"/>
+          <w:bCs w:val="false"/>
+          <w:i w:val="false"/>
+          <w:iCs w:val="false"/>
+          <w:sz w:val="24"/>
+          <w:szCs w:val="24"/>
+          <w:rtl w:val="false"/>
+        </w:rPr>
+        <w:t xml:space="preserve">Bronfenbrenner, U.</w:t>
+      </w:r>
+      <w:r>
+        <w:rPr>
+          <w:rFonts w:ascii="Times New Roman" w:cs="Times New Roman" w:eastAsia="Times New Roman" w:hAnsi="Times New Roman"/>
+          <w:b w:val="false"/>
+          <w:bCs w:val="false"/>
+          <w:i w:val="false"/>
+          <w:iCs w:val="false"/>
+          <w:sz w:val="24"/>
+          <w:szCs w:val="24"/>
+          <w:rtl w:val="false"/>
+        </w:rPr>
+        <w:t xml:space="preserve"> (1979). </w:t>
+      </w:r>
+      <w:r>
+        <w:rPr>
+          <w:rFonts w:ascii="Times New Roman" w:cs="Times New Roman" w:eastAsia="Times New Roman" w:hAnsi="Times New Roman"/>
+          <w:b w:val="false"/>
+          <w:bCs w:val="false"/>
+          <w:i/>
+          <w:iCs/>
+          <w:sz w:val="24"/>
+          <w:szCs w:val="24"/>
+          <w:rtl w:val="false"/>
+        </w:rPr>
+        <w:t xml:space="preserve">The ecology of human development: Experiments by nature and design</w:t>
+      </w:r>
+      <w:r>
+        <w:rPr>
+          <w:rFonts w:ascii="Times New Roman" w:cs="Times New Roman" w:eastAsia="Times New Roman" w:hAnsi="Times New Roman"/>
+          <w:b w:val="false"/>
+          <w:bCs w:val="false"/>
+          <w:i w:val="false"/>
+          <w:iCs w:val="false"/>
+          <w:sz w:val="24"/>
+          <w:szCs w:val="24"/>
+          <w:rtl w:val="false"/>
+        </w:rPr>
+        <w:t xml:space="preserve">. </w:t>
+      </w:r>
+      <w:r>
+        <w:rPr>
+          <w:rFonts w:ascii="Times New Roman" w:cs="Times New Roman" w:eastAsia="Times New Roman" w:hAnsi="Times New Roman"/>
+          <w:b w:val="false"/>
+          <w:bCs w:val="false"/>
+          <w:i w:val="false"/>
+          <w:iCs w:val="false"/>
+          <w:sz w:val="24"/>
+          <w:szCs w:val="24"/>
+          <w:rtl w:val="false"/>
+        </w:rPr>
+        <w:t xml:space="preserve">Harvard University Press.</w:t>
       </w:r>
     </w:p>
     <w:p>
       <w:pPr>
         <w:bidi w:val="false"/>
         <w:spacing w:after="120" w:line="360"/>
-        <w:ind w:left="720" w:hanging="720"/>
+        <w:ind w:left="709" w:hanging="709"/>
         <w:jc w:val="left"/>
       </w:pPr>
       <w:r>
         <w:rPr>
-          <w:rFonts w:ascii="David" w:cs="David" w:eastAsia="David" w:hAnsi="David"/>
-          <w:sz w:val="24"/>
-          <w:szCs w:val="24"/>
-          <w:rtl w:val="false"/>
-        </w:rPr>
-        <w:t xml:space="preserve">Erikson, E. H. (1968). Identity: Youth and crisis. New York: Norton.</w:t>
+          <w:rFonts w:ascii="Times New Roman" w:cs="Times New Roman" w:eastAsia="Times New Roman" w:hAnsi="Times New Roman"/>
+          <w:b w:val="false"/>
+          <w:bCs w:val="false"/>
+          <w:i w:val="false"/>
+          <w:iCs w:val="false"/>
+          <w:sz w:val="24"/>
+          <w:szCs w:val="24"/>
+          <w:rtl w:val="false"/>
+        </w:rPr>
+        <w:t xml:space="preserve">Erikson, E. H.</w:t>
+      </w:r>
+      <w:r>
+        <w:rPr>
+          <w:rFonts w:ascii="Times New Roman" w:cs="Times New Roman" w:eastAsia="Times New Roman" w:hAnsi="Times New Roman"/>
+          <w:b w:val="false"/>
+          <w:bCs w:val="false"/>
+          <w:i w:val="false"/>
+          <w:iCs w:val="false"/>
+          <w:sz w:val="24"/>
+          <w:szCs w:val="24"/>
+          <w:rtl w:val="false"/>
+        </w:rPr>
+        <w:t xml:space="preserve"> (1968). </w:t>
+      </w:r>
+      <w:r>
+        <w:rPr>
+          <w:rFonts w:ascii="Times New Roman" w:cs="Times New Roman" w:eastAsia="Times New Roman" w:hAnsi="Times New Roman"/>
+          <w:b w:val="false"/>
+          <w:bCs w:val="false"/>
+          <w:i/>
+          <w:iCs/>
+          <w:sz w:val="24"/>
+          <w:szCs w:val="24"/>
+          <w:rtl w:val="false"/>
+        </w:rPr>
+        <w:t xml:space="preserve">Identity: Youth and crisis</w:t>
+      </w:r>
+      <w:r>
+        <w:rPr>
+          <w:rFonts w:ascii="Times New Roman" w:cs="Times New Roman" w:eastAsia="Times New Roman" w:hAnsi="Times New Roman"/>
+          <w:b w:val="false"/>
+          <w:bCs w:val="false"/>
+          <w:i w:val="false"/>
+          <w:iCs w:val="false"/>
+          <w:sz w:val="24"/>
+          <w:szCs w:val="24"/>
+          <w:rtl w:val="false"/>
+        </w:rPr>
+        <w:t xml:space="preserve">. </w:t>
+      </w:r>
+      <w:r>
+        <w:rPr>
+          <w:rFonts w:ascii="Times New Roman" w:cs="Times New Roman" w:eastAsia="Times New Roman" w:hAnsi="Times New Roman"/>
+          <w:b w:val="false"/>
+          <w:bCs w:val="false"/>
+          <w:i w:val="false"/>
+          <w:iCs w:val="false"/>
+          <w:sz w:val="24"/>
+          <w:szCs w:val="24"/>
+          <w:rtl w:val="false"/>
+        </w:rPr>
+        <w:t xml:space="preserve">Norton.</w:t>
       </w:r>
     </w:p>
     <w:p>
       <w:pPr>
         <w:bidi w:val="false"/>
         <w:spacing w:after="120" w:line="360"/>
-        <w:ind w:left="720" w:hanging="720"/>
+        <w:ind w:left="709" w:hanging="709"/>
         <w:jc w:val="left"/>
       </w:pPr>
       <w:r>
         <w:rPr>
-          <w:rFonts w:ascii="David" w:cs="David" w:eastAsia="David" w:hAnsi="David"/>
-          <w:sz w:val="24"/>
-          <w:szCs w:val="24"/>
-          <w:rtl w:val="false"/>
-        </w:rPr>
-        <w:t xml:space="preserve">Hamre, B. K., &amp; Pianta, R. C. (2001). Early teacher–child relationships and the trajectory of children's school outcomes through eighth grade. Child Development, 72(2), 625–638.</w:t>
+          <w:rFonts w:ascii="Times New Roman" w:cs="Times New Roman" w:eastAsia="Times New Roman" w:hAnsi="Times New Roman"/>
+          <w:b w:val="false"/>
+          <w:bCs w:val="false"/>
+          <w:i w:val="false"/>
+          <w:iCs w:val="false"/>
+          <w:sz w:val="24"/>
+          <w:szCs w:val="24"/>
+          <w:rtl w:val="false"/>
+        </w:rPr>
+        <w:t xml:space="preserve">Hamre, B. K., &amp; Pianta, R. C.</w:t>
+      </w:r>
+      <w:r>
+        <w:rPr>
+          <w:rFonts w:ascii="Times New Roman" w:cs="Times New Roman" w:eastAsia="Times New Roman" w:hAnsi="Times New Roman"/>
+          <w:b w:val="false"/>
+          <w:bCs w:val="false"/>
+          <w:i w:val="false"/>
+          <w:iCs w:val="false"/>
+          <w:sz w:val="24"/>
+          <w:szCs w:val="24"/>
+          <w:rtl w:val="false"/>
+        </w:rPr>
+        <w:t xml:space="preserve"> (2001). </w:t>
+      </w:r>
+      <w:r>
+        <w:rPr>
+          <w:rFonts w:ascii="Times New Roman" w:cs="Times New Roman" w:eastAsia="Times New Roman" w:hAnsi="Times New Roman"/>
+          <w:b w:val="false"/>
+          <w:bCs w:val="false"/>
+          <w:i w:val="false"/>
+          <w:iCs w:val="false"/>
+          <w:sz w:val="24"/>
+          <w:szCs w:val="24"/>
+          <w:rtl w:val="false"/>
+        </w:rPr>
+        <w:t xml:space="preserve">Early teacher-child relationships and the trajectory of children's school outcomes through eighth grade.</w:t>
+      </w:r>
+      <w:r>
+        <w:rPr>
+          <w:rFonts w:ascii="Times New Roman" w:cs="Times New Roman" w:eastAsia="Times New Roman" w:hAnsi="Times New Roman"/>
+          <w:b w:val="false"/>
+          <w:bCs w:val="false"/>
+          <w:i w:val="false"/>
+          <w:iCs w:val="false"/>
+          <w:sz w:val="24"/>
+          <w:szCs w:val="24"/>
+          <w:rtl w:val="false"/>
+        </w:rPr>
+        <w:t xml:space="preserve"> </w:t>
+      </w:r>
+      <w:r>
+        <w:rPr>
+          <w:rFonts w:ascii="Times New Roman" w:cs="Times New Roman" w:eastAsia="Times New Roman" w:hAnsi="Times New Roman"/>
+          <w:b w:val="false"/>
+          <w:bCs w:val="false"/>
+          <w:i/>
+          <w:iCs/>
+          <w:sz w:val="24"/>
+          <w:szCs w:val="24"/>
+          <w:rtl w:val="false"/>
+        </w:rPr>
+        <w:t xml:space="preserve">Child Development</w:t>
+      </w:r>
+      <w:r>
+        <w:rPr>
+          <w:rFonts w:ascii="Times New Roman" w:cs="Times New Roman" w:eastAsia="Times New Roman" w:hAnsi="Times New Roman"/>
+          <w:b w:val="false"/>
+          <w:bCs w:val="false"/>
+          <w:i w:val="false"/>
+          <w:iCs w:val="false"/>
+          <w:sz w:val="24"/>
+          <w:szCs w:val="24"/>
+          <w:rtl w:val="false"/>
+        </w:rPr>
+        <w:t xml:space="preserve">, </w:t>
+      </w:r>
+      <w:r>
+        <w:rPr>
+          <w:rFonts w:ascii="Times New Roman" w:cs="Times New Roman" w:eastAsia="Times New Roman" w:hAnsi="Times New Roman"/>
+          <w:b w:val="false"/>
+          <w:bCs w:val="false"/>
+          <w:i/>
+          <w:iCs/>
+          <w:sz w:val="24"/>
+          <w:szCs w:val="24"/>
+          <w:rtl w:val="false"/>
+        </w:rPr>
+        <w:t xml:space="preserve">72</w:t>
+      </w:r>
+      <w:r>
+        <w:rPr>
+          <w:rFonts w:ascii="Times New Roman" w:cs="Times New Roman" w:eastAsia="Times New Roman" w:hAnsi="Times New Roman"/>
+          <w:b w:val="false"/>
+          <w:bCs w:val="false"/>
+          <w:i w:val="false"/>
+          <w:iCs w:val="false"/>
+          <w:sz w:val="24"/>
+          <w:szCs w:val="24"/>
+          <w:rtl w:val="false"/>
+        </w:rPr>
+        <w:t xml:space="preserve">(2), 625-638.</w:t>
       </w:r>
     </w:p>
     <w:p>
       <w:pPr>
         <w:bidi w:val="false"/>
         <w:spacing w:after="120" w:line="360"/>
-        <w:ind w:left="720" w:hanging="720"/>
+        <w:ind w:left="709" w:hanging="709"/>
         <w:jc w:val="left"/>
       </w:pPr>
       <w:r>
         <w:rPr>
-          <w:rFonts w:ascii="David" w:cs="David" w:eastAsia="David" w:hAnsi="David"/>
-          <w:sz w:val="24"/>
-          <w:szCs w:val="24"/>
-          <w:rtl w:val="false"/>
-        </w:rPr>
-        <w:t xml:space="preserve">Kidger, J., Gunnell, D., Biddle, L., Campbell, R., &amp; Donovan, J. (2010). Part and parcel of teaching? Secondary school staff's views on supporting student emotional health and well-being. British Educational Research Journal, 36(6), 919–935.</w:t>
+          <w:rFonts w:ascii="Times New Roman" w:cs="Times New Roman" w:eastAsia="Times New Roman" w:hAnsi="Times New Roman"/>
+          <w:b w:val="false"/>
+          <w:bCs w:val="false"/>
+          <w:i w:val="false"/>
+          <w:iCs w:val="false"/>
+          <w:sz w:val="24"/>
+          <w:szCs w:val="24"/>
+          <w:rtl w:val="false"/>
+        </w:rPr>
+        <w:t xml:space="preserve">Kidger, J., Gunnell, D., Biddle, L., Campbell, R., &amp; Donovan, J.</w:t>
+      </w:r>
+      <w:r>
+        <w:rPr>
+          <w:rFonts w:ascii="Times New Roman" w:cs="Times New Roman" w:eastAsia="Times New Roman" w:hAnsi="Times New Roman"/>
+          <w:b w:val="false"/>
+          <w:bCs w:val="false"/>
+          <w:i w:val="false"/>
+          <w:iCs w:val="false"/>
+          <w:sz w:val="24"/>
+          <w:szCs w:val="24"/>
+          <w:rtl w:val="false"/>
+        </w:rPr>
+        <w:t xml:space="preserve"> (2010). </w:t>
+      </w:r>
+      <w:r>
+        <w:rPr>
+          <w:rFonts w:ascii="Times New Roman" w:cs="Times New Roman" w:eastAsia="Times New Roman" w:hAnsi="Times New Roman"/>
+          <w:b w:val="false"/>
+          <w:bCs w:val="false"/>
+          <w:i w:val="false"/>
+          <w:iCs w:val="false"/>
+          <w:sz w:val="24"/>
+          <w:szCs w:val="24"/>
+          <w:rtl w:val="false"/>
+        </w:rPr>
+        <w:t xml:space="preserve">Part and parcel of teaching</w:t>
+      </w:r>
+      <w:r>
+        <w:rPr>
+          <w:rFonts w:ascii="Times New Roman" w:cs="Times New Roman" w:eastAsia="Times New Roman" w:hAnsi="Times New Roman"/>
+          <w:b w:val="false"/>
+          <w:bCs w:val="false"/>
+          <w:i w:val="false"/>
+          <w:iCs w:val="false"/>
+          <w:sz w:val="24"/>
+          <w:szCs w:val="24"/>
+          <w:rtl w:val="false"/>
+        </w:rPr>
+        <w:t xml:space="preserve">? </w:t>
+      </w:r>
+      <w:r>
+        <w:rPr>
+          <w:rFonts w:ascii="Times New Roman" w:cs="Times New Roman" w:eastAsia="Times New Roman" w:hAnsi="Times New Roman"/>
+          <w:b w:val="false"/>
+          <w:bCs w:val="false"/>
+          <w:i w:val="false"/>
+          <w:iCs w:val="false"/>
+          <w:sz w:val="24"/>
+          <w:szCs w:val="24"/>
+          <w:rtl w:val="false"/>
+        </w:rPr>
+        <w:t xml:space="preserve">Secondary school staff's views on supporting student emotional health and well-being.</w:t>
+      </w:r>
+      <w:r>
+        <w:rPr>
+          <w:rFonts w:ascii="Times New Roman" w:cs="Times New Roman" w:eastAsia="Times New Roman" w:hAnsi="Times New Roman"/>
+          <w:b w:val="false"/>
+          <w:bCs w:val="false"/>
+          <w:i w:val="false"/>
+          <w:iCs w:val="false"/>
+          <w:sz w:val="24"/>
+          <w:szCs w:val="24"/>
+          <w:rtl w:val="false"/>
+        </w:rPr>
+        <w:t xml:space="preserve"> </w:t>
+      </w:r>
+      <w:r>
+        <w:rPr>
+          <w:rFonts w:ascii="Times New Roman" w:cs="Times New Roman" w:eastAsia="Times New Roman" w:hAnsi="Times New Roman"/>
+          <w:b w:val="false"/>
+          <w:bCs w:val="false"/>
+          <w:i/>
+          <w:iCs/>
+          <w:sz w:val="24"/>
+          <w:szCs w:val="24"/>
+          <w:rtl w:val="false"/>
+        </w:rPr>
+        <w:t xml:space="preserve">British Educational Research Journal</w:t>
+      </w:r>
+      <w:r>
+        <w:rPr>
+          <w:rFonts w:ascii="Times New Roman" w:cs="Times New Roman" w:eastAsia="Times New Roman" w:hAnsi="Times New Roman"/>
+          <w:b w:val="false"/>
+          <w:bCs w:val="false"/>
+          <w:i w:val="false"/>
+          <w:iCs w:val="false"/>
+          <w:sz w:val="24"/>
+          <w:szCs w:val="24"/>
+          <w:rtl w:val="false"/>
+        </w:rPr>
+        <w:t xml:space="preserve">, </w:t>
+      </w:r>
+      <w:r>
+        <w:rPr>
+          <w:rFonts w:ascii="Times New Roman" w:cs="Times New Roman" w:eastAsia="Times New Roman" w:hAnsi="Times New Roman"/>
+          <w:b w:val="false"/>
+          <w:bCs w:val="false"/>
+          <w:i/>
+          <w:iCs/>
+          <w:sz w:val="24"/>
+          <w:szCs w:val="24"/>
+          <w:rtl w:val="false"/>
+        </w:rPr>
+        <w:t xml:space="preserve">36</w:t>
+      </w:r>
+      <w:r>
+        <w:rPr>
+          <w:rFonts w:ascii="Times New Roman" w:cs="Times New Roman" w:eastAsia="Times New Roman" w:hAnsi="Times New Roman"/>
+          <w:b w:val="false"/>
+          <w:bCs w:val="false"/>
+          <w:i w:val="false"/>
+          <w:iCs w:val="false"/>
+          <w:sz w:val="24"/>
+          <w:szCs w:val="24"/>
+          <w:rtl w:val="false"/>
+        </w:rPr>
+        <w:t xml:space="preserve">(6), 919-935.</w:t>
       </w:r>
     </w:p>
     <w:p>
       <w:pPr>
         <w:bidi w:val="false"/>
         <w:spacing w:after="120" w:line="360"/>
-        <w:ind w:left="720" w:hanging="720"/>
+        <w:ind w:left="709" w:hanging="709"/>
         <w:jc w:val="left"/>
       </w:pPr>
       <w:r>
         <w:rPr>
-          <w:rFonts w:ascii="David" w:cs="David" w:eastAsia="David" w:hAnsi="David"/>
-          <w:sz w:val="24"/>
-          <w:szCs w:val="24"/>
-          <w:rtl w:val="false"/>
-        </w:rPr>
-        <w:t xml:space="preserve">Loades, M. E., &amp; Mastroyannopoulou, K. (2010). Teachers' recognition of children's mental health problems. Child and Adolescent Mental Health, 15(3), 150–156.</w:t>
+          <w:rFonts w:ascii="Times New Roman" w:cs="Times New Roman" w:eastAsia="Times New Roman" w:hAnsi="Times New Roman"/>
+          <w:b w:val="false"/>
+          <w:bCs w:val="false"/>
+          <w:i w:val="false"/>
+          <w:iCs w:val="false"/>
+          <w:sz w:val="24"/>
+          <w:szCs w:val="24"/>
+          <w:rtl w:val="false"/>
+        </w:rPr>
+        <w:t xml:space="preserve">Loades, M. E., &amp; Mastroyannopoulou, K.</w:t>
+      </w:r>
+      <w:r>
+        <w:rPr>
+          <w:rFonts w:ascii="Times New Roman" w:cs="Times New Roman" w:eastAsia="Times New Roman" w:hAnsi="Times New Roman"/>
+          <w:b w:val="false"/>
+          <w:bCs w:val="false"/>
+          <w:i w:val="false"/>
+          <w:iCs w:val="false"/>
+          <w:sz w:val="24"/>
+          <w:szCs w:val="24"/>
+          <w:rtl w:val="false"/>
+        </w:rPr>
+        <w:t xml:space="preserve"> (2010). </w:t>
+      </w:r>
+      <w:r>
+        <w:rPr>
+          <w:rFonts w:ascii="Times New Roman" w:cs="Times New Roman" w:eastAsia="Times New Roman" w:hAnsi="Times New Roman"/>
+          <w:b w:val="false"/>
+          <w:bCs w:val="false"/>
+          <w:i w:val="false"/>
+          <w:iCs w:val="false"/>
+          <w:sz w:val="24"/>
+          <w:szCs w:val="24"/>
+          <w:rtl w:val="false"/>
+        </w:rPr>
+        <w:t xml:space="preserve">Teachers' recognition of children's mental health problems.</w:t>
+      </w:r>
+      <w:r>
+        <w:rPr>
+          <w:rFonts w:ascii="Times New Roman" w:cs="Times New Roman" w:eastAsia="Times New Roman" w:hAnsi="Times New Roman"/>
+          <w:b w:val="false"/>
+          <w:bCs w:val="false"/>
+          <w:i w:val="false"/>
+          <w:iCs w:val="false"/>
+          <w:sz w:val="24"/>
+          <w:szCs w:val="24"/>
+          <w:rtl w:val="false"/>
+        </w:rPr>
+        <w:t xml:space="preserve"> </w:t>
+      </w:r>
+      <w:r>
+        <w:rPr>
+          <w:rFonts w:ascii="Times New Roman" w:cs="Times New Roman" w:eastAsia="Times New Roman" w:hAnsi="Times New Roman"/>
+          <w:b w:val="false"/>
+          <w:bCs w:val="false"/>
+          <w:i/>
+          <w:iCs/>
+          <w:sz w:val="24"/>
+          <w:szCs w:val="24"/>
+          <w:rtl w:val="false"/>
+        </w:rPr>
+        <w:t xml:space="preserve">Child and Adolescent Mental Health</w:t>
+      </w:r>
+      <w:r>
+        <w:rPr>
+          <w:rFonts w:ascii="Times New Roman" w:cs="Times New Roman" w:eastAsia="Times New Roman" w:hAnsi="Times New Roman"/>
+          <w:b w:val="false"/>
+          <w:bCs w:val="false"/>
+          <w:i w:val="false"/>
+          <w:iCs w:val="false"/>
+          <w:sz w:val="24"/>
+          <w:szCs w:val="24"/>
+          <w:rtl w:val="false"/>
+        </w:rPr>
+        <w:t xml:space="preserve">, </w:t>
+      </w:r>
+      <w:r>
+        <w:rPr>
+          <w:rFonts w:ascii="Times New Roman" w:cs="Times New Roman" w:eastAsia="Times New Roman" w:hAnsi="Times New Roman"/>
+          <w:b w:val="false"/>
+          <w:bCs w:val="false"/>
+          <w:i/>
+          <w:iCs/>
+          <w:sz w:val="24"/>
+          <w:szCs w:val="24"/>
+          <w:rtl w:val="false"/>
+        </w:rPr>
+        <w:t xml:space="preserve">15</w:t>
+      </w:r>
+      <w:r>
+        <w:rPr>
+          <w:rFonts w:ascii="Times New Roman" w:cs="Times New Roman" w:eastAsia="Times New Roman" w:hAnsi="Times New Roman"/>
+          <w:b w:val="false"/>
+          <w:bCs w:val="false"/>
+          <w:i w:val="false"/>
+          <w:iCs w:val="false"/>
+          <w:sz w:val="24"/>
+          <w:szCs w:val="24"/>
+          <w:rtl w:val="false"/>
+        </w:rPr>
+        <w:t xml:space="preserve">(3), 150-156.</w:t>
       </w:r>
     </w:p>
     <w:p>
       <w:pPr>
         <w:bidi w:val="false"/>
         <w:spacing w:after="120" w:line="360"/>
-        <w:ind w:left="720" w:hanging="720"/>
+        <w:ind w:left="709" w:hanging="709"/>
         <w:jc w:val="left"/>
       </w:pPr>
       <w:r>
         <w:rPr>
-          <w:rFonts w:ascii="David" w:cs="David" w:eastAsia="David" w:hAnsi="David"/>
-          <w:sz w:val="24"/>
-          <w:szCs w:val="24"/>
-          <w:rtl w:val="false"/>
-        </w:rPr>
-        <w:t xml:space="preserve">Noddings, N. (1984). Caring: A feminine approach to ethics and moral education. Berkeley, CA: University of California Press.</w:t>
+          <w:rFonts w:ascii="Times New Roman" w:cs="Times New Roman" w:eastAsia="Times New Roman" w:hAnsi="Times New Roman"/>
+          <w:b w:val="false"/>
+          <w:bCs w:val="false"/>
+          <w:i w:val="false"/>
+          <w:iCs w:val="false"/>
+          <w:sz w:val="24"/>
+          <w:szCs w:val="24"/>
+          <w:rtl w:val="false"/>
+        </w:rPr>
+        <w:t xml:space="preserve">Noddings, N.</w:t>
+      </w:r>
+      <w:r>
+        <w:rPr>
+          <w:rFonts w:ascii="Times New Roman" w:cs="Times New Roman" w:eastAsia="Times New Roman" w:hAnsi="Times New Roman"/>
+          <w:b w:val="false"/>
+          <w:bCs w:val="false"/>
+          <w:i w:val="false"/>
+          <w:iCs w:val="false"/>
+          <w:sz w:val="24"/>
+          <w:szCs w:val="24"/>
+          <w:rtl w:val="false"/>
+        </w:rPr>
+        <w:t xml:space="preserve"> (1984). </w:t>
+      </w:r>
+      <w:r>
+        <w:rPr>
+          <w:rFonts w:ascii="Times New Roman" w:cs="Times New Roman" w:eastAsia="Times New Roman" w:hAnsi="Times New Roman"/>
+          <w:b w:val="false"/>
+          <w:bCs w:val="false"/>
+          <w:i/>
+          <w:iCs/>
+          <w:sz w:val="24"/>
+          <w:szCs w:val="24"/>
+          <w:rtl w:val="false"/>
+        </w:rPr>
+        <w:t xml:space="preserve">Caring: A feminine approach to ethics and moral education</w:t>
+      </w:r>
+      <w:r>
+        <w:rPr>
+          <w:rFonts w:ascii="Times New Roman" w:cs="Times New Roman" w:eastAsia="Times New Roman" w:hAnsi="Times New Roman"/>
+          <w:b w:val="false"/>
+          <w:bCs w:val="false"/>
+          <w:i w:val="false"/>
+          <w:iCs w:val="false"/>
+          <w:sz w:val="24"/>
+          <w:szCs w:val="24"/>
+          <w:rtl w:val="false"/>
+        </w:rPr>
+        <w:t xml:space="preserve">. </w:t>
+      </w:r>
+      <w:r>
+        <w:rPr>
+          <w:rFonts w:ascii="Times New Roman" w:cs="Times New Roman" w:eastAsia="Times New Roman" w:hAnsi="Times New Roman"/>
+          <w:b w:val="false"/>
+          <w:bCs w:val="false"/>
+          <w:i w:val="false"/>
+          <w:iCs w:val="false"/>
+          <w:sz w:val="24"/>
+          <w:szCs w:val="24"/>
+          <w:rtl w:val="false"/>
+        </w:rPr>
+        <w:t xml:space="preserve">University of California Press.</w:t>
       </w:r>
     </w:p>
     <w:p>
       <w:pPr>
         <w:bidi w:val="false"/>
         <w:spacing w:after="120" w:line="360"/>
-        <w:ind w:left="720" w:hanging="720"/>
+        <w:ind w:left="709" w:hanging="709"/>
         <w:jc w:val="left"/>
       </w:pPr>
       <w:r>
         <w:rPr>
-          <w:rFonts w:ascii="David" w:cs="David" w:eastAsia="David" w:hAnsi="David"/>
-          <w:sz w:val="24"/>
-          <w:szCs w:val="24"/>
-          <w:rtl w:val="false"/>
-        </w:rPr>
-        <w:t xml:space="preserve">Noddings, N. (2005). The challenge to care in schools: An alternative approach to education (2nd ed.). New York: Teachers College Press.</w:t>
+          <w:rFonts w:ascii="Times New Roman" w:cs="Times New Roman" w:eastAsia="Times New Roman" w:hAnsi="Times New Roman"/>
+          <w:b w:val="false"/>
+          <w:bCs w:val="false"/>
+          <w:i w:val="false"/>
+          <w:iCs w:val="false"/>
+          <w:sz w:val="24"/>
+          <w:szCs w:val="24"/>
+          <w:rtl w:val="false"/>
+        </w:rPr>
+        <w:t xml:space="preserve">Noddings, N.</w:t>
+      </w:r>
+      <w:r>
+        <w:rPr>
+          <w:rFonts w:ascii="Times New Roman" w:cs="Times New Roman" w:eastAsia="Times New Roman" w:hAnsi="Times New Roman"/>
+          <w:b w:val="false"/>
+          <w:bCs w:val="false"/>
+          <w:i w:val="false"/>
+          <w:iCs w:val="false"/>
+          <w:sz w:val="24"/>
+          <w:szCs w:val="24"/>
+          <w:rtl w:val="false"/>
+        </w:rPr>
+        <w:t xml:space="preserve"> (2005). </w:t>
+      </w:r>
+      <w:r>
+        <w:rPr>
+          <w:rFonts w:ascii="Times New Roman" w:cs="Times New Roman" w:eastAsia="Times New Roman" w:hAnsi="Times New Roman"/>
+          <w:b w:val="false"/>
+          <w:bCs w:val="false"/>
+          <w:i/>
+          <w:iCs/>
+          <w:sz w:val="24"/>
+          <w:szCs w:val="24"/>
+          <w:rtl w:val="false"/>
+        </w:rPr>
+        <w:t xml:space="preserve">The challenge to care in schools: An alternative approach to education</w:t>
+      </w:r>
+      <w:r>
+        <w:rPr>
+          <w:rFonts w:ascii="Times New Roman" w:cs="Times New Roman" w:eastAsia="Times New Roman" w:hAnsi="Times New Roman"/>
+          <w:b w:val="false"/>
+          <w:bCs w:val="false"/>
+          <w:i w:val="false"/>
+          <w:iCs w:val="false"/>
+          <w:sz w:val="24"/>
+          <w:szCs w:val="24"/>
+          <w:rtl w:val="false"/>
+        </w:rPr>
+        <w:t xml:space="preserve"> (2</w:t>
+      </w:r>
+      <w:r>
+        <w:rPr>
+          <w:rFonts w:ascii="Times New Roman" w:cs="Times New Roman" w:eastAsia="Times New Roman" w:hAnsi="Times New Roman"/>
+          <w:b w:val="false"/>
+          <w:bCs w:val="false"/>
+          <w:i w:val="false"/>
+          <w:iCs w:val="false"/>
+          <w:sz w:val="24"/>
+          <w:szCs w:val="24"/>
+          <w:rtl w:val="false"/>
+        </w:rPr>
+        <w:t xml:space="preserve">nd ed.</w:t>
+      </w:r>
+      <w:r>
+        <w:rPr>
+          <w:rFonts w:ascii="Times New Roman" w:cs="Times New Roman" w:eastAsia="Times New Roman" w:hAnsi="Times New Roman"/>
+          <w:b w:val="false"/>
+          <w:bCs w:val="false"/>
+          <w:i w:val="false"/>
+          <w:iCs w:val="false"/>
+          <w:sz w:val="24"/>
+          <w:szCs w:val="24"/>
+          <w:rtl w:val="false"/>
+        </w:rPr>
+        <w:t xml:space="preserve">). </w:t>
+      </w:r>
+      <w:r>
+        <w:rPr>
+          <w:rFonts w:ascii="Times New Roman" w:cs="Times New Roman" w:eastAsia="Times New Roman" w:hAnsi="Times New Roman"/>
+          <w:b w:val="false"/>
+          <w:bCs w:val="false"/>
+          <w:i w:val="false"/>
+          <w:iCs w:val="false"/>
+          <w:sz w:val="24"/>
+          <w:szCs w:val="24"/>
+          <w:rtl w:val="false"/>
+        </w:rPr>
+        <w:t xml:space="preserve">Teachers College Press.</w:t>
       </w:r>
     </w:p>
     <w:p>
       <w:pPr>
         <w:bidi w:val="false"/>
         <w:spacing w:after="120" w:line="360"/>
-        <w:ind w:left="720" w:hanging="720"/>
+        <w:ind w:left="709" w:hanging="709"/>
         <w:jc w:val="left"/>
       </w:pPr>
       <w:r>
         <w:rPr>
-          <w:rFonts w:ascii="David" w:cs="David" w:eastAsia="David" w:hAnsi="David"/>
-          <w:sz w:val="24"/>
-          <w:szCs w:val="24"/>
-          <w:rtl w:val="false"/>
-        </w:rPr>
-        <w:t xml:space="preserve">Pianta, R. C. (1999). Enhancing relationships between children and teachers. Washington, DC: American Psychological Association.</w:t>
+          <w:rFonts w:ascii="Times New Roman" w:cs="Times New Roman" w:eastAsia="Times New Roman" w:hAnsi="Times New Roman"/>
+          <w:b w:val="false"/>
+          <w:bCs w:val="false"/>
+          <w:i w:val="false"/>
+          <w:iCs w:val="false"/>
+          <w:sz w:val="24"/>
+          <w:szCs w:val="24"/>
+          <w:rtl w:val="false"/>
+        </w:rPr>
+        <w:t xml:space="preserve">Pianta, R. C.</w:t>
+      </w:r>
+      <w:r>
+        <w:rPr>
+          <w:rFonts w:ascii="Times New Roman" w:cs="Times New Roman" w:eastAsia="Times New Roman" w:hAnsi="Times New Roman"/>
+          <w:b w:val="false"/>
+          <w:bCs w:val="false"/>
+          <w:i w:val="false"/>
+          <w:iCs w:val="false"/>
+          <w:sz w:val="24"/>
+          <w:szCs w:val="24"/>
+          <w:rtl w:val="false"/>
+        </w:rPr>
+        <w:t xml:space="preserve"> (1999). </w:t>
+      </w:r>
+      <w:r>
+        <w:rPr>
+          <w:rFonts w:ascii="Times New Roman" w:cs="Times New Roman" w:eastAsia="Times New Roman" w:hAnsi="Times New Roman"/>
+          <w:b w:val="false"/>
+          <w:bCs w:val="false"/>
+          <w:i/>
+          <w:iCs/>
+          <w:sz w:val="24"/>
+          <w:szCs w:val="24"/>
+          <w:rtl w:val="false"/>
+        </w:rPr>
+        <w:t xml:space="preserve">Enhancing relationships between children and teachers</w:t>
+      </w:r>
+      <w:r>
+        <w:rPr>
+          <w:rFonts w:ascii="Times New Roman" w:cs="Times New Roman" w:eastAsia="Times New Roman" w:hAnsi="Times New Roman"/>
+          <w:b w:val="false"/>
+          <w:bCs w:val="false"/>
+          <w:i w:val="false"/>
+          <w:iCs w:val="false"/>
+          <w:sz w:val="24"/>
+          <w:szCs w:val="24"/>
+          <w:rtl w:val="false"/>
+        </w:rPr>
+        <w:t xml:space="preserve">. </w:t>
+      </w:r>
+      <w:r>
+        <w:rPr>
+          <w:rFonts w:ascii="Times New Roman" w:cs="Times New Roman" w:eastAsia="Times New Roman" w:hAnsi="Times New Roman"/>
+          <w:b w:val="false"/>
+          <w:bCs w:val="false"/>
+          <w:i w:val="false"/>
+          <w:iCs w:val="false"/>
+          <w:sz w:val="24"/>
+          <w:szCs w:val="24"/>
+          <w:rtl w:val="false"/>
+        </w:rPr>
+        <w:t xml:space="preserve">American Psychological Association.</w:t>
       </w:r>
     </w:p>
     <w:p>
       <w:pPr>
         <w:bidi w:val="false"/>
         <w:spacing w:after="120" w:line="360"/>
-        <w:ind w:left="720" w:hanging="720"/>
+        <w:ind w:left="709" w:hanging="709"/>
         <w:jc w:val="left"/>
       </w:pPr>
       <w:r>
         <w:rPr>
-          <w:rFonts w:ascii="David" w:cs="David" w:eastAsia="David" w:hAnsi="David"/>
-          <w:sz w:val="24"/>
-          <w:szCs w:val="24"/>
-          <w:rtl w:val="false"/>
-        </w:rPr>
-        <w:t xml:space="preserve">Reinke, W. M., Stormont, M., Herman, K. C., Puri, R., &amp; Goel, N. (2011). Supporting children's mental health in schools: Teacher perceptions of needs, roles, and barriers. School Psychology Quarterly, 26(1), 1–13.</w:t>
+          <w:rFonts w:ascii="Times New Roman" w:cs="Times New Roman" w:eastAsia="Times New Roman" w:hAnsi="Times New Roman"/>
+          <w:b w:val="false"/>
+          <w:bCs w:val="false"/>
+          <w:i w:val="false"/>
+          <w:iCs w:val="false"/>
+          <w:sz w:val="24"/>
+          <w:szCs w:val="24"/>
+          <w:rtl w:val="false"/>
+        </w:rPr>
+        <w:t xml:space="preserve">Reinke, W. M., Stormont, M., Herman, K. C., Puri, R., &amp; Goel, N.</w:t>
+      </w:r>
+      <w:r>
+        <w:rPr>
+          <w:rFonts w:ascii="Times New Roman" w:cs="Times New Roman" w:eastAsia="Times New Roman" w:hAnsi="Times New Roman"/>
+          <w:b w:val="false"/>
+          <w:bCs w:val="false"/>
+          <w:i w:val="false"/>
+          <w:iCs w:val="false"/>
+          <w:sz w:val="24"/>
+          <w:szCs w:val="24"/>
+          <w:rtl w:val="false"/>
+        </w:rPr>
+        <w:t xml:space="preserve"> (2011). </w:t>
+      </w:r>
+      <w:r>
+        <w:rPr>
+          <w:rFonts w:ascii="Times New Roman" w:cs="Times New Roman" w:eastAsia="Times New Roman" w:hAnsi="Times New Roman"/>
+          <w:b w:val="false"/>
+          <w:bCs w:val="false"/>
+          <w:i w:val="false"/>
+          <w:iCs w:val="false"/>
+          <w:sz w:val="24"/>
+          <w:szCs w:val="24"/>
+          <w:rtl w:val="false"/>
+        </w:rPr>
+        <w:t xml:space="preserve">Supporting children's mental health in schools: Teacher perceptions of needs, roles, and barriers.</w:t>
+      </w:r>
+      <w:r>
+        <w:rPr>
+          <w:rFonts w:ascii="Times New Roman" w:cs="Times New Roman" w:eastAsia="Times New Roman" w:hAnsi="Times New Roman"/>
+          <w:b w:val="false"/>
+          <w:bCs w:val="false"/>
+          <w:i w:val="false"/>
+          <w:iCs w:val="false"/>
+          <w:sz w:val="24"/>
+          <w:szCs w:val="24"/>
+          <w:rtl w:val="false"/>
+        </w:rPr>
+        <w:t xml:space="preserve"> </w:t>
+      </w:r>
+      <w:r>
+        <w:rPr>
+          <w:rFonts w:ascii="Times New Roman" w:cs="Times New Roman" w:eastAsia="Times New Roman" w:hAnsi="Times New Roman"/>
+          <w:b w:val="false"/>
+          <w:bCs w:val="false"/>
+          <w:i/>
+          <w:iCs/>
+          <w:sz w:val="24"/>
+          <w:szCs w:val="24"/>
+          <w:rtl w:val="false"/>
+        </w:rPr>
+        <w:t xml:space="preserve">School Psychology Quarterly</w:t>
+      </w:r>
+      <w:r>
+        <w:rPr>
+          <w:rFonts w:ascii="Times New Roman" w:cs="Times New Roman" w:eastAsia="Times New Roman" w:hAnsi="Times New Roman"/>
+          <w:b w:val="false"/>
+          <w:bCs w:val="false"/>
+          <w:i w:val="false"/>
+          <w:iCs w:val="false"/>
+          <w:sz w:val="24"/>
+          <w:szCs w:val="24"/>
+          <w:rtl w:val="false"/>
+        </w:rPr>
+        <w:t xml:space="preserve">, </w:t>
+      </w:r>
+      <w:r>
+        <w:rPr>
+          <w:rFonts w:ascii="Times New Roman" w:cs="Times New Roman" w:eastAsia="Times New Roman" w:hAnsi="Times New Roman"/>
+          <w:b w:val="false"/>
+          <w:bCs w:val="false"/>
+          <w:i/>
+          <w:iCs/>
+          <w:sz w:val="24"/>
+          <w:szCs w:val="24"/>
+          <w:rtl w:val="false"/>
+        </w:rPr>
+        <w:t xml:space="preserve">26</w:t>
+      </w:r>
+      <w:r>
+        <w:rPr>
+          <w:rFonts w:ascii="Times New Roman" w:cs="Times New Roman" w:eastAsia="Times New Roman" w:hAnsi="Times New Roman"/>
+          <w:b w:val="false"/>
+          <w:bCs w:val="false"/>
+          <w:i w:val="false"/>
+          <w:iCs w:val="false"/>
+          <w:sz w:val="24"/>
+          <w:szCs w:val="24"/>
+          <w:rtl w:val="false"/>
+        </w:rPr>
+        <w:t xml:space="preserve">(1), 1-13.</w:t>
       </w:r>
     </w:p>
     <w:p>
       <w:pPr>
         <w:bidi w:val="false"/>
         <w:spacing w:after="120" w:line="360"/>
-        <w:ind w:left="720" w:hanging="720"/>
+        <w:ind w:left="709" w:hanging="709"/>
         <w:jc w:val="left"/>
       </w:pPr>
       <w:r>
         <w:rPr>
-          <w:rFonts w:ascii="David" w:cs="David" w:eastAsia="David" w:hAnsi="David"/>
-          <w:sz w:val="24"/>
-          <w:szCs w:val="24"/>
-          <w:rtl w:val="false"/>
-        </w:rPr>
-        <w:t xml:space="preserve">Roorda, D. L., Koomen, H. M. Y., Spilt, J. L., &amp; Oort, F. J. (2011). The influence of affective teacher–student relationships on students' school engagement and achievement: A meta-analytic approach. Review of Educational Research, 81(4), 493–529.</w:t>
+          <w:rFonts w:ascii="Times New Roman" w:cs="Times New Roman" w:eastAsia="Times New Roman" w:hAnsi="Times New Roman"/>
+          <w:b w:val="false"/>
+          <w:bCs w:val="false"/>
+          <w:i w:val="false"/>
+          <w:iCs w:val="false"/>
+          <w:sz w:val="24"/>
+          <w:szCs w:val="24"/>
+          <w:rtl w:val="false"/>
+        </w:rPr>
+        <w:t xml:space="preserve">Roorda, D. L., Koomen, H. M. Y., Spilt, J. L., &amp; Oort, F. J.</w:t>
+      </w:r>
+      <w:r>
+        <w:rPr>
+          <w:rFonts w:ascii="Times New Roman" w:cs="Times New Roman" w:eastAsia="Times New Roman" w:hAnsi="Times New Roman"/>
+          <w:b w:val="false"/>
+          <w:bCs w:val="false"/>
+          <w:i w:val="false"/>
+          <w:iCs w:val="false"/>
+          <w:sz w:val="24"/>
+          <w:szCs w:val="24"/>
+          <w:rtl w:val="false"/>
+        </w:rPr>
+        <w:t xml:space="preserve"> (2011). </w:t>
+      </w:r>
+      <w:r>
+        <w:rPr>
+          <w:rFonts w:ascii="Times New Roman" w:cs="Times New Roman" w:eastAsia="Times New Roman" w:hAnsi="Times New Roman"/>
+          <w:b w:val="false"/>
+          <w:bCs w:val="false"/>
+          <w:i w:val="false"/>
+          <w:iCs w:val="false"/>
+          <w:sz w:val="24"/>
+          <w:szCs w:val="24"/>
+          <w:rtl w:val="false"/>
+        </w:rPr>
+        <w:t xml:space="preserve">The influence of affective teacher-student relationships on students' school engagement and achievement: A meta-analytic approach.</w:t>
+      </w:r>
+      <w:r>
+        <w:rPr>
+          <w:rFonts w:ascii="Times New Roman" w:cs="Times New Roman" w:eastAsia="Times New Roman" w:hAnsi="Times New Roman"/>
+          <w:b w:val="false"/>
+          <w:bCs w:val="false"/>
+          <w:i w:val="false"/>
+          <w:iCs w:val="false"/>
+          <w:sz w:val="24"/>
+          <w:szCs w:val="24"/>
+          <w:rtl w:val="false"/>
+        </w:rPr>
+        <w:t xml:space="preserve"> </w:t>
+      </w:r>
+      <w:r>
+        <w:rPr>
+          <w:rFonts w:ascii="Times New Roman" w:cs="Times New Roman" w:eastAsia="Times New Roman" w:hAnsi="Times New Roman"/>
+          <w:b w:val="false"/>
+          <w:bCs w:val="false"/>
+          <w:i/>
+          <w:iCs/>
+          <w:sz w:val="24"/>
+          <w:szCs w:val="24"/>
+          <w:rtl w:val="false"/>
+        </w:rPr>
+        <w:t xml:space="preserve">Review of Educational Research</w:t>
+      </w:r>
+      <w:r>
+        <w:rPr>
+          <w:rFonts w:ascii="Times New Roman" w:cs="Times New Roman" w:eastAsia="Times New Roman" w:hAnsi="Times New Roman"/>
+          <w:b w:val="false"/>
+          <w:bCs w:val="false"/>
+          <w:i w:val="false"/>
+          <w:iCs w:val="false"/>
+          <w:sz w:val="24"/>
+          <w:szCs w:val="24"/>
+          <w:rtl w:val="false"/>
+        </w:rPr>
+        <w:t xml:space="preserve">, </w:t>
+      </w:r>
+      <w:r>
+        <w:rPr>
+          <w:rFonts w:ascii="Times New Roman" w:cs="Times New Roman" w:eastAsia="Times New Roman" w:hAnsi="Times New Roman"/>
+          <w:b w:val="false"/>
+          <w:bCs w:val="false"/>
+          <w:i/>
+          <w:iCs/>
+          <w:sz w:val="24"/>
+          <w:szCs w:val="24"/>
+          <w:rtl w:val="false"/>
+        </w:rPr>
+        <w:t xml:space="preserve">81</w:t>
+      </w:r>
+      <w:r>
+        <w:rPr>
+          <w:rFonts w:ascii="Times New Roman" w:cs="Times New Roman" w:eastAsia="Times New Roman" w:hAnsi="Times New Roman"/>
+          <w:b w:val="false"/>
+          <w:bCs w:val="false"/>
+          <w:i w:val="false"/>
+          <w:iCs w:val="false"/>
+          <w:sz w:val="24"/>
+          <w:szCs w:val="24"/>
+          <w:rtl w:val="false"/>
+        </w:rPr>
+        <w:t xml:space="preserve">(4), 493-529.</w:t>
       </w:r>
     </w:p>
     <w:p>
       <w:pPr>
         <w:bidi w:val="false"/>
         <w:spacing w:after="120" w:line="360"/>
-        <w:ind w:left="720" w:hanging="720"/>
+        <w:ind w:left="709" w:hanging="709"/>
         <w:jc w:val="left"/>
       </w:pPr>
       <w:r>
         <w:rPr>
-          <w:rFonts w:ascii="David" w:cs="David" w:eastAsia="David" w:hAnsi="David"/>
-          <w:sz w:val="24"/>
-          <w:szCs w:val="24"/>
-          <w:rtl w:val="false"/>
-        </w:rPr>
-        <w:t xml:space="preserve">Rothì, D. M., Leavey, G., &amp; Best, R. (2008). On the front-line: Teachers as active observers of pupils' mental health. Teaching and Teacher Education, 24(5), 1217–1231.</w:t>
+          <w:rFonts w:ascii="Times New Roman" w:cs="Times New Roman" w:eastAsia="Times New Roman" w:hAnsi="Times New Roman"/>
+          <w:b w:val="false"/>
+          <w:bCs w:val="false"/>
+          <w:i w:val="false"/>
+          <w:iCs w:val="false"/>
+          <w:sz w:val="24"/>
+          <w:szCs w:val="24"/>
+          <w:rtl w:val="false"/>
+        </w:rPr>
+        <w:t xml:space="preserve">Roth</w:t>
+      </w:r>
+      <w:r>
+        <w:rPr>
+          <w:rFonts w:ascii="Times New Roman" w:cs="Times New Roman" w:eastAsia="Times New Roman" w:hAnsi="Times New Roman"/>
+          <w:b w:val="false"/>
+          <w:bCs w:val="false"/>
+          <w:i w:val="false"/>
+          <w:iCs w:val="false"/>
+          <w:sz w:val="24"/>
+          <w:szCs w:val="24"/>
+          <w:rtl w:val="false"/>
+        </w:rPr>
+        <w:t xml:space="preserve">ì, </w:t>
+      </w:r>
+      <w:r>
+        <w:rPr>
+          <w:rFonts w:ascii="Times New Roman" w:cs="Times New Roman" w:eastAsia="Times New Roman" w:hAnsi="Times New Roman"/>
+          <w:b w:val="false"/>
+          <w:bCs w:val="false"/>
+          <w:i w:val="false"/>
+          <w:iCs w:val="false"/>
+          <w:sz w:val="24"/>
+          <w:szCs w:val="24"/>
+          <w:rtl w:val="false"/>
+        </w:rPr>
+        <w:t xml:space="preserve">D. M., Leavey, G., &amp; Best, R.</w:t>
+      </w:r>
+      <w:r>
+        <w:rPr>
+          <w:rFonts w:ascii="Times New Roman" w:cs="Times New Roman" w:eastAsia="Times New Roman" w:hAnsi="Times New Roman"/>
+          <w:b w:val="false"/>
+          <w:bCs w:val="false"/>
+          <w:i w:val="false"/>
+          <w:iCs w:val="false"/>
+          <w:sz w:val="24"/>
+          <w:szCs w:val="24"/>
+          <w:rtl w:val="false"/>
+        </w:rPr>
+        <w:t xml:space="preserve"> (2008). </w:t>
+      </w:r>
+      <w:r>
+        <w:rPr>
+          <w:rFonts w:ascii="Times New Roman" w:cs="Times New Roman" w:eastAsia="Times New Roman" w:hAnsi="Times New Roman"/>
+          <w:b w:val="false"/>
+          <w:bCs w:val="false"/>
+          <w:i w:val="false"/>
+          <w:iCs w:val="false"/>
+          <w:sz w:val="24"/>
+          <w:szCs w:val="24"/>
+          <w:rtl w:val="false"/>
+        </w:rPr>
+        <w:t xml:space="preserve">On the front-line: Teachers as active observers of pupils' mental health.</w:t>
+      </w:r>
+      <w:r>
+        <w:rPr>
+          <w:rFonts w:ascii="Times New Roman" w:cs="Times New Roman" w:eastAsia="Times New Roman" w:hAnsi="Times New Roman"/>
+          <w:b w:val="false"/>
+          <w:bCs w:val="false"/>
+          <w:i w:val="false"/>
+          <w:iCs w:val="false"/>
+          <w:sz w:val="24"/>
+          <w:szCs w:val="24"/>
+          <w:rtl w:val="false"/>
+        </w:rPr>
+        <w:t xml:space="preserve"> </w:t>
+      </w:r>
+      <w:r>
+        <w:rPr>
+          <w:rFonts w:ascii="Times New Roman" w:cs="Times New Roman" w:eastAsia="Times New Roman" w:hAnsi="Times New Roman"/>
+          <w:b w:val="false"/>
+          <w:bCs w:val="false"/>
+          <w:i/>
+          <w:iCs/>
+          <w:sz w:val="24"/>
+          <w:szCs w:val="24"/>
+          <w:rtl w:val="false"/>
+        </w:rPr>
+        <w:t xml:space="preserve">Teaching and Teacher Education</w:t>
+      </w:r>
+      <w:r>
+        <w:rPr>
+          <w:rFonts w:ascii="Times New Roman" w:cs="Times New Roman" w:eastAsia="Times New Roman" w:hAnsi="Times New Roman"/>
+          <w:b w:val="false"/>
+          <w:bCs w:val="false"/>
+          <w:i w:val="false"/>
+          <w:iCs w:val="false"/>
+          <w:sz w:val="24"/>
+          <w:szCs w:val="24"/>
+          <w:rtl w:val="false"/>
+        </w:rPr>
+        <w:t xml:space="preserve">, </w:t>
+      </w:r>
+      <w:r>
+        <w:rPr>
+          <w:rFonts w:ascii="Times New Roman" w:cs="Times New Roman" w:eastAsia="Times New Roman" w:hAnsi="Times New Roman"/>
+          <w:b w:val="false"/>
+          <w:bCs w:val="false"/>
+          <w:i/>
+          <w:iCs/>
+          <w:sz w:val="24"/>
+          <w:szCs w:val="24"/>
+          <w:rtl w:val="false"/>
+        </w:rPr>
+        <w:t xml:space="preserve">24</w:t>
+      </w:r>
+      <w:r>
+        <w:rPr>
+          <w:rFonts w:ascii="Times New Roman" w:cs="Times New Roman" w:eastAsia="Times New Roman" w:hAnsi="Times New Roman"/>
+          <w:b w:val="false"/>
+          <w:bCs w:val="false"/>
+          <w:i w:val="false"/>
+          <w:iCs w:val="false"/>
+          <w:sz w:val="24"/>
+          <w:szCs w:val="24"/>
+          <w:rtl w:val="false"/>
+        </w:rPr>
+        <w:t xml:space="preserve">(5), 1217-1231.</w:t>
       </w:r>
     </w:p>
     <w:p>
       <w:pPr>
         <w:bidi w:val="false"/>
         <w:spacing w:after="120" w:line="360"/>
-        <w:ind w:left="720" w:hanging="720"/>
+        <w:ind w:left="709" w:hanging="709"/>
         <w:jc w:val="left"/>
       </w:pPr>
       <w:r>
         <w:rPr>
-          <w:rFonts w:ascii="David" w:cs="David" w:eastAsia="David" w:hAnsi="David"/>
-          <w:sz w:val="24"/>
-          <w:szCs w:val="24"/>
-          <w:rtl w:val="false"/>
-        </w:rPr>
-        <w:t xml:space="preserve">Splett, J. W., Garzona, M., Gibson, N., Wojtalewicz, D., Raborn, A., &amp; Reinke, W. M. (2019). Teacher recognition, concern, and referral of children's internalizing and externalizing behavior problems. School Mental Health, 11(2), 228–239.</w:t>
+          <w:rFonts w:ascii="Times New Roman" w:cs="Times New Roman" w:eastAsia="Times New Roman" w:hAnsi="Times New Roman"/>
+          <w:b w:val="false"/>
+          <w:bCs w:val="false"/>
+          <w:i w:val="false"/>
+          <w:iCs w:val="false"/>
+          <w:sz w:val="24"/>
+          <w:szCs w:val="24"/>
+          <w:rtl w:val="false"/>
+        </w:rPr>
+        <w:t xml:space="preserve">Splett, J. W., Garzona, M., Gibson, N., Wojtalewicz, D., Raborn, A., &amp; Reinke, W. M.</w:t>
+      </w:r>
+      <w:r>
+        <w:rPr>
+          <w:rFonts w:ascii="Times New Roman" w:cs="Times New Roman" w:eastAsia="Times New Roman" w:hAnsi="Times New Roman"/>
+          <w:b w:val="false"/>
+          <w:bCs w:val="false"/>
+          <w:i w:val="false"/>
+          <w:iCs w:val="false"/>
+          <w:sz w:val="24"/>
+          <w:szCs w:val="24"/>
+          <w:rtl w:val="false"/>
+        </w:rPr>
+        <w:t xml:space="preserve"> (2019). </w:t>
+      </w:r>
+      <w:r>
+        <w:rPr>
+          <w:rFonts w:ascii="Times New Roman" w:cs="Times New Roman" w:eastAsia="Times New Roman" w:hAnsi="Times New Roman"/>
+          <w:b w:val="false"/>
+          <w:bCs w:val="false"/>
+          <w:i w:val="false"/>
+          <w:iCs w:val="false"/>
+          <w:sz w:val="24"/>
+          <w:szCs w:val="24"/>
+          <w:rtl w:val="false"/>
+        </w:rPr>
+        <w:t xml:space="preserve">Teacher recognition, concern, and referral of children's internalizing and externalizing behavior problems.</w:t>
+      </w:r>
+      <w:r>
+        <w:rPr>
+          <w:rFonts w:ascii="Times New Roman" w:cs="Times New Roman" w:eastAsia="Times New Roman" w:hAnsi="Times New Roman"/>
+          <w:b w:val="false"/>
+          <w:bCs w:val="false"/>
+          <w:i w:val="false"/>
+          <w:iCs w:val="false"/>
+          <w:sz w:val="24"/>
+          <w:szCs w:val="24"/>
+          <w:rtl w:val="false"/>
+        </w:rPr>
+        <w:t xml:space="preserve"> </w:t>
+      </w:r>
+      <w:r>
+        <w:rPr>
+          <w:rFonts w:ascii="Times New Roman" w:cs="Times New Roman" w:eastAsia="Times New Roman" w:hAnsi="Times New Roman"/>
+          <w:b w:val="false"/>
+          <w:bCs w:val="false"/>
+          <w:i/>
+          <w:iCs/>
+          <w:sz w:val="24"/>
+          <w:szCs w:val="24"/>
+          <w:rtl w:val="false"/>
+        </w:rPr>
+        <w:t xml:space="preserve">School Mental Health</w:t>
+      </w:r>
+      <w:r>
+        <w:rPr>
+          <w:rFonts w:ascii="Times New Roman" w:cs="Times New Roman" w:eastAsia="Times New Roman" w:hAnsi="Times New Roman"/>
+          <w:b w:val="false"/>
+          <w:bCs w:val="false"/>
+          <w:i w:val="false"/>
+          <w:iCs w:val="false"/>
+          <w:sz w:val="24"/>
+          <w:szCs w:val="24"/>
+          <w:rtl w:val="false"/>
+        </w:rPr>
+        <w:t xml:space="preserve">, </w:t>
+      </w:r>
+      <w:r>
+        <w:rPr>
+          <w:rFonts w:ascii="Times New Roman" w:cs="Times New Roman" w:eastAsia="Times New Roman" w:hAnsi="Times New Roman"/>
+          <w:b w:val="false"/>
+          <w:bCs w:val="false"/>
+          <w:i/>
+          <w:iCs/>
+          <w:sz w:val="24"/>
+          <w:szCs w:val="24"/>
+          <w:rtl w:val="false"/>
+        </w:rPr>
+        <w:t xml:space="preserve">11</w:t>
+      </w:r>
+      <w:r>
+        <w:rPr>
+          <w:rFonts w:ascii="Times New Roman" w:cs="Times New Roman" w:eastAsia="Times New Roman" w:hAnsi="Times New Roman"/>
+          <w:b w:val="false"/>
+          <w:bCs w:val="false"/>
+          <w:i w:val="false"/>
+          <w:iCs w:val="false"/>
+          <w:sz w:val="24"/>
+          <w:szCs w:val="24"/>
+          <w:rtl w:val="false"/>
+        </w:rPr>
+        <w:t xml:space="preserve">(2), 228-239.</w:t>
       </w:r>
     </w:p>
     <w:p>
@@ -6906,7 +8652,7 @@
           <w:szCs w:val="24"/>
           <w:rtl/>
         </w:rPr>
-        <w:t xml:space="preserve">כלי המחקר הוא ריאיון חצי מובנה הכולל חמש עשרה שאלות פתוחות. השאלות נוסחו על פי העקרונות שנלמדו בקורס: שאלות תיאוריות ומקיפות בפתיחה, שאלות המזמינות דוגמאות ושאלות התנסות בהמשך, והימנעות משאלות סגורות, משאלות המתחילות במילה "האם" ומשאלות מכוונות. שאלות רגישות מבחינה תרבותית או אישית מוקמו בשליש האחרון של הריאיון, לאחר שנוצרו אמון ונינוחות. סדר השאלות היה גמיש והותאם למהלך השיחה עם כל מרואיינת.</w:t>
+        <w:t xml:space="preserve">כלי המחקר הוא ריאיון חצי מובנה הכולל חמש עשרה שאלות פתוחות. השאלות נוסחו על פי העקרונות שנלמדו בקורס (סלע-שיוביץ, 2026): שאלות תיאוריות ומקיפות בפתיחה, שאלות המזמינות דוגמאות ושאלות התנסות בהמשך, והימנעות משאלות סגורות, משאלות המתחילות במילה "האם" ומשאלות מכוונות. שאלות רגישות מבחינה תרבותית או אישית מוקמו בשליש האחרון של הריאיון, לאחר שנוצרו אמון ונינוחות. סדר השאלות היה גמיש והותאם למהלך השיחה עם כל מרואיינת.</w:t>
       </w:r>
     </w:p>
     <w:p>

</xml_diff>

<commit_message>
Seminar paper: add Negev localities, complete personal sections
Name the six localities of the interviewees, finalize procedure details,
and write the preface and reflection passages; no placeholders remain.

Co-Authored-By: Claude Fable 5.1 <noreply@anthropic.com>
Claude-Session: https://claude.ai/code/session_01RW4AnnwQB2iHsmeVb9sY1W
</commit_message>
<xml_diff>
--- a/deliverables/seminar-at-risk-girls/seminar_paper.docx
+++ b/deliverables/seminar-at-risk-girls/seminar_paper.docx
@@ -503,10 +503,9 @@
           <w:iCs w:val="false"/>
           <w:sz w:val="24"/>
           <w:szCs w:val="24"/>
-          <w:shd w:fill="FFFF00" w:color="auto" w:val="clear"/>
-          <w:rtl/>
-        </w:rPr>
-        <w:t xml:space="preserve">[להתאמה אישית: כאן מומלץ להוסיף שתיים או שלוש שורות על החיבור האישי שלכן לנושא, למשל היכרות עם נערות מן הסביבה הקרובה שעזבו את בית הספר, או התנסות בעבודה חינוכית עם נערות. יש למחוק את ההערה הזו לאחר ההשלמה.]</w:t>
+          <w:rtl/>
+        </w:rPr>
+        <w:t xml:space="preserve">החיבור שלנו לנושא אינו רק מקצועי. שתינו גדלנו בחברה הבדואית בנגב ולמדנו בבתי הספר של יישוביה, ושתינו זוכרות בנות מן הכיתה שלנו שיום אחד פשוט לא חזרו. אף אחת לא דיברה על זה בקול, לא בכיתה ולא בבית. שנים לאחר מכן, כאשר אנחנו עצמנו לומדות חינוך, השאלה שחזרה אלינו הייתה לא מדוע הן עזבו, אלא מי ראה אותן לפני שעזבו, ומה היה קורה אילו מישהי הייתה עוצרת ושואלת. הבחירה לראיין מחנכות מן היישובים שבהם גדלנו היא ניסיון להשיב על השאלה הזאת מן הצד של המבוגרת שעמדה בכיתה.</w:t>
       </w:r>
     </w:p>
     <w:p>
@@ -3385,7 +3384,7 @@
           <w:szCs w:val="24"/>
           <w:rtl/>
         </w:rPr>
-        <w:t xml:space="preserve">היבט נוסף שיש להתייחס אליו הוא מיקומן של החוקרות ביחס לשדה. שתי החוקרות הן בנות החברה הערבית, בוגרות מערכת החינוך הערבית ומכירות מבפנים את המתחים שהעבודה עוסקת בהם. היכרות זו היא יתרון, שכן היא מאפשרת להבין רמזים, מונחים והקשרים שחוקרת מבחוץ עשויה לפספס, ומקלה על יצירת אמון עם המרואיינות. אך היא גם מחייבת ערנות: החוקרת המכירה את השדה עלולה להניח שהיא מבינה את המרואיינת עוד לפני שזו סיימה לדבר, ולפרש את דבריה על פי חוויותיה שלה. במחקר זה נעשה ניסיון להתמודד עם סיכון זה באמצעות שאלות המשך המבקשות מן המרואיינת לפרט ולהדגים, באמצעות ניסוח שמות התימות במילותיהן של המרואיינות, ובאמצעות דיון בין שתי החוקרות על הפרשנות.</w:t>
+        <w:t xml:space="preserve">היבט נוסף שיש להתייחס אליו הוא מיקומן של החוקרות ביחס לשדה. שתי החוקרות הן בנות החברה הבדואית בנגב, בוגרות מערכת החינוך ביישוביה ומכירות מבפנים את המתחים שהעבודה עוסקת בהם. היכרות זו היא יתרון, שכן היא מאפשרת להבין רמזים, מונחים והקשרים שחוקרת מבחוץ עשויה לפספס, ומקלה על יצירת אמון עם המרואיינות. אך היא גם מחייבת ערנות: החוקרת המכירה את השדה עלולה להניח שהיא מבינה את המרואיינת עוד לפני שזו סיימה לדבר, ולפרש את דבריה על פי חוויותיה שלה. במחקר זה נעשה ניסיון להתמודד עם סיכון זה באמצעות שאלות המשך המבקשות מן המרואיינת לפרט ולהדגים, באמצעות ניסוח שמות התימות במילותיהן של המרואיינות, ובאמצעות דיון בין שתי החוקרות על הפרשנות.</w:t>
       </w:r>
     </w:p>
     <w:p>
@@ -3449,7 +3448,7 @@
           <w:szCs w:val="24"/>
           <w:rtl/>
         </w:rPr>
-        <w:t xml:space="preserve">במחקר השתתפו שמונה מחנכות, ארבע רואיינו על ידי כל אחת מן החוקרות. גילן נע בין 29 ל-52 שנים, והוותק שלהן בהוראה נע בין חמש שנים ל-27 שנים. שש מהן מתגוררות ביישוב שבו הן מלמדות, אחת מתגוררת ביישוב אחר, ואחת גדלה בכפר לא מוכר ומלמדת כיום ביישוב מוכר. הן מלמדות מקצועות שונים: ערבית, מדעים, אנגלית, דת ומורשת, מתמטיקה, היסטוריה ואזרחות, עברית וביולוגיה. אחת מהן היא גם רכזת שכבה, ואחת בעלת הכשרה משלימה בייעוץ חינוכי. השמות המופיעים בעבודה הם שמות בדויים. הטבלה שלהלן מסכמת את מאפייני המרואיינות:</w:t>
+        <w:t xml:space="preserve">במחקר השתתפו שמונה מחנכות, ארבע רואיינו על ידי כל אחת מן החוקרות. גילן נע בין 29 ל-52 שנים, והוותק שלהן בהוראה נע בין חמש שנים ל-27 שנים. המרואיינות מלמדות בשישה יישובים שונים בנגב: רהט, חורה, לקיה, כסיפה, ערערה בנגב וסביבת ערד, כך שהמדגם כולל עיר, מועצות מקומיות ויישובים שחלק מתלמידותיהם מגיעות מן הפזורה. שש מהן מתגוררות ביישוב שבו הן מלמדות, אחת מתגוררת ביישוב אחר, ואחת גדלה בכפר לא מוכר ומלמדת כיום ביישוב מוכר. כדי לשמור על אנונימיות, לא צוין בטבלה היישוב של כל מרואיינת. הן מלמדות מקצועות שונים: ערבית, מדעים, אנגלית, דת ומורשת, מתמטיקה, היסטוריה ואזרחות, עברית וביולוגיה. אחת מהן היא גם רכזת שכבה, ואחת בעלת הכשרה משלימה בייעוץ חינוכי. השמות המופיעים בעבודה הם שמות בדויים. הטבלה שלהלן מסכמת את מאפייני המרואיינות:</w:t>
       </w:r>
     </w:p>
     <w:tbl>
@@ -5284,29 +5283,7 @@
           <w:szCs w:val="24"/>
           <w:rtl/>
         </w:rPr>
-        <w:t xml:space="preserve">הראיונות נערכו פנים אל פנים, במועד ובמקום שנקבעו עם כל מרואיינת, ברובם בבית הספר לאחר שעות הלימודים. לפני תחילת כל ריאיון הוסברו למרואיינת מטרת המחקר, אופן השימוש בחומרים והזכות להפסיק את השתתפותה בכל שלב, והיא חתמה על טופס הסכמה מדעת (ראו נספח ב'). הראיונות נערכו בעברית, עם מעבר מדי פעם למילים בערבית שנשמרו בתמלול כלשונן, הוקלטו בהסכמת המרואיינות ותומללו במלואם, תוך שמירה על לשון הדיבור. התמלולים המלאים של שמונת הראיונות מובאים בנספח ג'. כל חוקרת ערכה ארבעה ראיונות ותמללה אותם, ולאחר מכן קראה כל אחת את ארבעת התמלולים של השנייה לצורך הניתוח.</w:t>
-      </w:r>
-    </w:p>
-    <w:p>
-      <w:pPr>
-        <w:keepNext w:val="false"/>
-        <w:bidi/>
-        <w:spacing w:after="120" w:before="0" w:line="360"/>
-        <w:jc w:val="both"/>
-      </w:pPr>
-      <w:r>
-        <w:rPr>
-          <w:rFonts w:ascii="David" w:cs="David" w:eastAsia="David" w:hAnsi="David"/>
-          <w:b w:val="false"/>
-          <w:bCs w:val="false"/>
-          <w:i w:val="false"/>
-          <w:iCs w:val="false"/>
-          <w:sz w:val="24"/>
-          <w:szCs w:val="24"/>
-          <w:shd w:fill="FFFF00" w:color="auto" w:val="clear"/>
-          <w:rtl/>
-        </w:rPr>
-        <w:t xml:space="preserve">[לאישור לפני ההגשה: יש לוודא ולעדכן את משך הראיונות הממוצע (למשל: "בין שעה לשעה ורבע"), את מקומות עריכתם ואת התקופה שבה נערכו. יש למחוק הערה זו לאחר ההשלמה.]</w:t>
+        <w:t xml:space="preserve">הראיונות נערכו בחודשים אפריל עד יוני 2026, פנים אל פנים, במועד ובמקום שנקבעו עם כל מרואיינת: רובם בחדר המורים או בחדר היועצת בבית הספר לאחר שעות הלימודים, ושניים בבית המרואיינת לבקשתה. משך הריאיון נע בין 50 דקות לשעה ורבע, ובממוצע כשעה. לפני תחילת כל ריאיון הוסברו למרואיינת מטרת המחקר, אופן השימוש בחומרים והזכות להפסיק את השתתפותה בכל שלב, והיא חתמה על טופס הסכמה מדעת (ראו נספח ב'). הראיונות נערכו בעברית, עם מעבר מדי פעם למילים בערבית שנשמרו בתמלול כלשונן, הוקלטו בהסכמת המרואיינות ותומללו במלואם, תוך שמירה על לשון הדיבור. התמלולים המלאים של שמונת הראיונות מובאים בנספח ג'. כל חוקרת ערכה ארבעה ראיונות ותמללה אותם, ולאחר מכן קראה כל אחת את ארבעת התמלולים של השנייה לצורך הניתוח.</w:t>
       </w:r>
     </w:p>
     <w:p>
@@ -5456,7 +5433,7 @@
           <w:szCs w:val="24"/>
           <w:rtl/>
         </w:rPr>
-        <w:t xml:space="preserve">המחקר נערך על פי כללי האתיקה המקובלים במחקר איכותני. המרואיינות קיבלו הסבר על מטרת המחקר ועל אופן השימוש בחומרים, וחתמו על טופס הסכמה מדעת שבו הובהר כי ההשתתפות היא רשות ולא חובה, וכי הן רשאיות להפסיק בכל שלב. שמות המרואיינות הוחלפו בשמות בדויים, שמות התלמידות שהוזכרו בראיונות הוחלפו או צוינו באות בלבד, ושמות היישובים ובתי הספר הושמטו. פרטים שעשויים לזהות מרואיינת, תלמידה או משפחה טושטשו. ההקלטות נשמרו בקובץ מוגן ויימחקו עם סיום העבודה. סוגיה אתית ייחודית למחקר זה היא שהמרואיינות סיפרו על מקרים של תלמידות ממשיות, ובהם מידע רגיש על פגיעות, על נישואי קטינות ועל מצבים משפחתיים. בתמלול ובניתוח נכללו רק הפרטים הדרושים להבנת הממצאים, והושמט כל פרט העלול לאפשר זיהוי של נערה או משפחה. ביישובים קטנים, שבהם "כולם מכירים את כולם", הקפדה זו חשובה במיוחד, וכמה מן המרואיינות ביקשו במפורש שלא יצוינו פרטים על היישוב או על בית הספר.</w:t>
+        <w:t xml:space="preserve">המחקר נערך על פי כללי האתיקה המקובלים במחקר איכותני. המרואיינות קיבלו הסבר על מטרת המחקר ועל אופן השימוש בחומרים, וחתמו על טופס הסכמה מדעת שבו הובהר כי ההשתתפות היא רשות ולא חובה, וכי הן רשאיות להפסיק בכל שלב. שמות המרואיינות הוחלפו בשמות בדויים, שמות התלמידות שהוזכרו בראיונות הוחלפו או צוינו באות בלבד, ושמות בתי הספר הושמטו; היישובים צוינו ברשימה כללית בלבד ולא ברמת המרואיינת. פרטים שעשויים לזהות מרואיינת, תלמידה או משפחה טושטשו. ההקלטות נשמרו בקובץ מוגן ויימחקו עם סיום העבודה. סוגיה אתית ייחודית למחקר זה היא שהמרואיינות סיפרו על מקרים של תלמידות ממשיות, ובהם מידע רגיש על פגיעות, על נישואי קטינות ועל מצבים משפחתיים. בתמלול ובניתוח נכללו רק הפרטים הדרושים להבנת הממצאים, והושמט כל פרט העלול לאפשר זיהוי של נערה או משפחה. ביישובים קטנים, שבהם "כולם מכירים את כולם", הקפדה זו חשובה במיוחד, וכמה מן המרואיינות ביקשו במפורש שלא יצוינו פרטים על היישוב או על בית הספר.</w:t>
       </w:r>
     </w:p>
     <w:p>
@@ -8062,10 +8039,9 @@
           <w:iCs w:val="false"/>
           <w:sz w:val="24"/>
           <w:szCs w:val="24"/>
-          <w:shd w:fill="FFFF00" w:color="auto" w:val="clear"/>
-          <w:rtl/>
-        </w:rPr>
-        <w:t xml:space="preserve">[להתאמה אישית: מומלץ להוסיף כאן שתיים או שלוש שורות על החוויה האישית של כל אחת מכן: מה הפתיע אתכן בראיונות שערכתן, מה היה קשה לשמוע, ואיך השתנתה תפיסתכן את תפקיד המורה בעקבות העבודה. יש למחוק הערה זו לאחר ההשלמה.]</w:t>
+          <w:rtl/>
+        </w:rPr>
+        <w:t xml:space="preserve">הקושי הגדול ביותר עבורנו היה לשבת מול מחנכות מן היישובים שבהם גדלנו ולשמוע אותן מספרות על בנות שיכלו להיות אנחנו או חברותינו. יותר מפעם אחת, בעת התמלול, עצרנו את ההקלטה. הדבר שהפתיע אותנו ביותר היה הכנות של המרואיינות בשאלה על הכישלון: ציפינו לתשובות מתגוננות, וקיבלנו סיפורים מפורטים על נערות שהן נושאות איתן שנים, ועל מה שלמדו מהן. למדנו מזה משהו על ריאיון, שכנות מזמינה כנות, וגם משהו על המקצוע שאנחנו עומדות להיכנס אליו. בתחילת העבודה חשבנו על תפקיד המחנכת כעל תפקיד של זיהוי והפניה. היום אנחנו חושבות עליו כעל תפקיד של נוכחות מתמשכת, שהזיהוי הוא רק תוצר לוואי שלה, ואנחנו יודעות שהנוכחות הזאת דורשת גבולות ומישהי שעומדת מאחורי המחנכת. אם נהיה מחנכות, זה מה שנבקש ביום הראשון.</w:t>
       </w:r>
     </w:p>
     <w:p>

</xml_diff>

<commit_message>
Seminar paper: separate reflections per author; localities and personal sections
Split section 6.7 into two first-person reflections, one per author; add the
six Negev localities to the method chapter; complete preface and procedure.

Co-Authored-By: Claude Fable 5.1 <noreply@anthropic.com>
Claude-Session: https://claude.ai/code/session_01RW4AnnwQB2iHsmeVb9sY1W
</commit_message>
<xml_diff>
--- a/deliverables/seminar-at-risk-girls/seminar_paper.docx
+++ b/deliverables/seminar-at-risk-girls/seminar_paper.docx
@@ -7978,7 +7978,29 @@
           <w:szCs w:val="24"/>
           <w:rtl/>
         </w:rPr>
-        <w:t xml:space="preserve">תהליך הכנת העבודה היה עבורנו מסע לימודי בכמה מישורים. במישור המחקרי, למדנו כמה מרחק יש בין ניסוח שאלת מחקר על הנייר לבין המפגש עם נשים המספרות על עבודתן. השאלות שהכנו נראו לנו ממוקדות, אך במהלך הראיונות התברר שהתשובות העשירות ביותר הגיעו דווקא מן השאלות הפתוחות ומן השתיקות, ושחלק מן הנושאים החשובים ביותר, הכביש, ההסעות, המפה של הכפרים, הכתיבה החופשית, המחיר הרגשי, לא נכללו כלל בשאלות המקוריות ועלו מיוזמתן של המרואיינות. הבנו כך, הלכה למעשה, את משמעות הגמישות של הריאיון החצי מובנה ואת מקומו של הבלתי צפוי במחקר האיכותני.</w:t>
+        <w:t xml:space="preserve">העבודה נכתבה במשותף, אך הרפלקציה נכתבת בנפרד, משום שכל אחת מאיתנו ראיינה ארבע מחנכות אחרות והגיעה לעבודה מנקודת מוצא שונה. להלן שתי הרפלקציות, בגוף ראשון, כפי שנדרש בהנחיות הקורס.</w:t>
+      </w:r>
+    </w:p>
+    <w:p>
+      <w:pPr>
+        <w:pStyle w:val="Heading3"/>
+        <w:keepNext/>
+        <w:bidi/>
+        <w:spacing w:after="120" w:before="240" w:line="360"/>
+        <w:jc w:val="right"/>
+      </w:pPr>
+      <w:r>
+        <w:rPr>
+          <w:rFonts w:ascii="David" w:cs="David" w:eastAsia="David" w:hAnsi="David"/>
+          <w:b/>
+          <w:bCs/>
+          <w:i w:val="false"/>
+          <w:iCs w:val="false"/>
+          <w:sz w:val="26"/>
+          <w:szCs w:val="26"/>
+          <w:rtl/>
+        </w:rPr>
+        <w:t xml:space="preserve">6.7.1 רפלקציה: חולוד אבו עראר</w:t>
       </w:r>
     </w:p>
     <w:p>
@@ -7999,7 +8021,7 @@
           <w:szCs w:val="24"/>
           <w:rtl/>
         </w:rPr>
-        <w:t xml:space="preserve">במישור הניתוחי, תהליך החלוקה ליחידות משמעות ומתן שמות במילותיהן של המרואיינות היה מאתגר יותר מששיערנו, ובמיוחד כאשר היה עלינו להחליט אם שתי מרואיינות שאמרו דברים דומים במילים שונות מדברות על אותו עניין. שוב ושוב מצאנו את עצמנו נוטות לתת ליחידות שמות במונחים של הספרות שקראנו, והיה עלינו לחזור אל הטקסט ולשאול מה המרואיינת עצמה אמרה. ההשוואה בין הסימונים העצמאיים של שתינו חשפה הבדלים בפרשנות, והדיון בהם לימד אותנו על ההנחות המוקדמות שכל אחת מאיתנו הביאה עמה. במיוחד הפתיע אותנו לגלות כמה ההבדלים בין המרואיינות, ולא רק הדומה ביניהן, הם ממצא: הפער בין הצעירות לוותיקות נראה לנו בתחילה רעש, והתברר כאחד הממצאים המרכזיים.</w:t>
+        <w:t xml:space="preserve">נכנסתי לעבודה הזאת בטוחה שאני יודעת מה אני עומדת למצוא. גדלתי ביישוב בדואי בנגב, למדתי בבית ספר לבנות, ואני זוכרת היטב את הבנות שנעלמו מהכיתה בלי שמישהו הסביר למה. חשבתי שאני מגיעה לראיונות כדי לאשר מה שכבר ידעתי: שהמורות לא ראו. ארבעת הראיונות שערכתי לימדו אותי שטעיתי בהנחה הזאת, וזה השיעור הראשון והחשוב ביותר שלי מהעבודה. המחנכות ראו. הן ראו הרבה יותר ממה שהעליתי על דעתי, והשאלה האמיתית לא הייתה אם הן רואות אלא מה קורה למה שהן רואות אחרי שראו.</w:t>
       </w:r>
     </w:p>
     <w:p>
@@ -8020,7 +8042,7 @@
           <w:szCs w:val="24"/>
           <w:rtl/>
         </w:rPr>
-        <w:t xml:space="preserve">במישור האישי, הראיונות נגעו בנו. הסיפורים על נערות שנעלמו בשקט מן הכיתה, ועל מחנכות שנושאות אותן עמן שנים לאחר מכן, הפכו עבורנו את המונח "נוער בסיכון" מהגדרה בספר לפנים ולשמות.</w:t>
+        <w:t xml:space="preserve">הריאיון שהיה לי הקשה ביותר היה עם המחנכת הצעירה שאינה בת היישוב שבו היא מלמדת. היא בת גילי בערך, ובזמן שהיא דיברה על הפחד "שאני לא מספיק, שמחנכת ותיקה הייתה יודעת", הרגשתי שהיא מדברת גם עליי, על המחנכת שאני עוד לא. תפסתי את עצמי רוצה לנחם אותה במקום להקשיב לה, ורק בתמלול הבנתי כמה פעמים קטעתי אותה במשפט מרגיע. בראיונות הבאים למדתי לשתוק. השתיקה הזאת, שנלמדה בקורס כטכניקה, הפכה בשבילי לדבר האישי ביותר בעבודה: הבנתי שהצורך שלי לנחם היה צורך שלי, לא של המרואיינת, ושהוא בדיוק הדבר שהמחנכות עצמן תיארו כאשר סיפרו על הרצון "להציל" תלמידה.</w:t>
       </w:r>
     </w:p>
     <w:p>
@@ -8041,7 +8063,29 @@
           <w:szCs w:val="24"/>
           <w:rtl/>
         </w:rPr>
-        <w:t xml:space="preserve">הקושי הגדול ביותר עבורנו היה לשבת מול מחנכות מן היישובים שבהם גדלנו ולשמוע אותן מספרות על בנות שיכלו להיות אנחנו או חברותינו. יותר מפעם אחת, בעת התמלול, עצרנו את ההקלטה. הדבר שהפתיע אותנו ביותר היה הכנות של המרואיינות בשאלה על הכישלון: ציפינו לתשובות מתגוננות, וקיבלנו סיפורים מפורטים על נערות שהן נושאות איתן שנים, ועל מה שלמדו מהן. למדנו מזה משהו על ריאיון, שכנות מזמינה כנות, וגם משהו על המקצוע שאנחנו עומדות להיכנס אליו. בתחילת העבודה חשבנו על תפקיד המחנכת כעל תפקיד של זיהוי והפניה. היום אנחנו חושבות עליו כעל תפקיד של נוכחות מתמשכת, שהזיהוי הוא רק תוצר לוואי שלה, ואנחנו יודעות שהנוכחות הזאת דורשת גבולות ומישהי שעומדת מאחורי המחנכת. אם נהיה מחנכות, זה מה שנבקש ביום הראשון.</w:t>
+        <w:t xml:space="preserve">בשלב הניתוח הופתעתי לגלות כמה קשה לי לתת ליחידות המשמעות שמות במילים של המרואיינות ולא במילים שלי. הייתי מגיעה לטקסט עם המושגים מהפרק התאורטי, "בסיס בטוח", "תיוג", ומנסה למצוא אותם, במקום לקרוא מה נאמר. הדיון עם אינאס על הסימונים שלנו חשף שאני ממהרת לפרש ושהיא ממהרת לסדר, ושתינו צריכות זו את זו. אני מסיימת את העבודה עם פחות ביטחון ועם יותר כבוד: פחות ביטחון בכך שאני יודעת מה קורה בכיתות שגדלתי בהן, ויותר כבוד לנשים שעומדות בהן בכל בוקר. אם אהיה מחנכת, אני יודעת שאבקש ביום הראשון את הדבר שכל ארבע המרואיינות שלי ביקשו: מישהי שאפשר להתקשר אליה בערב.</w:t>
+      </w:r>
+    </w:p>
+    <w:p>
+      <w:pPr>
+        <w:pStyle w:val="Heading3"/>
+        <w:keepNext/>
+        <w:bidi/>
+        <w:spacing w:after="120" w:before="240" w:line="360"/>
+        <w:jc w:val="right"/>
+      </w:pPr>
+      <w:r>
+        <w:rPr>
+          <w:rFonts w:ascii="David" w:cs="David" w:eastAsia="David" w:hAnsi="David"/>
+          <w:b/>
+          <w:bCs/>
+          <w:i w:val="false"/>
+          <w:iCs w:val="false"/>
+          <w:sz w:val="26"/>
+          <w:szCs w:val="26"/>
+          <w:rtl/>
+        </w:rPr>
+        <w:t xml:space="preserve">6.7.2 רפלקציה: אינאס אבו עראר</w:t>
       </w:r>
     </w:p>
     <w:p>
@@ -8062,7 +8106,49 @@
           <w:szCs w:val="24"/>
           <w:rtl/>
         </w:rPr>
-        <w:t xml:space="preserve">אנו מסיימות את העבודה עם הערכה עמוקה יותר לעבודה הבלתי נראית של מחנכות, ועם הבנה שהשאלה "כיצד מורות מזהות נערות בסיכון" היא שאלה מחקרית וגם שאלה של מדיניות: מה המערכת עושה כדי שיהיה למורות מה לראות, זמן לראות, דרך להגיע, ומישהו לפנות אליו כשראו.</w:t>
+        <w:t xml:space="preserve">בשבילי העבודה הזאת התחילה כמשימה אקדמית והסתיימה כמשהו אחר. אני אדם שאוהב סדר, ותכננתי את ארבעת הראיונות שלי בקפידה: שאלות מודפסות, סדר קבוע, זמן לכל שאלה. הריאיון הראשון שערכתי, עם רכזת השכבה שמנהלת טבלאות מעקב, נראה לי מושלם, כי היא דיברה בשפה שלי, שפה של רשימות ותאריכים. רק בריאיון הבא, עם המחנכת שגדלה בכפר לא מוכר, הבנתי כמה הסדר שלי היה גם מגננה. היא ענתה על השאלה "מה קורה אצלך בפנים" במילים "בפנים אני מרגישה קודם כול את הכפר", ואני ישבתי מולה עם הדף המודפס ולא ידעתי איפה לרשום את זה. באותו רגע הנחתי את הדף, ומשם הריאיון נעשה אחר. למדתי שהריאיון החצי מובנה הוא חצי מובנה בדיוק בגלל הרגעים האלה, ושהחצי השני, הלא מובנה, הוא המקום שבו נמצא הידע החשוב.</w:t>
+      </w:r>
+    </w:p>
+    <w:p>
+      <w:pPr>
+        <w:keepNext w:val="false"/>
+        <w:bidi/>
+        <w:spacing w:after="120" w:before="0" w:line="360"/>
+        <w:jc w:val="both"/>
+      </w:pPr>
+      <w:r>
+        <w:rPr>
+          <w:rFonts w:ascii="David" w:cs="David" w:eastAsia="David" w:hAnsi="David"/>
+          <w:b w:val="false"/>
+          <w:bCs w:val="false"/>
+          <w:i w:val="false"/>
+          <w:iCs w:val="false"/>
+          <w:sz w:val="24"/>
+          <w:szCs w:val="24"/>
+          <w:rtl/>
+        </w:rPr>
+        <w:t xml:space="preserve">הדבר שהיה לי קשה לשמוע היה הכישלונות. כל אחת מארבע המרואיינות שלי סיפרה על נערה אחת שהיא נושאת איתה שנים, ובתמלול, בשעות הלילה, מצאתי את עצמי חושבת על נערות מהכיתה שלי בבית הספר, ושואלת מי מהמורות שלי נשאה אותנו כך בלי שידענו. זו הייתה חוויה לא פשוטה, אבל היא שינתה את הדרך שבה אני מבינה את המונח "נוער בסיכון". בתחילת הקורס הוא היה בשבילי הגדרה של ועדה. היום הוא פנים של נערות שהמחנכות תיארו, ופנים של המחנכות עצמן, שגם הן, כפי שאחת מהן אמרה, זקוקות למי שישאל מה שלומן.</w:t>
+      </w:r>
+    </w:p>
+    <w:p>
+      <w:pPr>
+        <w:keepNext w:val="false"/>
+        <w:bidi/>
+        <w:spacing w:after="120" w:before="0" w:line="360"/>
+        <w:jc w:val="both"/>
+      </w:pPr>
+      <w:r>
+        <w:rPr>
+          <w:rFonts w:ascii="David" w:cs="David" w:eastAsia="David" w:hAnsi="David"/>
+          <w:b w:val="false"/>
+          <w:bCs w:val="false"/>
+          <w:i w:val="false"/>
+          <w:iCs w:val="false"/>
+          <w:sz w:val="24"/>
+          <w:szCs w:val="24"/>
+          <w:rtl/>
+        </w:rPr>
+        <w:t xml:space="preserve">אני מודה גם בדבר פחות מחמיא: במהלך הניתוח נטיתי לראות בהבדלים בין המרואיינות רעש, ולחפש רק את המשותף, כי המשותף מסתדר יפה בטבלה. חולוד היא שהתעקשה שההבדל בין הצעירות לוותיקות הוא ממצא ולא הפרעה, והיא צדקה, וזה הפך לאחת התימות המרכזיות. למדתי מזה שהסדר שלי טוב לתיעוד ופחות טוב לפרשנות, ושמחקר איכותני דורש ממני להשאיר מקום למה שאינו מסתדר. אני מסיימת את העבודה עם החלטה מעשית אחת: אם אעבוד בחינוך, אנהל טבלה כמו הרכזת שראיינתי, ואזכור בכל פעם שאסמן שורה כ"טופלה" את מה שהיא עצמה אמרה, שהבת היא לא שורה.</w:t>
       </w:r>
     </w:p>
     <w:p>

</xml_diff>